<commit_message>
Show full non-inventory load file on the review page
Co-Authored-By: Claude Opus 5.5 <noreply@anthropic.com>
Claude-Session: https://claude.ai/code/session_01RcSpRnw5TDsnk5GdoeWT9P
</commit_message>
<xml_diff>
--- a/netsuite/dataload/noninventory-items/output/noninventory-items.docx
+++ b/netsuite/dataload/noninventory-items/output/noninventory-items.docx
@@ -258,7 +258,7 @@
                 <w:rFonts w:ascii="Arial" w:hAnsi="Arial"/>
                 <w:sz w:val="20"/>
               </w:rPr>
-              <w:t xml:space="preserve">13 columns. Most are set per item group, below</w:t>
+              <w:t xml:space="preserve">13 columns. Most are set per item group, under Values by group</w:t>
             </w:r>
           </w:p>
         </w:tc>
@@ -308,13 +308,13 @@
       </w:tr>
     </w:tbl>
     <w:bookmarkEnd w:id="20"/>
-    <w:bookmarkStart w:id="21" w:name="items"/>
+    <w:bookmarkStart w:id="21" w:name="load-file"/>
     <w:p>
       <w:pPr>
         <w:pStyle w:val="Heading1"/>
       </w:pPr>
       <w:r>
-        <w:t xml:space="preserve">Items</w:t>
+        <w:t xml:space="preserve">Load file</w:t>
       </w:r>
     </w:p>
     <w:p>
@@ -322,7 +322,24 @@
         <w:pStyle w:val="FirstParagraph"/>
       </w:pPr>
       <w:r>
-        <w:t xml:space="preserve">External ID and Item Name both use the item ID. [TBC: confirm the item ID as Item Name, with the descriptive name as Display Name/Code]</w:t>
+        <w:rPr>
+          <w:rStyle w:val="VerbatimChar"/>
+        </w:rPr>
+        <w:t xml:space="preserve">MINIO_-_Noninventory_for_Sale.csv</w:t>
+      </w:r>
+      <w:r>
+        <w:t xml:space="preserve"> </w:t>
+      </w:r>
+      <w:r>
+        <w:t xml:space="preserve">as it stands: 11 rows, 16 columns. Blank cells are still open. Scroll sideways to see every column.</w:t>
+      </w:r>
+    </w:p>
+    <w:p>
+      <w:pPr>
+        <w:pStyle w:val="BodyText"/>
+      </w:pPr>
+      <w:r>
+        <w:t xml:space="preserve">External ID and Item Name both use the item ID. [TBC: confirm Item Name format]</w:t>
       </w:r>
     </w:p>
     <w:tbl>
@@ -342,9 +359,22 @@
         <w:tblLayout w:type="fixed"/>
       </w:tblPr>
       <w:tblGrid>
-        <w:gridCol w:w="4409"/>
-        <w:gridCol w:w="3094"/>
-        <w:gridCol w:w="1856"/>
+        <w:gridCol w:w="-952"/>
+        <w:gridCol w:w="-952"/>
+        <w:gridCol w:w="936"/>
+        <w:gridCol w:w="936"/>
+        <w:gridCol w:w="936"/>
+        <w:gridCol w:w="936"/>
+        <w:gridCol w:w="936"/>
+        <w:gridCol w:w="936"/>
+        <w:gridCol w:w="936"/>
+        <w:gridCol w:w="936"/>
+        <w:gridCol w:w="936"/>
+        <w:gridCol w:w="936"/>
+        <w:gridCol w:w="936"/>
+        <w:gridCol w:w="936"/>
+        <w:gridCol w:w="936"/>
+        <w:gridCol w:w="-902"/>
       </w:tblGrid>
       <w:tr>
         <w:trPr>
@@ -352,7 +382,7 @@
         </w:trPr>
         <w:tc>
           <w:tcPr>
-            <w:tcW w:type="dxa" w:w="4409"/>
+            <w:tcW w:type="dxa" w:w="-952"/>
             <w:shd w:val="clear" w:color="auto" w:fill="1F3B5C"/>
           </w:tcPr>
           <w:p>
@@ -369,13 +399,13 @@
                 <w:color w:val="FFFFFF"/>
                 <w:sz w:val="20"/>
               </w:rPr>
-              <w:t xml:space="preserve">Item Name / External ID</w:t>
-            </w:r>
-          </w:p>
-        </w:tc>
-        <w:tc>
-          <w:tcPr>
-            <w:tcW w:type="dxa" w:w="3094"/>
+              <w:t xml:space="preserve">External ID</w:t>
+            </w:r>
+          </w:p>
+        </w:tc>
+        <w:tc>
+          <w:tcPr>
+            <w:tcW w:type="dxa" w:w="-952"/>
             <w:shd w:val="clear" w:color="auto" w:fill="1F3B5C"/>
           </w:tcPr>
           <w:p>
@@ -392,13 +422,13 @@
                 <w:color w:val="FFFFFF"/>
                 <w:sz w:val="20"/>
               </w:rPr>
-              <w:t xml:space="preserve">Display Name/Code</w:t>
-            </w:r>
-          </w:p>
-        </w:tc>
-        <w:tc>
-          <w:tcPr>
-            <w:tcW w:type="dxa" w:w="1856"/>
+              <w:t xml:space="preserve">Item Name</w:t>
+            </w:r>
+          </w:p>
+        </w:tc>
+        <w:tc>
+          <w:tcPr>
+            <w:tcW w:type="dxa" w:w="936"/>
             <w:shd w:val="clear" w:color="auto" w:fill="1F3B5C"/>
           </w:tcPr>
           <w:p>
@@ -415,7 +445,306 @@
                 <w:color w:val="FFFFFF"/>
                 <w:sz w:val="20"/>
               </w:rPr>
-              <w:t xml:space="preserve">Group</w:t>
+              <w:t xml:space="preserve">Display Name/Code</w:t>
+            </w:r>
+          </w:p>
+        </w:tc>
+        <w:tc>
+          <w:tcPr>
+            <w:tcW w:type="dxa" w:w="936"/>
+            <w:shd w:val="clear" w:color="auto" w:fill="1F3B5C"/>
+          </w:tcPr>
+          <w:p>
+            <w:pPr>
+              <w:pStyle w:val="Compact"/>
+              <w:spacing w:before="40" w:after="40"/>
+              <w:jc w:val="left"/>
+            </w:pPr>
+            <w:r>
+              <w:rPr>
+                <w:bCs/>
+                <w:rFonts w:ascii="Arial" w:hAnsi="Arial"/>
+                <w:b/>
+                <w:color w:val="FFFFFF"/>
+                <w:sz w:val="20"/>
+              </w:rPr>
+              <w:t xml:space="preserve">Department</w:t>
+            </w:r>
+          </w:p>
+        </w:tc>
+        <w:tc>
+          <w:tcPr>
+            <w:tcW w:type="dxa" w:w="936"/>
+            <w:shd w:val="clear" w:color="auto" w:fill="1F3B5C"/>
+          </w:tcPr>
+          <w:p>
+            <w:pPr>
+              <w:pStyle w:val="Compact"/>
+              <w:spacing w:before="40" w:after="40"/>
+              <w:jc w:val="left"/>
+            </w:pPr>
+            <w:r>
+              <w:rPr>
+                <w:bCs/>
+                <w:rFonts w:ascii="Arial" w:hAnsi="Arial"/>
+                <w:b/>
+                <w:color w:val="FFFFFF"/>
+                <w:sz w:val="20"/>
+              </w:rPr>
+              <w:t xml:space="preserve">Class</w:t>
+            </w:r>
+          </w:p>
+        </w:tc>
+        <w:tc>
+          <w:tcPr>
+            <w:tcW w:type="dxa" w:w="936"/>
+            <w:shd w:val="clear" w:color="auto" w:fill="1F3B5C"/>
+          </w:tcPr>
+          <w:p>
+            <w:pPr>
+              <w:pStyle w:val="Compact"/>
+              <w:spacing w:before="40" w:after="40"/>
+              <w:jc w:val="left"/>
+            </w:pPr>
+            <w:r>
+              <w:rPr>
+                <w:bCs/>
+                <w:rFonts w:ascii="Arial" w:hAnsi="Arial"/>
+                <w:b/>
+                <w:color w:val="FFFFFF"/>
+                <w:sz w:val="20"/>
+              </w:rPr>
+              <w:t xml:space="preserve">Subsidiary</w:t>
+            </w:r>
+          </w:p>
+        </w:tc>
+        <w:tc>
+          <w:tcPr>
+            <w:tcW w:type="dxa" w:w="936"/>
+            <w:shd w:val="clear" w:color="auto" w:fill="1F3B5C"/>
+          </w:tcPr>
+          <w:p>
+            <w:pPr>
+              <w:pStyle w:val="Compact"/>
+              <w:spacing w:before="40" w:after="40"/>
+              <w:jc w:val="left"/>
+            </w:pPr>
+            <w:r>
+              <w:rPr>
+                <w:bCs/>
+                <w:rFonts w:ascii="Arial" w:hAnsi="Arial"/>
+                <w:b/>
+                <w:color w:val="FFFFFF"/>
+                <w:sz w:val="20"/>
+              </w:rPr>
+              <w:t xml:space="preserve">Include Children</w:t>
+            </w:r>
+          </w:p>
+        </w:tc>
+        <w:tc>
+          <w:tcPr>
+            <w:tcW w:type="dxa" w:w="936"/>
+            <w:shd w:val="clear" w:color="auto" w:fill="1F3B5C"/>
+          </w:tcPr>
+          <w:p>
+            <w:pPr>
+              <w:pStyle w:val="Compact"/>
+              <w:spacing w:before="40" w:after="40"/>
+              <w:jc w:val="left"/>
+            </w:pPr>
+            <w:r>
+              <w:rPr>
+                <w:bCs/>
+                <w:rFonts w:ascii="Arial" w:hAnsi="Arial"/>
+                <w:b/>
+                <w:color w:val="FFFFFF"/>
+                <w:sz w:val="20"/>
+              </w:rPr>
+              <w:t xml:space="preserve">Sales Description</w:t>
+            </w:r>
+          </w:p>
+        </w:tc>
+        <w:tc>
+          <w:tcPr>
+            <w:tcW w:type="dxa" w:w="936"/>
+            <w:shd w:val="clear" w:color="auto" w:fill="1F3B5C"/>
+          </w:tcPr>
+          <w:p>
+            <w:pPr>
+              <w:pStyle w:val="Compact"/>
+              <w:spacing w:before="40" w:after="40"/>
+              <w:jc w:val="left"/>
+            </w:pPr>
+            <w:r>
+              <w:rPr>
+                <w:bCs/>
+                <w:rFonts w:ascii="Arial" w:hAnsi="Arial"/>
+                <w:b/>
+                <w:color w:val="FFFFFF"/>
+                <w:sz w:val="20"/>
+              </w:rPr>
+              <w:t xml:space="preserve">Base Price</w:t>
+            </w:r>
+          </w:p>
+        </w:tc>
+        <w:tc>
+          <w:tcPr>
+            <w:tcW w:type="dxa" w:w="936"/>
+            <w:shd w:val="clear" w:color="auto" w:fill="1F3B5C"/>
+          </w:tcPr>
+          <w:p>
+            <w:pPr>
+              <w:pStyle w:val="Compact"/>
+              <w:spacing w:before="40" w:after="40"/>
+              <w:jc w:val="left"/>
+            </w:pPr>
+            <w:r>
+              <w:rPr>
+                <w:bCs/>
+                <w:rFonts w:ascii="Arial" w:hAnsi="Arial"/>
+                <w:b/>
+                <w:color w:val="FFFFFF"/>
+                <w:sz w:val="20"/>
+              </w:rPr>
+              <w:t xml:space="preserve">Income account</w:t>
+            </w:r>
+          </w:p>
+        </w:tc>
+        <w:tc>
+          <w:tcPr>
+            <w:tcW w:type="dxa" w:w="936"/>
+            <w:shd w:val="clear" w:color="auto" w:fill="1F3B5C"/>
+          </w:tcPr>
+          <w:p>
+            <w:pPr>
+              <w:pStyle w:val="Compact"/>
+              <w:spacing w:before="40" w:after="40"/>
+              <w:jc w:val="left"/>
+            </w:pPr>
+            <w:r>
+              <w:rPr>
+                <w:bCs/>
+                <w:rFonts w:ascii="Arial" w:hAnsi="Arial"/>
+                <w:b/>
+                <w:color w:val="FFFFFF"/>
+                <w:sz w:val="20"/>
+              </w:rPr>
+              <w:t xml:space="preserve">Deferred Revenue account</w:t>
+            </w:r>
+          </w:p>
+        </w:tc>
+        <w:tc>
+          <w:tcPr>
+            <w:tcW w:type="dxa" w:w="936"/>
+            <w:shd w:val="clear" w:color="auto" w:fill="1F3B5C"/>
+          </w:tcPr>
+          <w:p>
+            <w:pPr>
+              <w:pStyle w:val="Compact"/>
+              <w:spacing w:before="40" w:after="40"/>
+              <w:jc w:val="left"/>
+            </w:pPr>
+            <w:r>
+              <w:rPr>
+                <w:bCs/>
+                <w:rFonts w:ascii="Arial" w:hAnsi="Arial"/>
+                <w:b/>
+                <w:color w:val="FFFFFF"/>
+                <w:sz w:val="20"/>
+              </w:rPr>
+              <w:t xml:space="preserve">Revenue Recogition Rule</w:t>
+            </w:r>
+          </w:p>
+        </w:tc>
+        <w:tc>
+          <w:tcPr>
+            <w:tcW w:type="dxa" w:w="936"/>
+            <w:shd w:val="clear" w:color="auto" w:fill="1F3B5C"/>
+          </w:tcPr>
+          <w:p>
+            <w:pPr>
+              <w:pStyle w:val="Compact"/>
+              <w:spacing w:before="40" w:after="40"/>
+              <w:jc w:val="left"/>
+            </w:pPr>
+            <w:r>
+              <w:rPr>
+                <w:bCs/>
+                <w:rFonts w:ascii="Arial" w:hAnsi="Arial"/>
+                <w:b/>
+                <w:color w:val="FFFFFF"/>
+                <w:sz w:val="20"/>
+              </w:rPr>
+              <w:t xml:space="preserve">Rev Rec Forecast Rule</w:t>
+            </w:r>
+          </w:p>
+        </w:tc>
+        <w:tc>
+          <w:tcPr>
+            <w:tcW w:type="dxa" w:w="936"/>
+            <w:shd w:val="clear" w:color="auto" w:fill="1F3B5C"/>
+          </w:tcPr>
+          <w:p>
+            <w:pPr>
+              <w:pStyle w:val="Compact"/>
+              <w:spacing w:before="40" w:after="40"/>
+              <w:jc w:val="left"/>
+            </w:pPr>
+            <w:r>
+              <w:rPr>
+                <w:bCs/>
+                <w:rFonts w:ascii="Arial" w:hAnsi="Arial"/>
+                <w:b/>
+                <w:color w:val="FFFFFF"/>
+                <w:sz w:val="20"/>
+              </w:rPr>
+              <w:t xml:space="preserve">Create Revenue Plans On</w:t>
+            </w:r>
+          </w:p>
+        </w:tc>
+        <w:tc>
+          <w:tcPr>
+            <w:tcW w:type="dxa" w:w="936"/>
+            <w:shd w:val="clear" w:color="auto" w:fill="1F3B5C"/>
+          </w:tcPr>
+          <w:p>
+            <w:pPr>
+              <w:pStyle w:val="Compact"/>
+              <w:spacing w:before="40" w:after="40"/>
+              <w:jc w:val="left"/>
+            </w:pPr>
+            <w:r>
+              <w:rPr>
+                <w:bCs/>
+                <w:rFonts w:ascii="Arial" w:hAnsi="Arial"/>
+                <w:b/>
+                <w:color w:val="FFFFFF"/>
+                <w:sz w:val="20"/>
+              </w:rPr>
+              <w:t xml:space="preserve">Direct Revenue Posting</w:t>
+            </w:r>
+          </w:p>
+        </w:tc>
+        <w:tc>
+          <w:tcPr>
+            <w:tcW w:type="dxa" w:w="-902"/>
+            <w:shd w:val="clear" w:color="auto" w:fill="1F3B5C"/>
+          </w:tcPr>
+          <w:p>
+            <w:pPr>
+              <w:pStyle w:val="Compact"/>
+              <w:spacing w:before="40" w:after="40"/>
+              <w:jc w:val="left"/>
+            </w:pPr>
+            <w:r>
+              <w:rPr>
+                <w:bCs/>
+                <w:rFonts w:ascii="Arial" w:hAnsi="Arial"/>
+                <w:b/>
+                <w:color w:val="FFFFFF"/>
+                <w:sz w:val="20"/>
+              </w:rPr>
+              <w:t xml:space="preserve">Can be fulfilled/received</w:t>
             </w:r>
           </w:p>
         </w:tc>
@@ -423,7 +752,7 @@
       <w:tr>
         <w:tc>
           <w:tcPr>
-            <w:tcW w:type="dxa" w:w="4409"/>
+            <w:tcW w:type="dxa" w:w="-952"/>
           </w:tcPr>
           <w:p>
             <w:pPr>
@@ -444,7 +773,26 @@
         </w:tc>
         <w:tc>
           <w:tcPr>
-            <w:tcW w:type="dxa" w:w="3094"/>
+            <w:tcW w:type="dxa" w:w="-952"/>
+          </w:tcPr>
+          <w:p>
+            <w:pPr>
+              <w:pStyle w:val="Compact"/>
+              <w:spacing w:before="40" w:after="40"/>
+              <w:jc w:val="left"/>
+            </w:pPr>
+            <w:r>
+              <w:rPr>
+                <w:rFonts w:ascii="Arial" w:hAnsi="Arial"/>
+                <w:sz w:val="20"/>
+              </w:rPr>
+              <w:t xml:space="preserve">NS-SUPT-SLA-1H-UPB</w:t>
+            </w:r>
+          </w:p>
+        </w:tc>
+        <w:tc>
+          <w:tcPr>
+            <w:tcW w:type="dxa" w:w="936"/>
           </w:tcPr>
           <w:p>
             <w:pPr>
@@ -463,28 +811,152 @@
         </w:tc>
         <w:tc>
           <w:tcPr>
-            <w:tcW w:type="dxa" w:w="1856"/>
-          </w:tcPr>
-          <w:p>
-            <w:pPr>
-              <w:pStyle w:val="Compact"/>
-              <w:spacing w:before="40" w:after="40"/>
-              <w:jc w:val="left"/>
-            </w:pPr>
-            <w:r>
-              <w:rPr>
-                <w:rFonts w:ascii="Arial" w:hAnsi="Arial"/>
-                <w:sz w:val="20"/>
-              </w:rPr>
-              <w:t xml:space="preserve">Support</w:t>
-            </w:r>
+            <w:tcW w:type="dxa" w:w="936"/>
+          </w:tcPr>
+          <w:p>
+            <w:pPr>
+              <w:pStyle w:val="Compact"/>
+              <w:spacing w:before="40" w:after="40"/>
+            </w:pPr>
+          </w:p>
+        </w:tc>
+        <w:tc>
+          <w:tcPr>
+            <w:tcW w:type="dxa" w:w="936"/>
+          </w:tcPr>
+          <w:p>
+            <w:pPr>
+              <w:pStyle w:val="Compact"/>
+              <w:spacing w:before="40" w:after="40"/>
+            </w:pPr>
+          </w:p>
+        </w:tc>
+        <w:tc>
+          <w:tcPr>
+            <w:tcW w:type="dxa" w:w="936"/>
+          </w:tcPr>
+          <w:p>
+            <w:pPr>
+              <w:pStyle w:val="Compact"/>
+              <w:spacing w:before="40" w:after="40"/>
+            </w:pPr>
+          </w:p>
+        </w:tc>
+        <w:tc>
+          <w:tcPr>
+            <w:tcW w:type="dxa" w:w="936"/>
+          </w:tcPr>
+          <w:p>
+            <w:pPr>
+              <w:pStyle w:val="Compact"/>
+              <w:spacing w:before="40" w:after="40"/>
+            </w:pPr>
+          </w:p>
+        </w:tc>
+        <w:tc>
+          <w:tcPr>
+            <w:tcW w:type="dxa" w:w="936"/>
+          </w:tcPr>
+          <w:p>
+            <w:pPr>
+              <w:pStyle w:val="Compact"/>
+              <w:spacing w:before="40" w:after="40"/>
+            </w:pPr>
+          </w:p>
+        </w:tc>
+        <w:tc>
+          <w:tcPr>
+            <w:tcW w:type="dxa" w:w="936"/>
+          </w:tcPr>
+          <w:p>
+            <w:pPr>
+              <w:pStyle w:val="Compact"/>
+              <w:spacing w:before="40" w:after="40"/>
+            </w:pPr>
+          </w:p>
+        </w:tc>
+        <w:tc>
+          <w:tcPr>
+            <w:tcW w:type="dxa" w:w="936"/>
+          </w:tcPr>
+          <w:p>
+            <w:pPr>
+              <w:pStyle w:val="Compact"/>
+              <w:spacing w:before="40" w:after="40"/>
+            </w:pPr>
+          </w:p>
+        </w:tc>
+        <w:tc>
+          <w:tcPr>
+            <w:tcW w:type="dxa" w:w="936"/>
+          </w:tcPr>
+          <w:p>
+            <w:pPr>
+              <w:pStyle w:val="Compact"/>
+              <w:spacing w:before="40" w:after="40"/>
+            </w:pPr>
+          </w:p>
+        </w:tc>
+        <w:tc>
+          <w:tcPr>
+            <w:tcW w:type="dxa" w:w="936"/>
+          </w:tcPr>
+          <w:p>
+            <w:pPr>
+              <w:pStyle w:val="Compact"/>
+              <w:spacing w:before="40" w:after="40"/>
+            </w:pPr>
+          </w:p>
+        </w:tc>
+        <w:tc>
+          <w:tcPr>
+            <w:tcW w:type="dxa" w:w="936"/>
+          </w:tcPr>
+          <w:p>
+            <w:pPr>
+              <w:pStyle w:val="Compact"/>
+              <w:spacing w:before="40" w:after="40"/>
+            </w:pPr>
+          </w:p>
+        </w:tc>
+        <w:tc>
+          <w:tcPr>
+            <w:tcW w:type="dxa" w:w="936"/>
+          </w:tcPr>
+          <w:p>
+            <w:pPr>
+              <w:pStyle w:val="Compact"/>
+              <w:spacing w:before="40" w:after="40"/>
+            </w:pPr>
+          </w:p>
+        </w:tc>
+        <w:tc>
+          <w:tcPr>
+            <w:tcW w:type="dxa" w:w="936"/>
+          </w:tcPr>
+          <w:p>
+            <w:pPr>
+              <w:pStyle w:val="Compact"/>
+              <w:spacing w:before="40" w:after="40"/>
+            </w:pPr>
+          </w:p>
+        </w:tc>
+        <w:tc>
+          <w:tcPr>
+            <w:tcW w:type="dxa" w:w="-902"/>
+          </w:tcPr>
+          <w:p>
+            <w:pPr>
+              <w:pStyle w:val="Compact"/>
+              <w:spacing w:before="40" w:after="40"/>
+            </w:pPr>
           </w:p>
         </w:tc>
       </w:tr>
       <w:tr>
         <w:tc>
           <w:tcPr>
-            <w:tcW w:type="dxa" w:w="4409"/>
+            <w:tcW w:type="dxa" w:w="-952"/>
           </w:tcPr>
           <w:p>
             <w:pPr>
@@ -505,7 +977,26 @@
         </w:tc>
         <w:tc>
           <w:tcPr>
-            <w:tcW w:type="dxa" w:w="3094"/>
+            <w:tcW w:type="dxa" w:w="-952"/>
+          </w:tcPr>
+          <w:p>
+            <w:pPr>
+              <w:pStyle w:val="Compact"/>
+              <w:spacing w:before="40" w:after="40"/>
+              <w:jc w:val="left"/>
+            </w:pPr>
+            <w:r>
+              <w:rPr>
+                <w:rFonts w:ascii="Arial" w:hAnsi="Arial"/>
+                <w:sz w:val="20"/>
+              </w:rPr>
+              <w:t xml:space="preserve">NS-SUPT-SLA-4H-UPB</w:t>
+            </w:r>
+          </w:p>
+        </w:tc>
+        <w:tc>
+          <w:tcPr>
+            <w:tcW w:type="dxa" w:w="936"/>
           </w:tcPr>
           <w:p>
             <w:pPr>
@@ -524,28 +1015,152 @@
         </w:tc>
         <w:tc>
           <w:tcPr>
-            <w:tcW w:type="dxa" w:w="1856"/>
-          </w:tcPr>
-          <w:p>
-            <w:pPr>
-              <w:pStyle w:val="Compact"/>
-              <w:spacing w:before="40" w:after="40"/>
-              <w:jc w:val="left"/>
-            </w:pPr>
-            <w:r>
-              <w:rPr>
-                <w:rFonts w:ascii="Arial" w:hAnsi="Arial"/>
-                <w:sz w:val="20"/>
-              </w:rPr>
-              <w:t xml:space="preserve">Support</w:t>
-            </w:r>
+            <w:tcW w:type="dxa" w:w="936"/>
+          </w:tcPr>
+          <w:p>
+            <w:pPr>
+              <w:pStyle w:val="Compact"/>
+              <w:spacing w:before="40" w:after="40"/>
+            </w:pPr>
+          </w:p>
+        </w:tc>
+        <w:tc>
+          <w:tcPr>
+            <w:tcW w:type="dxa" w:w="936"/>
+          </w:tcPr>
+          <w:p>
+            <w:pPr>
+              <w:pStyle w:val="Compact"/>
+              <w:spacing w:before="40" w:after="40"/>
+            </w:pPr>
+          </w:p>
+        </w:tc>
+        <w:tc>
+          <w:tcPr>
+            <w:tcW w:type="dxa" w:w="936"/>
+          </w:tcPr>
+          <w:p>
+            <w:pPr>
+              <w:pStyle w:val="Compact"/>
+              <w:spacing w:before="40" w:after="40"/>
+            </w:pPr>
+          </w:p>
+        </w:tc>
+        <w:tc>
+          <w:tcPr>
+            <w:tcW w:type="dxa" w:w="936"/>
+          </w:tcPr>
+          <w:p>
+            <w:pPr>
+              <w:pStyle w:val="Compact"/>
+              <w:spacing w:before="40" w:after="40"/>
+            </w:pPr>
+          </w:p>
+        </w:tc>
+        <w:tc>
+          <w:tcPr>
+            <w:tcW w:type="dxa" w:w="936"/>
+          </w:tcPr>
+          <w:p>
+            <w:pPr>
+              <w:pStyle w:val="Compact"/>
+              <w:spacing w:before="40" w:after="40"/>
+            </w:pPr>
+          </w:p>
+        </w:tc>
+        <w:tc>
+          <w:tcPr>
+            <w:tcW w:type="dxa" w:w="936"/>
+          </w:tcPr>
+          <w:p>
+            <w:pPr>
+              <w:pStyle w:val="Compact"/>
+              <w:spacing w:before="40" w:after="40"/>
+            </w:pPr>
+          </w:p>
+        </w:tc>
+        <w:tc>
+          <w:tcPr>
+            <w:tcW w:type="dxa" w:w="936"/>
+          </w:tcPr>
+          <w:p>
+            <w:pPr>
+              <w:pStyle w:val="Compact"/>
+              <w:spacing w:before="40" w:after="40"/>
+            </w:pPr>
+          </w:p>
+        </w:tc>
+        <w:tc>
+          <w:tcPr>
+            <w:tcW w:type="dxa" w:w="936"/>
+          </w:tcPr>
+          <w:p>
+            <w:pPr>
+              <w:pStyle w:val="Compact"/>
+              <w:spacing w:before="40" w:after="40"/>
+            </w:pPr>
+          </w:p>
+        </w:tc>
+        <w:tc>
+          <w:tcPr>
+            <w:tcW w:type="dxa" w:w="936"/>
+          </w:tcPr>
+          <w:p>
+            <w:pPr>
+              <w:pStyle w:val="Compact"/>
+              <w:spacing w:before="40" w:after="40"/>
+            </w:pPr>
+          </w:p>
+        </w:tc>
+        <w:tc>
+          <w:tcPr>
+            <w:tcW w:type="dxa" w:w="936"/>
+          </w:tcPr>
+          <w:p>
+            <w:pPr>
+              <w:pStyle w:val="Compact"/>
+              <w:spacing w:before="40" w:after="40"/>
+            </w:pPr>
+          </w:p>
+        </w:tc>
+        <w:tc>
+          <w:tcPr>
+            <w:tcW w:type="dxa" w:w="936"/>
+          </w:tcPr>
+          <w:p>
+            <w:pPr>
+              <w:pStyle w:val="Compact"/>
+              <w:spacing w:before="40" w:after="40"/>
+            </w:pPr>
+          </w:p>
+        </w:tc>
+        <w:tc>
+          <w:tcPr>
+            <w:tcW w:type="dxa" w:w="936"/>
+          </w:tcPr>
+          <w:p>
+            <w:pPr>
+              <w:pStyle w:val="Compact"/>
+              <w:spacing w:before="40" w:after="40"/>
+            </w:pPr>
+          </w:p>
+        </w:tc>
+        <w:tc>
+          <w:tcPr>
+            <w:tcW w:type="dxa" w:w="-902"/>
+          </w:tcPr>
+          <w:p>
+            <w:pPr>
+              <w:pStyle w:val="Compact"/>
+              <w:spacing w:before="40" w:after="40"/>
+            </w:pPr>
           </w:p>
         </w:tc>
       </w:tr>
       <w:tr>
         <w:tc>
           <w:tcPr>
-            <w:tcW w:type="dxa" w:w="4409"/>
+            <w:tcW w:type="dxa" w:w="-952"/>
           </w:tcPr>
           <w:p>
             <w:pPr>
@@ -566,7 +1181,26 @@
         </w:tc>
         <w:tc>
           <w:tcPr>
-            <w:tcW w:type="dxa" w:w="3094"/>
+            <w:tcW w:type="dxa" w:w="-952"/>
+          </w:tcPr>
+          <w:p>
+            <w:pPr>
+              <w:pStyle w:val="Compact"/>
+              <w:spacing w:before="40" w:after="40"/>
+              <w:jc w:val="left"/>
+            </w:pPr>
+            <w:r>
+              <w:rPr>
+                <w:rFonts w:ascii="Arial" w:hAnsi="Arial"/>
+                <w:sz w:val="20"/>
+              </w:rPr>
+              <w:t xml:space="preserve">NS-SUPT-SLA-24H-1PB</w:t>
+            </w:r>
+          </w:p>
+        </w:tc>
+        <w:tc>
+          <w:tcPr>
+            <w:tcW w:type="dxa" w:w="936"/>
           </w:tcPr>
           <w:p>
             <w:pPr>
@@ -585,28 +1219,152 @@
         </w:tc>
         <w:tc>
           <w:tcPr>
-            <w:tcW w:type="dxa" w:w="1856"/>
-          </w:tcPr>
-          <w:p>
-            <w:pPr>
-              <w:pStyle w:val="Compact"/>
-              <w:spacing w:before="40" w:after="40"/>
-              <w:jc w:val="left"/>
-            </w:pPr>
-            <w:r>
-              <w:rPr>
-                <w:rFonts w:ascii="Arial" w:hAnsi="Arial"/>
-                <w:sz w:val="20"/>
-              </w:rPr>
-              <w:t xml:space="preserve">Support</w:t>
-            </w:r>
+            <w:tcW w:type="dxa" w:w="936"/>
+          </w:tcPr>
+          <w:p>
+            <w:pPr>
+              <w:pStyle w:val="Compact"/>
+              <w:spacing w:before="40" w:after="40"/>
+            </w:pPr>
+          </w:p>
+        </w:tc>
+        <w:tc>
+          <w:tcPr>
+            <w:tcW w:type="dxa" w:w="936"/>
+          </w:tcPr>
+          <w:p>
+            <w:pPr>
+              <w:pStyle w:val="Compact"/>
+              <w:spacing w:before="40" w:after="40"/>
+            </w:pPr>
+          </w:p>
+        </w:tc>
+        <w:tc>
+          <w:tcPr>
+            <w:tcW w:type="dxa" w:w="936"/>
+          </w:tcPr>
+          <w:p>
+            <w:pPr>
+              <w:pStyle w:val="Compact"/>
+              <w:spacing w:before="40" w:after="40"/>
+            </w:pPr>
+          </w:p>
+        </w:tc>
+        <w:tc>
+          <w:tcPr>
+            <w:tcW w:type="dxa" w:w="936"/>
+          </w:tcPr>
+          <w:p>
+            <w:pPr>
+              <w:pStyle w:val="Compact"/>
+              <w:spacing w:before="40" w:after="40"/>
+            </w:pPr>
+          </w:p>
+        </w:tc>
+        <w:tc>
+          <w:tcPr>
+            <w:tcW w:type="dxa" w:w="936"/>
+          </w:tcPr>
+          <w:p>
+            <w:pPr>
+              <w:pStyle w:val="Compact"/>
+              <w:spacing w:before="40" w:after="40"/>
+            </w:pPr>
+          </w:p>
+        </w:tc>
+        <w:tc>
+          <w:tcPr>
+            <w:tcW w:type="dxa" w:w="936"/>
+          </w:tcPr>
+          <w:p>
+            <w:pPr>
+              <w:pStyle w:val="Compact"/>
+              <w:spacing w:before="40" w:after="40"/>
+            </w:pPr>
+          </w:p>
+        </w:tc>
+        <w:tc>
+          <w:tcPr>
+            <w:tcW w:type="dxa" w:w="936"/>
+          </w:tcPr>
+          <w:p>
+            <w:pPr>
+              <w:pStyle w:val="Compact"/>
+              <w:spacing w:before="40" w:after="40"/>
+            </w:pPr>
+          </w:p>
+        </w:tc>
+        <w:tc>
+          <w:tcPr>
+            <w:tcW w:type="dxa" w:w="936"/>
+          </w:tcPr>
+          <w:p>
+            <w:pPr>
+              <w:pStyle w:val="Compact"/>
+              <w:spacing w:before="40" w:after="40"/>
+            </w:pPr>
+          </w:p>
+        </w:tc>
+        <w:tc>
+          <w:tcPr>
+            <w:tcW w:type="dxa" w:w="936"/>
+          </w:tcPr>
+          <w:p>
+            <w:pPr>
+              <w:pStyle w:val="Compact"/>
+              <w:spacing w:before="40" w:after="40"/>
+            </w:pPr>
+          </w:p>
+        </w:tc>
+        <w:tc>
+          <w:tcPr>
+            <w:tcW w:type="dxa" w:w="936"/>
+          </w:tcPr>
+          <w:p>
+            <w:pPr>
+              <w:pStyle w:val="Compact"/>
+              <w:spacing w:before="40" w:after="40"/>
+            </w:pPr>
+          </w:p>
+        </w:tc>
+        <w:tc>
+          <w:tcPr>
+            <w:tcW w:type="dxa" w:w="936"/>
+          </w:tcPr>
+          <w:p>
+            <w:pPr>
+              <w:pStyle w:val="Compact"/>
+              <w:spacing w:before="40" w:after="40"/>
+            </w:pPr>
+          </w:p>
+        </w:tc>
+        <w:tc>
+          <w:tcPr>
+            <w:tcW w:type="dxa" w:w="936"/>
+          </w:tcPr>
+          <w:p>
+            <w:pPr>
+              <w:pStyle w:val="Compact"/>
+              <w:spacing w:before="40" w:after="40"/>
+            </w:pPr>
+          </w:p>
+        </w:tc>
+        <w:tc>
+          <w:tcPr>
+            <w:tcW w:type="dxa" w:w="-902"/>
+          </w:tcPr>
+          <w:p>
+            <w:pPr>
+              <w:pStyle w:val="Compact"/>
+              <w:spacing w:before="40" w:after="40"/>
+            </w:pPr>
           </w:p>
         </w:tc>
       </w:tr>
       <w:tr>
         <w:tc>
           <w:tcPr>
-            <w:tcW w:type="dxa" w:w="4409"/>
+            <w:tcW w:type="dxa" w:w="-952"/>
           </w:tcPr>
           <w:p>
             <w:pPr>
@@ -627,7 +1385,26 @@
         </w:tc>
         <w:tc>
           <w:tcPr>
-            <w:tcW w:type="dxa" w:w="3094"/>
+            <w:tcW w:type="dxa" w:w="-952"/>
+          </w:tcPr>
+          <w:p>
+            <w:pPr>
+              <w:pStyle w:val="Compact"/>
+              <w:spacing w:before="40" w:after="40"/>
+              <w:jc w:val="left"/>
+            </w:pPr>
+            <w:r>
+              <w:rPr>
+                <w:rFonts w:ascii="Arial" w:hAnsi="Arial"/>
+                <w:sz w:val="20"/>
+              </w:rPr>
+              <w:t xml:space="preserve">NS-SUPT-SLA-48H-1PB</w:t>
+            </w:r>
+          </w:p>
+        </w:tc>
+        <w:tc>
+          <w:tcPr>
+            <w:tcW w:type="dxa" w:w="936"/>
           </w:tcPr>
           <w:p>
             <w:pPr>
@@ -646,28 +1423,152 @@
         </w:tc>
         <w:tc>
           <w:tcPr>
-            <w:tcW w:type="dxa" w:w="1856"/>
-          </w:tcPr>
-          <w:p>
-            <w:pPr>
-              <w:pStyle w:val="Compact"/>
-              <w:spacing w:before="40" w:after="40"/>
-              <w:jc w:val="left"/>
-            </w:pPr>
-            <w:r>
-              <w:rPr>
-                <w:rFonts w:ascii="Arial" w:hAnsi="Arial"/>
-                <w:sz w:val="20"/>
-              </w:rPr>
-              <w:t xml:space="preserve">Support</w:t>
-            </w:r>
+            <w:tcW w:type="dxa" w:w="936"/>
+          </w:tcPr>
+          <w:p>
+            <w:pPr>
+              <w:pStyle w:val="Compact"/>
+              <w:spacing w:before="40" w:after="40"/>
+            </w:pPr>
+          </w:p>
+        </w:tc>
+        <w:tc>
+          <w:tcPr>
+            <w:tcW w:type="dxa" w:w="936"/>
+          </w:tcPr>
+          <w:p>
+            <w:pPr>
+              <w:pStyle w:val="Compact"/>
+              <w:spacing w:before="40" w:after="40"/>
+            </w:pPr>
+          </w:p>
+        </w:tc>
+        <w:tc>
+          <w:tcPr>
+            <w:tcW w:type="dxa" w:w="936"/>
+          </w:tcPr>
+          <w:p>
+            <w:pPr>
+              <w:pStyle w:val="Compact"/>
+              <w:spacing w:before="40" w:after="40"/>
+            </w:pPr>
+          </w:p>
+        </w:tc>
+        <w:tc>
+          <w:tcPr>
+            <w:tcW w:type="dxa" w:w="936"/>
+          </w:tcPr>
+          <w:p>
+            <w:pPr>
+              <w:pStyle w:val="Compact"/>
+              <w:spacing w:before="40" w:after="40"/>
+            </w:pPr>
+          </w:p>
+        </w:tc>
+        <w:tc>
+          <w:tcPr>
+            <w:tcW w:type="dxa" w:w="936"/>
+          </w:tcPr>
+          <w:p>
+            <w:pPr>
+              <w:pStyle w:val="Compact"/>
+              <w:spacing w:before="40" w:after="40"/>
+            </w:pPr>
+          </w:p>
+        </w:tc>
+        <w:tc>
+          <w:tcPr>
+            <w:tcW w:type="dxa" w:w="936"/>
+          </w:tcPr>
+          <w:p>
+            <w:pPr>
+              <w:pStyle w:val="Compact"/>
+              <w:spacing w:before="40" w:after="40"/>
+            </w:pPr>
+          </w:p>
+        </w:tc>
+        <w:tc>
+          <w:tcPr>
+            <w:tcW w:type="dxa" w:w="936"/>
+          </w:tcPr>
+          <w:p>
+            <w:pPr>
+              <w:pStyle w:val="Compact"/>
+              <w:spacing w:before="40" w:after="40"/>
+            </w:pPr>
+          </w:p>
+        </w:tc>
+        <w:tc>
+          <w:tcPr>
+            <w:tcW w:type="dxa" w:w="936"/>
+          </w:tcPr>
+          <w:p>
+            <w:pPr>
+              <w:pStyle w:val="Compact"/>
+              <w:spacing w:before="40" w:after="40"/>
+            </w:pPr>
+          </w:p>
+        </w:tc>
+        <w:tc>
+          <w:tcPr>
+            <w:tcW w:type="dxa" w:w="936"/>
+          </w:tcPr>
+          <w:p>
+            <w:pPr>
+              <w:pStyle w:val="Compact"/>
+              <w:spacing w:before="40" w:after="40"/>
+            </w:pPr>
+          </w:p>
+        </w:tc>
+        <w:tc>
+          <w:tcPr>
+            <w:tcW w:type="dxa" w:w="936"/>
+          </w:tcPr>
+          <w:p>
+            <w:pPr>
+              <w:pStyle w:val="Compact"/>
+              <w:spacing w:before="40" w:after="40"/>
+            </w:pPr>
+          </w:p>
+        </w:tc>
+        <w:tc>
+          <w:tcPr>
+            <w:tcW w:type="dxa" w:w="936"/>
+          </w:tcPr>
+          <w:p>
+            <w:pPr>
+              <w:pStyle w:val="Compact"/>
+              <w:spacing w:before="40" w:after="40"/>
+            </w:pPr>
+          </w:p>
+        </w:tc>
+        <w:tc>
+          <w:tcPr>
+            <w:tcW w:type="dxa" w:w="936"/>
+          </w:tcPr>
+          <w:p>
+            <w:pPr>
+              <w:pStyle w:val="Compact"/>
+              <w:spacing w:before="40" w:after="40"/>
+            </w:pPr>
+          </w:p>
+        </w:tc>
+        <w:tc>
+          <w:tcPr>
+            <w:tcW w:type="dxa" w:w="-902"/>
+          </w:tcPr>
+          <w:p>
+            <w:pPr>
+              <w:pStyle w:val="Compact"/>
+              <w:spacing w:before="40" w:after="40"/>
+            </w:pPr>
           </w:p>
         </w:tc>
       </w:tr>
       <w:tr>
         <w:tc>
           <w:tcPr>
-            <w:tcW w:type="dxa" w:w="4409"/>
+            <w:tcW w:type="dxa" w:w="-952"/>
           </w:tcPr>
           <w:p>
             <w:pPr>
@@ -688,7 +1589,26 @@
         </w:tc>
         <w:tc>
           <w:tcPr>
-            <w:tcW w:type="dxa" w:w="3094"/>
+            <w:tcW w:type="dxa" w:w="-952"/>
+          </w:tcPr>
+          <w:p>
+            <w:pPr>
+              <w:pStyle w:val="Compact"/>
+              <w:spacing w:before="40" w:after="40"/>
+              <w:jc w:val="left"/>
+            </w:pPr>
+            <w:r>
+              <w:rPr>
+                <w:rFonts w:ascii="Arial" w:hAnsi="Arial"/>
+                <w:sz w:val="20"/>
+              </w:rPr>
+              <w:t xml:space="preserve">NS-SUPT-SLA-5D-0PB</w:t>
+            </w:r>
+          </w:p>
+        </w:tc>
+        <w:tc>
+          <w:tcPr>
+            <w:tcW w:type="dxa" w:w="936"/>
           </w:tcPr>
           <w:p>
             <w:pPr>
@@ -707,28 +1627,152 @@
         </w:tc>
         <w:tc>
           <w:tcPr>
-            <w:tcW w:type="dxa" w:w="1856"/>
-          </w:tcPr>
-          <w:p>
-            <w:pPr>
-              <w:pStyle w:val="Compact"/>
-              <w:spacing w:before="40" w:after="40"/>
-              <w:jc w:val="left"/>
-            </w:pPr>
-            <w:r>
-              <w:rPr>
-                <w:rFonts w:ascii="Arial" w:hAnsi="Arial"/>
-                <w:sz w:val="20"/>
-              </w:rPr>
-              <w:t xml:space="preserve">Support</w:t>
-            </w:r>
+            <w:tcW w:type="dxa" w:w="936"/>
+          </w:tcPr>
+          <w:p>
+            <w:pPr>
+              <w:pStyle w:val="Compact"/>
+              <w:spacing w:before="40" w:after="40"/>
+            </w:pPr>
+          </w:p>
+        </w:tc>
+        <w:tc>
+          <w:tcPr>
+            <w:tcW w:type="dxa" w:w="936"/>
+          </w:tcPr>
+          <w:p>
+            <w:pPr>
+              <w:pStyle w:val="Compact"/>
+              <w:spacing w:before="40" w:after="40"/>
+            </w:pPr>
+          </w:p>
+        </w:tc>
+        <w:tc>
+          <w:tcPr>
+            <w:tcW w:type="dxa" w:w="936"/>
+          </w:tcPr>
+          <w:p>
+            <w:pPr>
+              <w:pStyle w:val="Compact"/>
+              <w:spacing w:before="40" w:after="40"/>
+            </w:pPr>
+          </w:p>
+        </w:tc>
+        <w:tc>
+          <w:tcPr>
+            <w:tcW w:type="dxa" w:w="936"/>
+          </w:tcPr>
+          <w:p>
+            <w:pPr>
+              <w:pStyle w:val="Compact"/>
+              <w:spacing w:before="40" w:after="40"/>
+            </w:pPr>
+          </w:p>
+        </w:tc>
+        <w:tc>
+          <w:tcPr>
+            <w:tcW w:type="dxa" w:w="936"/>
+          </w:tcPr>
+          <w:p>
+            <w:pPr>
+              <w:pStyle w:val="Compact"/>
+              <w:spacing w:before="40" w:after="40"/>
+            </w:pPr>
+          </w:p>
+        </w:tc>
+        <w:tc>
+          <w:tcPr>
+            <w:tcW w:type="dxa" w:w="936"/>
+          </w:tcPr>
+          <w:p>
+            <w:pPr>
+              <w:pStyle w:val="Compact"/>
+              <w:spacing w:before="40" w:after="40"/>
+            </w:pPr>
+          </w:p>
+        </w:tc>
+        <w:tc>
+          <w:tcPr>
+            <w:tcW w:type="dxa" w:w="936"/>
+          </w:tcPr>
+          <w:p>
+            <w:pPr>
+              <w:pStyle w:val="Compact"/>
+              <w:spacing w:before="40" w:after="40"/>
+            </w:pPr>
+          </w:p>
+        </w:tc>
+        <w:tc>
+          <w:tcPr>
+            <w:tcW w:type="dxa" w:w="936"/>
+          </w:tcPr>
+          <w:p>
+            <w:pPr>
+              <w:pStyle w:val="Compact"/>
+              <w:spacing w:before="40" w:after="40"/>
+            </w:pPr>
+          </w:p>
+        </w:tc>
+        <w:tc>
+          <w:tcPr>
+            <w:tcW w:type="dxa" w:w="936"/>
+          </w:tcPr>
+          <w:p>
+            <w:pPr>
+              <w:pStyle w:val="Compact"/>
+              <w:spacing w:before="40" w:after="40"/>
+            </w:pPr>
+          </w:p>
+        </w:tc>
+        <w:tc>
+          <w:tcPr>
+            <w:tcW w:type="dxa" w:w="936"/>
+          </w:tcPr>
+          <w:p>
+            <w:pPr>
+              <w:pStyle w:val="Compact"/>
+              <w:spacing w:before="40" w:after="40"/>
+            </w:pPr>
+          </w:p>
+        </w:tc>
+        <w:tc>
+          <w:tcPr>
+            <w:tcW w:type="dxa" w:w="936"/>
+          </w:tcPr>
+          <w:p>
+            <w:pPr>
+              <w:pStyle w:val="Compact"/>
+              <w:spacing w:before="40" w:after="40"/>
+            </w:pPr>
+          </w:p>
+        </w:tc>
+        <w:tc>
+          <w:tcPr>
+            <w:tcW w:type="dxa" w:w="936"/>
+          </w:tcPr>
+          <w:p>
+            <w:pPr>
+              <w:pStyle w:val="Compact"/>
+              <w:spacing w:before="40" w:after="40"/>
+            </w:pPr>
+          </w:p>
+        </w:tc>
+        <w:tc>
+          <w:tcPr>
+            <w:tcW w:type="dxa" w:w="-902"/>
+          </w:tcPr>
+          <w:p>
+            <w:pPr>
+              <w:pStyle w:val="Compact"/>
+              <w:spacing w:before="40" w:after="40"/>
+            </w:pPr>
           </w:p>
         </w:tc>
       </w:tr>
       <w:tr>
         <w:tc>
           <w:tcPr>
-            <w:tcW w:type="dxa" w:w="4409"/>
+            <w:tcW w:type="dxa" w:w="-952"/>
           </w:tcPr>
           <w:p>
             <w:pPr>
@@ -749,7 +1793,26 @@
         </w:tc>
         <w:tc>
           <w:tcPr>
-            <w:tcW w:type="dxa" w:w="3094"/>
+            <w:tcW w:type="dxa" w:w="-952"/>
+          </w:tcPr>
+          <w:p>
+            <w:pPr>
+              <w:pStyle w:val="Compact"/>
+              <w:spacing w:before="40" w:after="40"/>
+              <w:jc w:val="left"/>
+            </w:pPr>
+            <w:r>
+              <w:rPr>
+                <w:rFonts w:ascii="Arial" w:hAnsi="Arial"/>
+                <w:sz w:val="20"/>
+              </w:rPr>
+              <w:t xml:space="preserve">NS-TRAIN-LV-3D</w:t>
+            </w:r>
+          </w:p>
+        </w:tc>
+        <w:tc>
+          <w:tcPr>
+            <w:tcW w:type="dxa" w:w="936"/>
           </w:tcPr>
           <w:p>
             <w:pPr>
@@ -768,28 +1831,152 @@
         </w:tc>
         <w:tc>
           <w:tcPr>
-            <w:tcW w:type="dxa" w:w="1856"/>
-          </w:tcPr>
-          <w:p>
-            <w:pPr>
-              <w:pStyle w:val="Compact"/>
-              <w:spacing w:before="40" w:after="40"/>
-              <w:jc w:val="left"/>
-            </w:pPr>
-            <w:r>
-              <w:rPr>
-                <w:rFonts w:ascii="Arial" w:hAnsi="Arial"/>
-                <w:sz w:val="20"/>
-              </w:rPr>
-              <w:t xml:space="preserve">Training</w:t>
-            </w:r>
+            <w:tcW w:type="dxa" w:w="936"/>
+          </w:tcPr>
+          <w:p>
+            <w:pPr>
+              <w:pStyle w:val="Compact"/>
+              <w:spacing w:before="40" w:after="40"/>
+            </w:pPr>
+          </w:p>
+        </w:tc>
+        <w:tc>
+          <w:tcPr>
+            <w:tcW w:type="dxa" w:w="936"/>
+          </w:tcPr>
+          <w:p>
+            <w:pPr>
+              <w:pStyle w:val="Compact"/>
+              <w:spacing w:before="40" w:after="40"/>
+            </w:pPr>
+          </w:p>
+        </w:tc>
+        <w:tc>
+          <w:tcPr>
+            <w:tcW w:type="dxa" w:w="936"/>
+          </w:tcPr>
+          <w:p>
+            <w:pPr>
+              <w:pStyle w:val="Compact"/>
+              <w:spacing w:before="40" w:after="40"/>
+            </w:pPr>
+          </w:p>
+        </w:tc>
+        <w:tc>
+          <w:tcPr>
+            <w:tcW w:type="dxa" w:w="936"/>
+          </w:tcPr>
+          <w:p>
+            <w:pPr>
+              <w:pStyle w:val="Compact"/>
+              <w:spacing w:before="40" w:after="40"/>
+            </w:pPr>
+          </w:p>
+        </w:tc>
+        <w:tc>
+          <w:tcPr>
+            <w:tcW w:type="dxa" w:w="936"/>
+          </w:tcPr>
+          <w:p>
+            <w:pPr>
+              <w:pStyle w:val="Compact"/>
+              <w:spacing w:before="40" w:after="40"/>
+            </w:pPr>
+          </w:p>
+        </w:tc>
+        <w:tc>
+          <w:tcPr>
+            <w:tcW w:type="dxa" w:w="936"/>
+          </w:tcPr>
+          <w:p>
+            <w:pPr>
+              <w:pStyle w:val="Compact"/>
+              <w:spacing w:before="40" w:after="40"/>
+            </w:pPr>
+          </w:p>
+        </w:tc>
+        <w:tc>
+          <w:tcPr>
+            <w:tcW w:type="dxa" w:w="936"/>
+          </w:tcPr>
+          <w:p>
+            <w:pPr>
+              <w:pStyle w:val="Compact"/>
+              <w:spacing w:before="40" w:after="40"/>
+            </w:pPr>
+          </w:p>
+        </w:tc>
+        <w:tc>
+          <w:tcPr>
+            <w:tcW w:type="dxa" w:w="936"/>
+          </w:tcPr>
+          <w:p>
+            <w:pPr>
+              <w:pStyle w:val="Compact"/>
+              <w:spacing w:before="40" w:after="40"/>
+            </w:pPr>
+          </w:p>
+        </w:tc>
+        <w:tc>
+          <w:tcPr>
+            <w:tcW w:type="dxa" w:w="936"/>
+          </w:tcPr>
+          <w:p>
+            <w:pPr>
+              <w:pStyle w:val="Compact"/>
+              <w:spacing w:before="40" w:after="40"/>
+            </w:pPr>
+          </w:p>
+        </w:tc>
+        <w:tc>
+          <w:tcPr>
+            <w:tcW w:type="dxa" w:w="936"/>
+          </w:tcPr>
+          <w:p>
+            <w:pPr>
+              <w:pStyle w:val="Compact"/>
+              <w:spacing w:before="40" w:after="40"/>
+            </w:pPr>
+          </w:p>
+        </w:tc>
+        <w:tc>
+          <w:tcPr>
+            <w:tcW w:type="dxa" w:w="936"/>
+          </w:tcPr>
+          <w:p>
+            <w:pPr>
+              <w:pStyle w:val="Compact"/>
+              <w:spacing w:before="40" w:after="40"/>
+            </w:pPr>
+          </w:p>
+        </w:tc>
+        <w:tc>
+          <w:tcPr>
+            <w:tcW w:type="dxa" w:w="936"/>
+          </w:tcPr>
+          <w:p>
+            <w:pPr>
+              <w:pStyle w:val="Compact"/>
+              <w:spacing w:before="40" w:after="40"/>
+            </w:pPr>
+          </w:p>
+        </w:tc>
+        <w:tc>
+          <w:tcPr>
+            <w:tcW w:type="dxa" w:w="-902"/>
+          </w:tcPr>
+          <w:p>
+            <w:pPr>
+              <w:pStyle w:val="Compact"/>
+              <w:spacing w:before="40" w:after="40"/>
+            </w:pPr>
           </w:p>
         </w:tc>
       </w:tr>
       <w:tr>
         <w:tc>
           <w:tcPr>
-            <w:tcW w:type="dxa" w:w="4409"/>
+            <w:tcW w:type="dxa" w:w="-952"/>
           </w:tcPr>
           <w:p>
             <w:pPr>
@@ -810,7 +1997,26 @@
         </w:tc>
         <w:tc>
           <w:tcPr>
-            <w:tcW w:type="dxa" w:w="3094"/>
+            <w:tcW w:type="dxa" w:w="-952"/>
+          </w:tcPr>
+          <w:p>
+            <w:pPr>
+              <w:pStyle w:val="Compact"/>
+              <w:spacing w:before="40" w:after="40"/>
+              <w:jc w:val="left"/>
+            </w:pPr>
+            <w:r>
+              <w:rPr>
+                <w:rFonts w:ascii="Arial" w:hAnsi="Arial"/>
+                <w:sz w:val="20"/>
+              </w:rPr>
+              <w:t xml:space="preserve">NS-TRAIN-LV-4D</w:t>
+            </w:r>
+          </w:p>
+        </w:tc>
+        <w:tc>
+          <w:tcPr>
+            <w:tcW w:type="dxa" w:w="936"/>
           </w:tcPr>
           <w:p>
             <w:pPr>
@@ -829,28 +2035,152 @@
         </w:tc>
         <w:tc>
           <w:tcPr>
-            <w:tcW w:type="dxa" w:w="1856"/>
-          </w:tcPr>
-          <w:p>
-            <w:pPr>
-              <w:pStyle w:val="Compact"/>
-              <w:spacing w:before="40" w:after="40"/>
-              <w:jc w:val="left"/>
-            </w:pPr>
-            <w:r>
-              <w:rPr>
-                <w:rFonts w:ascii="Arial" w:hAnsi="Arial"/>
-                <w:sz w:val="20"/>
-              </w:rPr>
-              <w:t xml:space="preserve">Training</w:t>
-            </w:r>
+            <w:tcW w:type="dxa" w:w="936"/>
+          </w:tcPr>
+          <w:p>
+            <w:pPr>
+              <w:pStyle w:val="Compact"/>
+              <w:spacing w:before="40" w:after="40"/>
+            </w:pPr>
+          </w:p>
+        </w:tc>
+        <w:tc>
+          <w:tcPr>
+            <w:tcW w:type="dxa" w:w="936"/>
+          </w:tcPr>
+          <w:p>
+            <w:pPr>
+              <w:pStyle w:val="Compact"/>
+              <w:spacing w:before="40" w:after="40"/>
+            </w:pPr>
+          </w:p>
+        </w:tc>
+        <w:tc>
+          <w:tcPr>
+            <w:tcW w:type="dxa" w:w="936"/>
+          </w:tcPr>
+          <w:p>
+            <w:pPr>
+              <w:pStyle w:val="Compact"/>
+              <w:spacing w:before="40" w:after="40"/>
+            </w:pPr>
+          </w:p>
+        </w:tc>
+        <w:tc>
+          <w:tcPr>
+            <w:tcW w:type="dxa" w:w="936"/>
+          </w:tcPr>
+          <w:p>
+            <w:pPr>
+              <w:pStyle w:val="Compact"/>
+              <w:spacing w:before="40" w:after="40"/>
+            </w:pPr>
+          </w:p>
+        </w:tc>
+        <w:tc>
+          <w:tcPr>
+            <w:tcW w:type="dxa" w:w="936"/>
+          </w:tcPr>
+          <w:p>
+            <w:pPr>
+              <w:pStyle w:val="Compact"/>
+              <w:spacing w:before="40" w:after="40"/>
+            </w:pPr>
+          </w:p>
+        </w:tc>
+        <w:tc>
+          <w:tcPr>
+            <w:tcW w:type="dxa" w:w="936"/>
+          </w:tcPr>
+          <w:p>
+            <w:pPr>
+              <w:pStyle w:val="Compact"/>
+              <w:spacing w:before="40" w:after="40"/>
+            </w:pPr>
+          </w:p>
+        </w:tc>
+        <w:tc>
+          <w:tcPr>
+            <w:tcW w:type="dxa" w:w="936"/>
+          </w:tcPr>
+          <w:p>
+            <w:pPr>
+              <w:pStyle w:val="Compact"/>
+              <w:spacing w:before="40" w:after="40"/>
+            </w:pPr>
+          </w:p>
+        </w:tc>
+        <w:tc>
+          <w:tcPr>
+            <w:tcW w:type="dxa" w:w="936"/>
+          </w:tcPr>
+          <w:p>
+            <w:pPr>
+              <w:pStyle w:val="Compact"/>
+              <w:spacing w:before="40" w:after="40"/>
+            </w:pPr>
+          </w:p>
+        </w:tc>
+        <w:tc>
+          <w:tcPr>
+            <w:tcW w:type="dxa" w:w="936"/>
+          </w:tcPr>
+          <w:p>
+            <w:pPr>
+              <w:pStyle w:val="Compact"/>
+              <w:spacing w:before="40" w:after="40"/>
+            </w:pPr>
+          </w:p>
+        </w:tc>
+        <w:tc>
+          <w:tcPr>
+            <w:tcW w:type="dxa" w:w="936"/>
+          </w:tcPr>
+          <w:p>
+            <w:pPr>
+              <w:pStyle w:val="Compact"/>
+              <w:spacing w:before="40" w:after="40"/>
+            </w:pPr>
+          </w:p>
+        </w:tc>
+        <w:tc>
+          <w:tcPr>
+            <w:tcW w:type="dxa" w:w="936"/>
+          </w:tcPr>
+          <w:p>
+            <w:pPr>
+              <w:pStyle w:val="Compact"/>
+              <w:spacing w:before="40" w:after="40"/>
+            </w:pPr>
+          </w:p>
+        </w:tc>
+        <w:tc>
+          <w:tcPr>
+            <w:tcW w:type="dxa" w:w="936"/>
+          </w:tcPr>
+          <w:p>
+            <w:pPr>
+              <w:pStyle w:val="Compact"/>
+              <w:spacing w:before="40" w:after="40"/>
+            </w:pPr>
+          </w:p>
+        </w:tc>
+        <w:tc>
+          <w:tcPr>
+            <w:tcW w:type="dxa" w:w="-902"/>
+          </w:tcPr>
+          <w:p>
+            <w:pPr>
+              <w:pStyle w:val="Compact"/>
+              <w:spacing w:before="40" w:after="40"/>
+            </w:pPr>
           </w:p>
         </w:tc>
       </w:tr>
       <w:tr>
         <w:tc>
           <w:tcPr>
-            <w:tcW w:type="dxa" w:w="4409"/>
+            <w:tcW w:type="dxa" w:w="-952"/>
           </w:tcPr>
           <w:p>
             <w:pPr>
@@ -871,7 +2201,26 @@
         </w:tc>
         <w:tc>
           <w:tcPr>
-            <w:tcW w:type="dxa" w:w="3094"/>
+            <w:tcW w:type="dxa" w:w="-952"/>
+          </w:tcPr>
+          <w:p>
+            <w:pPr>
+              <w:pStyle w:val="Compact"/>
+              <w:spacing w:before="40" w:after="40"/>
+              <w:jc w:val="left"/>
+            </w:pPr>
+            <w:r>
+              <w:rPr>
+                <w:rFonts w:ascii="Arial" w:hAnsi="Arial"/>
+                <w:sz w:val="20"/>
+              </w:rPr>
+              <w:t xml:space="preserve">NS-TRAIN-PLATFORM</w:t>
+            </w:r>
+          </w:p>
+        </w:tc>
+        <w:tc>
+          <w:tcPr>
+            <w:tcW w:type="dxa" w:w="936"/>
           </w:tcPr>
           <w:p>
             <w:pPr>
@@ -890,28 +2239,152 @@
         </w:tc>
         <w:tc>
           <w:tcPr>
-            <w:tcW w:type="dxa" w:w="1856"/>
-          </w:tcPr>
-          <w:p>
-            <w:pPr>
-              <w:pStyle w:val="Compact"/>
-              <w:spacing w:before="40" w:after="40"/>
-              <w:jc w:val="left"/>
-            </w:pPr>
-            <w:r>
-              <w:rPr>
-                <w:rFonts w:ascii="Arial" w:hAnsi="Arial"/>
-                <w:sz w:val="20"/>
-              </w:rPr>
-              <w:t xml:space="preserve">Training</w:t>
-            </w:r>
+            <w:tcW w:type="dxa" w:w="936"/>
+          </w:tcPr>
+          <w:p>
+            <w:pPr>
+              <w:pStyle w:val="Compact"/>
+              <w:spacing w:before="40" w:after="40"/>
+            </w:pPr>
+          </w:p>
+        </w:tc>
+        <w:tc>
+          <w:tcPr>
+            <w:tcW w:type="dxa" w:w="936"/>
+          </w:tcPr>
+          <w:p>
+            <w:pPr>
+              <w:pStyle w:val="Compact"/>
+              <w:spacing w:before="40" w:after="40"/>
+            </w:pPr>
+          </w:p>
+        </w:tc>
+        <w:tc>
+          <w:tcPr>
+            <w:tcW w:type="dxa" w:w="936"/>
+          </w:tcPr>
+          <w:p>
+            <w:pPr>
+              <w:pStyle w:val="Compact"/>
+              <w:spacing w:before="40" w:after="40"/>
+            </w:pPr>
+          </w:p>
+        </w:tc>
+        <w:tc>
+          <w:tcPr>
+            <w:tcW w:type="dxa" w:w="936"/>
+          </w:tcPr>
+          <w:p>
+            <w:pPr>
+              <w:pStyle w:val="Compact"/>
+              <w:spacing w:before="40" w:after="40"/>
+            </w:pPr>
+          </w:p>
+        </w:tc>
+        <w:tc>
+          <w:tcPr>
+            <w:tcW w:type="dxa" w:w="936"/>
+          </w:tcPr>
+          <w:p>
+            <w:pPr>
+              <w:pStyle w:val="Compact"/>
+              <w:spacing w:before="40" w:after="40"/>
+            </w:pPr>
+          </w:p>
+        </w:tc>
+        <w:tc>
+          <w:tcPr>
+            <w:tcW w:type="dxa" w:w="936"/>
+          </w:tcPr>
+          <w:p>
+            <w:pPr>
+              <w:pStyle w:val="Compact"/>
+              <w:spacing w:before="40" w:after="40"/>
+            </w:pPr>
+          </w:p>
+        </w:tc>
+        <w:tc>
+          <w:tcPr>
+            <w:tcW w:type="dxa" w:w="936"/>
+          </w:tcPr>
+          <w:p>
+            <w:pPr>
+              <w:pStyle w:val="Compact"/>
+              <w:spacing w:before="40" w:after="40"/>
+            </w:pPr>
+          </w:p>
+        </w:tc>
+        <w:tc>
+          <w:tcPr>
+            <w:tcW w:type="dxa" w:w="936"/>
+          </w:tcPr>
+          <w:p>
+            <w:pPr>
+              <w:pStyle w:val="Compact"/>
+              <w:spacing w:before="40" w:after="40"/>
+            </w:pPr>
+          </w:p>
+        </w:tc>
+        <w:tc>
+          <w:tcPr>
+            <w:tcW w:type="dxa" w:w="936"/>
+          </w:tcPr>
+          <w:p>
+            <w:pPr>
+              <w:pStyle w:val="Compact"/>
+              <w:spacing w:before="40" w:after="40"/>
+            </w:pPr>
+          </w:p>
+        </w:tc>
+        <w:tc>
+          <w:tcPr>
+            <w:tcW w:type="dxa" w:w="936"/>
+          </w:tcPr>
+          <w:p>
+            <w:pPr>
+              <w:pStyle w:val="Compact"/>
+              <w:spacing w:before="40" w:after="40"/>
+            </w:pPr>
+          </w:p>
+        </w:tc>
+        <w:tc>
+          <w:tcPr>
+            <w:tcW w:type="dxa" w:w="936"/>
+          </w:tcPr>
+          <w:p>
+            <w:pPr>
+              <w:pStyle w:val="Compact"/>
+              <w:spacing w:before="40" w:after="40"/>
+            </w:pPr>
+          </w:p>
+        </w:tc>
+        <w:tc>
+          <w:tcPr>
+            <w:tcW w:type="dxa" w:w="936"/>
+          </w:tcPr>
+          <w:p>
+            <w:pPr>
+              <w:pStyle w:val="Compact"/>
+              <w:spacing w:before="40" w:after="40"/>
+            </w:pPr>
+          </w:p>
+        </w:tc>
+        <w:tc>
+          <w:tcPr>
+            <w:tcW w:type="dxa" w:w="-902"/>
+          </w:tcPr>
+          <w:p>
+            <w:pPr>
+              <w:pStyle w:val="Compact"/>
+              <w:spacing w:before="40" w:after="40"/>
+            </w:pPr>
           </w:p>
         </w:tc>
       </w:tr>
       <w:tr>
         <w:tc>
           <w:tcPr>
-            <w:tcW w:type="dxa" w:w="4409"/>
+            <w:tcW w:type="dxa" w:w="-952"/>
           </w:tcPr>
           <w:p>
             <w:pPr>
@@ -932,7 +2405,26 @@
         </w:tc>
         <w:tc>
           <w:tcPr>
-            <w:tcW w:type="dxa" w:w="3094"/>
+            <w:tcW w:type="dxa" w:w="-952"/>
+          </w:tcPr>
+          <w:p>
+            <w:pPr>
+              <w:pStyle w:val="Compact"/>
+              <w:spacing w:before="40" w:after="40"/>
+              <w:jc w:val="left"/>
+            </w:pPr>
+            <w:r>
+              <w:rPr>
+                <w:rFonts w:ascii="Arial" w:hAnsi="Arial"/>
+                <w:sz w:val="20"/>
+              </w:rPr>
+              <w:t xml:space="preserve">NS-LIC-AISTOR</w:t>
+            </w:r>
+          </w:p>
+        </w:tc>
+        <w:tc>
+          <w:tcPr>
+            <w:tcW w:type="dxa" w:w="936"/>
           </w:tcPr>
           <w:p>
             <w:pPr>
@@ -951,28 +2443,152 @@
         </w:tc>
         <w:tc>
           <w:tcPr>
-            <w:tcW w:type="dxa" w:w="1856"/>
-          </w:tcPr>
-          <w:p>
-            <w:pPr>
-              <w:pStyle w:val="Compact"/>
-              <w:spacing w:before="40" w:after="40"/>
-              <w:jc w:val="left"/>
-            </w:pPr>
-            <w:r>
-              <w:rPr>
-                <w:rFonts w:ascii="Arial" w:hAnsi="Arial"/>
-                <w:sz w:val="20"/>
-              </w:rPr>
-              <w:t xml:space="preserve">License</w:t>
-            </w:r>
+            <w:tcW w:type="dxa" w:w="936"/>
+          </w:tcPr>
+          <w:p>
+            <w:pPr>
+              <w:pStyle w:val="Compact"/>
+              <w:spacing w:before="40" w:after="40"/>
+            </w:pPr>
+          </w:p>
+        </w:tc>
+        <w:tc>
+          <w:tcPr>
+            <w:tcW w:type="dxa" w:w="936"/>
+          </w:tcPr>
+          <w:p>
+            <w:pPr>
+              <w:pStyle w:val="Compact"/>
+              <w:spacing w:before="40" w:after="40"/>
+            </w:pPr>
+          </w:p>
+        </w:tc>
+        <w:tc>
+          <w:tcPr>
+            <w:tcW w:type="dxa" w:w="936"/>
+          </w:tcPr>
+          <w:p>
+            <w:pPr>
+              <w:pStyle w:val="Compact"/>
+              <w:spacing w:before="40" w:after="40"/>
+            </w:pPr>
+          </w:p>
+        </w:tc>
+        <w:tc>
+          <w:tcPr>
+            <w:tcW w:type="dxa" w:w="936"/>
+          </w:tcPr>
+          <w:p>
+            <w:pPr>
+              <w:pStyle w:val="Compact"/>
+              <w:spacing w:before="40" w:after="40"/>
+            </w:pPr>
+          </w:p>
+        </w:tc>
+        <w:tc>
+          <w:tcPr>
+            <w:tcW w:type="dxa" w:w="936"/>
+          </w:tcPr>
+          <w:p>
+            <w:pPr>
+              <w:pStyle w:val="Compact"/>
+              <w:spacing w:before="40" w:after="40"/>
+            </w:pPr>
+          </w:p>
+        </w:tc>
+        <w:tc>
+          <w:tcPr>
+            <w:tcW w:type="dxa" w:w="936"/>
+          </w:tcPr>
+          <w:p>
+            <w:pPr>
+              <w:pStyle w:val="Compact"/>
+              <w:spacing w:before="40" w:after="40"/>
+            </w:pPr>
+          </w:p>
+        </w:tc>
+        <w:tc>
+          <w:tcPr>
+            <w:tcW w:type="dxa" w:w="936"/>
+          </w:tcPr>
+          <w:p>
+            <w:pPr>
+              <w:pStyle w:val="Compact"/>
+              <w:spacing w:before="40" w:after="40"/>
+            </w:pPr>
+          </w:p>
+        </w:tc>
+        <w:tc>
+          <w:tcPr>
+            <w:tcW w:type="dxa" w:w="936"/>
+          </w:tcPr>
+          <w:p>
+            <w:pPr>
+              <w:pStyle w:val="Compact"/>
+              <w:spacing w:before="40" w:after="40"/>
+            </w:pPr>
+          </w:p>
+        </w:tc>
+        <w:tc>
+          <w:tcPr>
+            <w:tcW w:type="dxa" w:w="936"/>
+          </w:tcPr>
+          <w:p>
+            <w:pPr>
+              <w:pStyle w:val="Compact"/>
+              <w:spacing w:before="40" w:after="40"/>
+            </w:pPr>
+          </w:p>
+        </w:tc>
+        <w:tc>
+          <w:tcPr>
+            <w:tcW w:type="dxa" w:w="936"/>
+          </w:tcPr>
+          <w:p>
+            <w:pPr>
+              <w:pStyle w:val="Compact"/>
+              <w:spacing w:before="40" w:after="40"/>
+            </w:pPr>
+          </w:p>
+        </w:tc>
+        <w:tc>
+          <w:tcPr>
+            <w:tcW w:type="dxa" w:w="936"/>
+          </w:tcPr>
+          <w:p>
+            <w:pPr>
+              <w:pStyle w:val="Compact"/>
+              <w:spacing w:before="40" w:after="40"/>
+            </w:pPr>
+          </w:p>
+        </w:tc>
+        <w:tc>
+          <w:tcPr>
+            <w:tcW w:type="dxa" w:w="936"/>
+          </w:tcPr>
+          <w:p>
+            <w:pPr>
+              <w:pStyle w:val="Compact"/>
+              <w:spacing w:before="40" w:after="40"/>
+            </w:pPr>
+          </w:p>
+        </w:tc>
+        <w:tc>
+          <w:tcPr>
+            <w:tcW w:type="dxa" w:w="-902"/>
+          </w:tcPr>
+          <w:p>
+            <w:pPr>
+              <w:pStyle w:val="Compact"/>
+              <w:spacing w:before="40" w:after="40"/>
+            </w:pPr>
           </w:p>
         </w:tc>
       </w:tr>
       <w:tr>
         <w:tc>
           <w:tcPr>
-            <w:tcW w:type="dxa" w:w="4409"/>
+            <w:tcW w:type="dxa" w:w="-952"/>
           </w:tcPr>
           <w:p>
             <w:pPr>
@@ -993,7 +2609,26 @@
         </w:tc>
         <w:tc>
           <w:tcPr>
-            <w:tcW w:type="dxa" w:w="3094"/>
+            <w:tcW w:type="dxa" w:w="-952"/>
+          </w:tcPr>
+          <w:p>
+            <w:pPr>
+              <w:pStyle w:val="Compact"/>
+              <w:spacing w:before="40" w:after="40"/>
+              <w:jc w:val="left"/>
+            </w:pPr>
+            <w:r>
+              <w:rPr>
+                <w:rFonts w:ascii="Arial" w:hAnsi="Arial"/>
+                <w:sz w:val="20"/>
+              </w:rPr>
+              <w:t xml:space="preserve">NS-OEM-LIC-AISTOR</w:t>
+            </w:r>
+          </w:p>
+        </w:tc>
+        <w:tc>
+          <w:tcPr>
+            <w:tcW w:type="dxa" w:w="936"/>
           </w:tcPr>
           <w:p>
             <w:pPr>
@@ -1012,28 +2647,152 @@
         </w:tc>
         <w:tc>
           <w:tcPr>
-            <w:tcW w:type="dxa" w:w="1856"/>
-          </w:tcPr>
-          <w:p>
-            <w:pPr>
-              <w:pStyle w:val="Compact"/>
-              <w:spacing w:before="40" w:after="40"/>
-              <w:jc w:val="left"/>
-            </w:pPr>
-            <w:r>
-              <w:rPr>
-                <w:rFonts w:ascii="Arial" w:hAnsi="Arial"/>
-                <w:sz w:val="20"/>
-              </w:rPr>
-              <w:t xml:space="preserve">License</w:t>
-            </w:r>
+            <w:tcW w:type="dxa" w:w="936"/>
+          </w:tcPr>
+          <w:p>
+            <w:pPr>
+              <w:pStyle w:val="Compact"/>
+              <w:spacing w:before="40" w:after="40"/>
+            </w:pPr>
+          </w:p>
+        </w:tc>
+        <w:tc>
+          <w:tcPr>
+            <w:tcW w:type="dxa" w:w="936"/>
+          </w:tcPr>
+          <w:p>
+            <w:pPr>
+              <w:pStyle w:val="Compact"/>
+              <w:spacing w:before="40" w:after="40"/>
+            </w:pPr>
+          </w:p>
+        </w:tc>
+        <w:tc>
+          <w:tcPr>
+            <w:tcW w:type="dxa" w:w="936"/>
+          </w:tcPr>
+          <w:p>
+            <w:pPr>
+              <w:pStyle w:val="Compact"/>
+              <w:spacing w:before="40" w:after="40"/>
+            </w:pPr>
+          </w:p>
+        </w:tc>
+        <w:tc>
+          <w:tcPr>
+            <w:tcW w:type="dxa" w:w="936"/>
+          </w:tcPr>
+          <w:p>
+            <w:pPr>
+              <w:pStyle w:val="Compact"/>
+              <w:spacing w:before="40" w:after="40"/>
+            </w:pPr>
+          </w:p>
+        </w:tc>
+        <w:tc>
+          <w:tcPr>
+            <w:tcW w:type="dxa" w:w="936"/>
+          </w:tcPr>
+          <w:p>
+            <w:pPr>
+              <w:pStyle w:val="Compact"/>
+              <w:spacing w:before="40" w:after="40"/>
+            </w:pPr>
+          </w:p>
+        </w:tc>
+        <w:tc>
+          <w:tcPr>
+            <w:tcW w:type="dxa" w:w="936"/>
+          </w:tcPr>
+          <w:p>
+            <w:pPr>
+              <w:pStyle w:val="Compact"/>
+              <w:spacing w:before="40" w:after="40"/>
+            </w:pPr>
+          </w:p>
+        </w:tc>
+        <w:tc>
+          <w:tcPr>
+            <w:tcW w:type="dxa" w:w="936"/>
+          </w:tcPr>
+          <w:p>
+            <w:pPr>
+              <w:pStyle w:val="Compact"/>
+              <w:spacing w:before="40" w:after="40"/>
+            </w:pPr>
+          </w:p>
+        </w:tc>
+        <w:tc>
+          <w:tcPr>
+            <w:tcW w:type="dxa" w:w="936"/>
+          </w:tcPr>
+          <w:p>
+            <w:pPr>
+              <w:pStyle w:val="Compact"/>
+              <w:spacing w:before="40" w:after="40"/>
+            </w:pPr>
+          </w:p>
+        </w:tc>
+        <w:tc>
+          <w:tcPr>
+            <w:tcW w:type="dxa" w:w="936"/>
+          </w:tcPr>
+          <w:p>
+            <w:pPr>
+              <w:pStyle w:val="Compact"/>
+              <w:spacing w:before="40" w:after="40"/>
+            </w:pPr>
+          </w:p>
+        </w:tc>
+        <w:tc>
+          <w:tcPr>
+            <w:tcW w:type="dxa" w:w="936"/>
+          </w:tcPr>
+          <w:p>
+            <w:pPr>
+              <w:pStyle w:val="Compact"/>
+              <w:spacing w:before="40" w:after="40"/>
+            </w:pPr>
+          </w:p>
+        </w:tc>
+        <w:tc>
+          <w:tcPr>
+            <w:tcW w:type="dxa" w:w="936"/>
+          </w:tcPr>
+          <w:p>
+            <w:pPr>
+              <w:pStyle w:val="Compact"/>
+              <w:spacing w:before="40" w:after="40"/>
+            </w:pPr>
+          </w:p>
+        </w:tc>
+        <w:tc>
+          <w:tcPr>
+            <w:tcW w:type="dxa" w:w="936"/>
+          </w:tcPr>
+          <w:p>
+            <w:pPr>
+              <w:pStyle w:val="Compact"/>
+              <w:spacing w:before="40" w:after="40"/>
+            </w:pPr>
+          </w:p>
+        </w:tc>
+        <w:tc>
+          <w:tcPr>
+            <w:tcW w:type="dxa" w:w="-902"/>
+          </w:tcPr>
+          <w:p>
+            <w:pPr>
+              <w:pStyle w:val="Compact"/>
+              <w:spacing w:before="40" w:after="40"/>
+            </w:pPr>
           </w:p>
         </w:tc>
       </w:tr>
       <w:tr>
         <w:tc>
           <w:tcPr>
-            <w:tcW w:type="dxa" w:w="4409"/>
+            <w:tcW w:type="dxa" w:w="-952"/>
           </w:tcPr>
           <w:p>
             <w:pPr>
@@ -1054,7 +2813,26 @@
         </w:tc>
         <w:tc>
           <w:tcPr>
-            <w:tcW w:type="dxa" w:w="3094"/>
+            <w:tcW w:type="dxa" w:w="-952"/>
+          </w:tcPr>
+          <w:p>
+            <w:pPr>
+              <w:pStyle w:val="Compact"/>
+              <w:spacing w:before="40" w:after="40"/>
+              <w:jc w:val="left"/>
+            </w:pPr>
+            <w:r>
+              <w:rPr>
+                <w:rFonts w:ascii="Arial" w:hAnsi="Arial"/>
+                <w:sz w:val="20"/>
+              </w:rPr>
+              <w:t xml:space="preserve">NS-LIC-MEMKV</w:t>
+            </w:r>
+          </w:p>
+        </w:tc>
+        <w:tc>
+          <w:tcPr>
+            <w:tcW w:type="dxa" w:w="936"/>
           </w:tcPr>
           <w:p>
             <w:pPr>
@@ -1073,21 +2851,145 @@
         </w:tc>
         <w:tc>
           <w:tcPr>
-            <w:tcW w:type="dxa" w:w="1856"/>
-          </w:tcPr>
-          <w:p>
-            <w:pPr>
-              <w:pStyle w:val="Compact"/>
-              <w:spacing w:before="40" w:after="40"/>
-              <w:jc w:val="left"/>
-            </w:pPr>
-            <w:r>
-              <w:rPr>
-                <w:rFonts w:ascii="Arial" w:hAnsi="Arial"/>
-                <w:sz w:val="20"/>
-              </w:rPr>
-              <w:t xml:space="preserve">License</w:t>
-            </w:r>
+            <w:tcW w:type="dxa" w:w="936"/>
+          </w:tcPr>
+          <w:p>
+            <w:pPr>
+              <w:pStyle w:val="Compact"/>
+              <w:spacing w:before="40" w:after="40"/>
+            </w:pPr>
+          </w:p>
+        </w:tc>
+        <w:tc>
+          <w:tcPr>
+            <w:tcW w:type="dxa" w:w="936"/>
+          </w:tcPr>
+          <w:p>
+            <w:pPr>
+              <w:pStyle w:val="Compact"/>
+              <w:spacing w:before="40" w:after="40"/>
+            </w:pPr>
+          </w:p>
+        </w:tc>
+        <w:tc>
+          <w:tcPr>
+            <w:tcW w:type="dxa" w:w="936"/>
+          </w:tcPr>
+          <w:p>
+            <w:pPr>
+              <w:pStyle w:val="Compact"/>
+              <w:spacing w:before="40" w:after="40"/>
+            </w:pPr>
+          </w:p>
+        </w:tc>
+        <w:tc>
+          <w:tcPr>
+            <w:tcW w:type="dxa" w:w="936"/>
+          </w:tcPr>
+          <w:p>
+            <w:pPr>
+              <w:pStyle w:val="Compact"/>
+              <w:spacing w:before="40" w:after="40"/>
+            </w:pPr>
+          </w:p>
+        </w:tc>
+        <w:tc>
+          <w:tcPr>
+            <w:tcW w:type="dxa" w:w="936"/>
+          </w:tcPr>
+          <w:p>
+            <w:pPr>
+              <w:pStyle w:val="Compact"/>
+              <w:spacing w:before="40" w:after="40"/>
+            </w:pPr>
+          </w:p>
+        </w:tc>
+        <w:tc>
+          <w:tcPr>
+            <w:tcW w:type="dxa" w:w="936"/>
+          </w:tcPr>
+          <w:p>
+            <w:pPr>
+              <w:pStyle w:val="Compact"/>
+              <w:spacing w:before="40" w:after="40"/>
+            </w:pPr>
+          </w:p>
+        </w:tc>
+        <w:tc>
+          <w:tcPr>
+            <w:tcW w:type="dxa" w:w="936"/>
+          </w:tcPr>
+          <w:p>
+            <w:pPr>
+              <w:pStyle w:val="Compact"/>
+              <w:spacing w:before="40" w:after="40"/>
+            </w:pPr>
+          </w:p>
+        </w:tc>
+        <w:tc>
+          <w:tcPr>
+            <w:tcW w:type="dxa" w:w="936"/>
+          </w:tcPr>
+          <w:p>
+            <w:pPr>
+              <w:pStyle w:val="Compact"/>
+              <w:spacing w:before="40" w:after="40"/>
+            </w:pPr>
+          </w:p>
+        </w:tc>
+        <w:tc>
+          <w:tcPr>
+            <w:tcW w:type="dxa" w:w="936"/>
+          </w:tcPr>
+          <w:p>
+            <w:pPr>
+              <w:pStyle w:val="Compact"/>
+              <w:spacing w:before="40" w:after="40"/>
+            </w:pPr>
+          </w:p>
+        </w:tc>
+        <w:tc>
+          <w:tcPr>
+            <w:tcW w:type="dxa" w:w="936"/>
+          </w:tcPr>
+          <w:p>
+            <w:pPr>
+              <w:pStyle w:val="Compact"/>
+              <w:spacing w:before="40" w:after="40"/>
+            </w:pPr>
+          </w:p>
+        </w:tc>
+        <w:tc>
+          <w:tcPr>
+            <w:tcW w:type="dxa" w:w="936"/>
+          </w:tcPr>
+          <w:p>
+            <w:pPr>
+              <w:pStyle w:val="Compact"/>
+              <w:spacing w:before="40" w:after="40"/>
+            </w:pPr>
+          </w:p>
+        </w:tc>
+        <w:tc>
+          <w:tcPr>
+            <w:tcW w:type="dxa" w:w="936"/>
+          </w:tcPr>
+          <w:p>
+            <w:pPr>
+              <w:pStyle w:val="Compact"/>
+              <w:spacing w:before="40" w:after="40"/>
+            </w:pPr>
+          </w:p>
+        </w:tc>
+        <w:tc>
+          <w:tcPr>
+            <w:tcW w:type="dxa" w:w="-902"/>
+          </w:tcPr>
+          <w:p>
+            <w:pPr>
+              <w:pStyle w:val="Compact"/>
+              <w:spacing w:before="40" w:after="40"/>
+            </w:pPr>
           </w:p>
         </w:tc>
       </w:tr>

</xml_diff>

<commit_message>
Non-inventory items: fill class, subsidiary, include children; add reference values
Co-Authored-By: Claude Opus 5.5 <noreply@anthropic.com>
Claude-Session: https://claude.ai/code/session_01RcSpRnw5TDsnk5GdoeWT9P
</commit_message>
<xml_diff>
--- a/netsuite/dataload/noninventory-items/output/noninventory-items.docx
+++ b/netsuite/dataload/noninventory-items/output/noninventory-items.docx
@@ -215,7 +215,7 @@
                 <w:rFonts w:ascii="Arial" w:hAnsi="Arial"/>
                 <w:sz w:val="20"/>
               </w:rPr>
-              <w:t xml:space="preserve">External ID, Item Name, Display Name/Code</w:t>
+              <w:t xml:space="preserve">External ID, Item Name, Display Name/Code, Class, Subsidiary, Include Children</w:t>
             </w:r>
           </w:p>
         </w:tc>
@@ -258,7 +258,7 @@
                 <w:rFonts w:ascii="Arial" w:hAnsi="Arial"/>
                 <w:sz w:val="20"/>
               </w:rPr>
-              <w:t xml:space="preserve">13 columns. Most are set per item group, under Values by group</w:t>
+              <w:t xml:space="preserve">10 columns. Most are set per item group, under Values by group</w:t>
             </w:r>
           </w:p>
         </w:tc>
@@ -339,7 +339,7 @@
         <w:pStyle w:val="BodyText"/>
       </w:pPr>
       <w:r>
-        <w:t xml:space="preserve">External ID and Item Name both use the item ID. [TBC: confirm Item Name format]</w:t>
+        <w:t xml:space="preserve">External ID and Item Name both use the item ID. Item Name is the code; Display Name/Code is the name sales and customers read.</w:t>
       </w:r>
     </w:p>
     <w:tbl>
@@ -828,29 +828,53 @@
             <w:pPr>
               <w:pStyle w:val="Compact"/>
               <w:spacing w:before="40" w:after="40"/>
-            </w:pPr>
-          </w:p>
-        </w:tc>
-        <w:tc>
-          <w:tcPr>
-            <w:tcW w:type="dxa" w:w="936"/>
-          </w:tcPr>
-          <w:p>
-            <w:pPr>
-              <w:pStyle w:val="Compact"/>
-              <w:spacing w:before="40" w:after="40"/>
-            </w:pPr>
-          </w:p>
-        </w:tc>
-        <w:tc>
-          <w:tcPr>
-            <w:tcW w:type="dxa" w:w="936"/>
-          </w:tcPr>
-          <w:p>
-            <w:pPr>
-              <w:pStyle w:val="Compact"/>
-              <w:spacing w:before="40" w:after="40"/>
-            </w:pPr>
+              <w:jc w:val="left"/>
+            </w:pPr>
+            <w:r>
+              <w:rPr>
+                <w:rFonts w:ascii="Arial" w:hAnsi="Arial"/>
+                <w:sz w:val="20"/>
+              </w:rPr>
+              <w:t xml:space="preserve">Support</w:t>
+            </w:r>
+          </w:p>
+        </w:tc>
+        <w:tc>
+          <w:tcPr>
+            <w:tcW w:type="dxa" w:w="936"/>
+          </w:tcPr>
+          <w:p>
+            <w:pPr>
+              <w:pStyle w:val="Compact"/>
+              <w:spacing w:before="40" w:after="40"/>
+              <w:jc w:val="left"/>
+            </w:pPr>
+            <w:r>
+              <w:rPr>
+                <w:rFonts w:ascii="Arial" w:hAnsi="Arial"/>
+                <w:sz w:val="20"/>
+              </w:rPr>
+              <w:t xml:space="preserve">MinIO, Inc.</w:t>
+            </w:r>
+          </w:p>
+        </w:tc>
+        <w:tc>
+          <w:tcPr>
+            <w:tcW w:type="dxa" w:w="936"/>
+          </w:tcPr>
+          <w:p>
+            <w:pPr>
+              <w:pStyle w:val="Compact"/>
+              <w:spacing w:before="40" w:after="40"/>
+              <w:jc w:val="left"/>
+            </w:pPr>
+            <w:r>
+              <w:rPr>
+                <w:rFonts w:ascii="Arial" w:hAnsi="Arial"/>
+                <w:sz w:val="20"/>
+              </w:rPr>
+              <w:t xml:space="preserve">Yes</w:t>
+            </w:r>
           </w:p>
         </w:tc>
         <w:tc>
@@ -1032,29 +1056,53 @@
             <w:pPr>
               <w:pStyle w:val="Compact"/>
               <w:spacing w:before="40" w:after="40"/>
-            </w:pPr>
-          </w:p>
-        </w:tc>
-        <w:tc>
-          <w:tcPr>
-            <w:tcW w:type="dxa" w:w="936"/>
-          </w:tcPr>
-          <w:p>
-            <w:pPr>
-              <w:pStyle w:val="Compact"/>
-              <w:spacing w:before="40" w:after="40"/>
-            </w:pPr>
-          </w:p>
-        </w:tc>
-        <w:tc>
-          <w:tcPr>
-            <w:tcW w:type="dxa" w:w="936"/>
-          </w:tcPr>
-          <w:p>
-            <w:pPr>
-              <w:pStyle w:val="Compact"/>
-              <w:spacing w:before="40" w:after="40"/>
-            </w:pPr>
+              <w:jc w:val="left"/>
+            </w:pPr>
+            <w:r>
+              <w:rPr>
+                <w:rFonts w:ascii="Arial" w:hAnsi="Arial"/>
+                <w:sz w:val="20"/>
+              </w:rPr>
+              <w:t xml:space="preserve">Support</w:t>
+            </w:r>
+          </w:p>
+        </w:tc>
+        <w:tc>
+          <w:tcPr>
+            <w:tcW w:type="dxa" w:w="936"/>
+          </w:tcPr>
+          <w:p>
+            <w:pPr>
+              <w:pStyle w:val="Compact"/>
+              <w:spacing w:before="40" w:after="40"/>
+              <w:jc w:val="left"/>
+            </w:pPr>
+            <w:r>
+              <w:rPr>
+                <w:rFonts w:ascii="Arial" w:hAnsi="Arial"/>
+                <w:sz w:val="20"/>
+              </w:rPr>
+              <w:t xml:space="preserve">MinIO, Inc.</w:t>
+            </w:r>
+          </w:p>
+        </w:tc>
+        <w:tc>
+          <w:tcPr>
+            <w:tcW w:type="dxa" w:w="936"/>
+          </w:tcPr>
+          <w:p>
+            <w:pPr>
+              <w:pStyle w:val="Compact"/>
+              <w:spacing w:before="40" w:after="40"/>
+              <w:jc w:val="left"/>
+            </w:pPr>
+            <w:r>
+              <w:rPr>
+                <w:rFonts w:ascii="Arial" w:hAnsi="Arial"/>
+                <w:sz w:val="20"/>
+              </w:rPr>
+              <w:t xml:space="preserve">Yes</w:t>
+            </w:r>
           </w:p>
         </w:tc>
         <w:tc>
@@ -1236,29 +1284,53 @@
             <w:pPr>
               <w:pStyle w:val="Compact"/>
               <w:spacing w:before="40" w:after="40"/>
-            </w:pPr>
-          </w:p>
-        </w:tc>
-        <w:tc>
-          <w:tcPr>
-            <w:tcW w:type="dxa" w:w="936"/>
-          </w:tcPr>
-          <w:p>
-            <w:pPr>
-              <w:pStyle w:val="Compact"/>
-              <w:spacing w:before="40" w:after="40"/>
-            </w:pPr>
-          </w:p>
-        </w:tc>
-        <w:tc>
-          <w:tcPr>
-            <w:tcW w:type="dxa" w:w="936"/>
-          </w:tcPr>
-          <w:p>
-            <w:pPr>
-              <w:pStyle w:val="Compact"/>
-              <w:spacing w:before="40" w:after="40"/>
-            </w:pPr>
+              <w:jc w:val="left"/>
+            </w:pPr>
+            <w:r>
+              <w:rPr>
+                <w:rFonts w:ascii="Arial" w:hAnsi="Arial"/>
+                <w:sz w:val="20"/>
+              </w:rPr>
+              <w:t xml:space="preserve">Support</w:t>
+            </w:r>
+          </w:p>
+        </w:tc>
+        <w:tc>
+          <w:tcPr>
+            <w:tcW w:type="dxa" w:w="936"/>
+          </w:tcPr>
+          <w:p>
+            <w:pPr>
+              <w:pStyle w:val="Compact"/>
+              <w:spacing w:before="40" w:after="40"/>
+              <w:jc w:val="left"/>
+            </w:pPr>
+            <w:r>
+              <w:rPr>
+                <w:rFonts w:ascii="Arial" w:hAnsi="Arial"/>
+                <w:sz w:val="20"/>
+              </w:rPr>
+              <w:t xml:space="preserve">MinIO, Inc.</w:t>
+            </w:r>
+          </w:p>
+        </w:tc>
+        <w:tc>
+          <w:tcPr>
+            <w:tcW w:type="dxa" w:w="936"/>
+          </w:tcPr>
+          <w:p>
+            <w:pPr>
+              <w:pStyle w:val="Compact"/>
+              <w:spacing w:before="40" w:after="40"/>
+              <w:jc w:val="left"/>
+            </w:pPr>
+            <w:r>
+              <w:rPr>
+                <w:rFonts w:ascii="Arial" w:hAnsi="Arial"/>
+                <w:sz w:val="20"/>
+              </w:rPr>
+              <w:t xml:space="preserve">Yes</w:t>
+            </w:r>
           </w:p>
         </w:tc>
         <w:tc>
@@ -1440,29 +1512,53 @@
             <w:pPr>
               <w:pStyle w:val="Compact"/>
               <w:spacing w:before="40" w:after="40"/>
-            </w:pPr>
-          </w:p>
-        </w:tc>
-        <w:tc>
-          <w:tcPr>
-            <w:tcW w:type="dxa" w:w="936"/>
-          </w:tcPr>
-          <w:p>
-            <w:pPr>
-              <w:pStyle w:val="Compact"/>
-              <w:spacing w:before="40" w:after="40"/>
-            </w:pPr>
-          </w:p>
-        </w:tc>
-        <w:tc>
-          <w:tcPr>
-            <w:tcW w:type="dxa" w:w="936"/>
-          </w:tcPr>
-          <w:p>
-            <w:pPr>
-              <w:pStyle w:val="Compact"/>
-              <w:spacing w:before="40" w:after="40"/>
-            </w:pPr>
+              <w:jc w:val="left"/>
+            </w:pPr>
+            <w:r>
+              <w:rPr>
+                <w:rFonts w:ascii="Arial" w:hAnsi="Arial"/>
+                <w:sz w:val="20"/>
+              </w:rPr>
+              <w:t xml:space="preserve">Support</w:t>
+            </w:r>
+          </w:p>
+        </w:tc>
+        <w:tc>
+          <w:tcPr>
+            <w:tcW w:type="dxa" w:w="936"/>
+          </w:tcPr>
+          <w:p>
+            <w:pPr>
+              <w:pStyle w:val="Compact"/>
+              <w:spacing w:before="40" w:after="40"/>
+              <w:jc w:val="left"/>
+            </w:pPr>
+            <w:r>
+              <w:rPr>
+                <w:rFonts w:ascii="Arial" w:hAnsi="Arial"/>
+                <w:sz w:val="20"/>
+              </w:rPr>
+              <w:t xml:space="preserve">MinIO, Inc.</w:t>
+            </w:r>
+          </w:p>
+        </w:tc>
+        <w:tc>
+          <w:tcPr>
+            <w:tcW w:type="dxa" w:w="936"/>
+          </w:tcPr>
+          <w:p>
+            <w:pPr>
+              <w:pStyle w:val="Compact"/>
+              <w:spacing w:before="40" w:after="40"/>
+              <w:jc w:val="left"/>
+            </w:pPr>
+            <w:r>
+              <w:rPr>
+                <w:rFonts w:ascii="Arial" w:hAnsi="Arial"/>
+                <w:sz w:val="20"/>
+              </w:rPr>
+              <w:t xml:space="preserve">Yes</w:t>
+            </w:r>
           </w:p>
         </w:tc>
         <w:tc>
@@ -1644,29 +1740,53 @@
             <w:pPr>
               <w:pStyle w:val="Compact"/>
               <w:spacing w:before="40" w:after="40"/>
-            </w:pPr>
-          </w:p>
-        </w:tc>
-        <w:tc>
-          <w:tcPr>
-            <w:tcW w:type="dxa" w:w="936"/>
-          </w:tcPr>
-          <w:p>
-            <w:pPr>
-              <w:pStyle w:val="Compact"/>
-              <w:spacing w:before="40" w:after="40"/>
-            </w:pPr>
-          </w:p>
-        </w:tc>
-        <w:tc>
-          <w:tcPr>
-            <w:tcW w:type="dxa" w:w="936"/>
-          </w:tcPr>
-          <w:p>
-            <w:pPr>
-              <w:pStyle w:val="Compact"/>
-              <w:spacing w:before="40" w:after="40"/>
-            </w:pPr>
+              <w:jc w:val="left"/>
+            </w:pPr>
+            <w:r>
+              <w:rPr>
+                <w:rFonts w:ascii="Arial" w:hAnsi="Arial"/>
+                <w:sz w:val="20"/>
+              </w:rPr>
+              <w:t xml:space="preserve">Support</w:t>
+            </w:r>
+          </w:p>
+        </w:tc>
+        <w:tc>
+          <w:tcPr>
+            <w:tcW w:type="dxa" w:w="936"/>
+          </w:tcPr>
+          <w:p>
+            <w:pPr>
+              <w:pStyle w:val="Compact"/>
+              <w:spacing w:before="40" w:after="40"/>
+              <w:jc w:val="left"/>
+            </w:pPr>
+            <w:r>
+              <w:rPr>
+                <w:rFonts w:ascii="Arial" w:hAnsi="Arial"/>
+                <w:sz w:val="20"/>
+              </w:rPr>
+              <w:t xml:space="preserve">MinIO, Inc.</w:t>
+            </w:r>
+          </w:p>
+        </w:tc>
+        <w:tc>
+          <w:tcPr>
+            <w:tcW w:type="dxa" w:w="936"/>
+          </w:tcPr>
+          <w:p>
+            <w:pPr>
+              <w:pStyle w:val="Compact"/>
+              <w:spacing w:before="40" w:after="40"/>
+              <w:jc w:val="left"/>
+            </w:pPr>
+            <w:r>
+              <w:rPr>
+                <w:rFonts w:ascii="Arial" w:hAnsi="Arial"/>
+                <w:sz w:val="20"/>
+              </w:rPr>
+              <w:t xml:space="preserve">Yes</w:t>
+            </w:r>
           </w:p>
         </w:tc>
         <w:tc>
@@ -1848,29 +1968,53 @@
             <w:pPr>
               <w:pStyle w:val="Compact"/>
               <w:spacing w:before="40" w:after="40"/>
-            </w:pPr>
-          </w:p>
-        </w:tc>
-        <w:tc>
-          <w:tcPr>
-            <w:tcW w:type="dxa" w:w="936"/>
-          </w:tcPr>
-          <w:p>
-            <w:pPr>
-              <w:pStyle w:val="Compact"/>
-              <w:spacing w:before="40" w:after="40"/>
-            </w:pPr>
-          </w:p>
-        </w:tc>
-        <w:tc>
-          <w:tcPr>
-            <w:tcW w:type="dxa" w:w="936"/>
-          </w:tcPr>
-          <w:p>
-            <w:pPr>
-              <w:pStyle w:val="Compact"/>
-              <w:spacing w:before="40" w:after="40"/>
-            </w:pPr>
+              <w:jc w:val="left"/>
+            </w:pPr>
+            <w:r>
+              <w:rPr>
+                <w:rFonts w:ascii="Arial" w:hAnsi="Arial"/>
+                <w:sz w:val="20"/>
+              </w:rPr>
+              <w:t xml:space="preserve">Training</w:t>
+            </w:r>
+          </w:p>
+        </w:tc>
+        <w:tc>
+          <w:tcPr>
+            <w:tcW w:type="dxa" w:w="936"/>
+          </w:tcPr>
+          <w:p>
+            <w:pPr>
+              <w:pStyle w:val="Compact"/>
+              <w:spacing w:before="40" w:after="40"/>
+              <w:jc w:val="left"/>
+            </w:pPr>
+            <w:r>
+              <w:rPr>
+                <w:rFonts w:ascii="Arial" w:hAnsi="Arial"/>
+                <w:sz w:val="20"/>
+              </w:rPr>
+              <w:t xml:space="preserve">MinIO, Inc.</w:t>
+            </w:r>
+          </w:p>
+        </w:tc>
+        <w:tc>
+          <w:tcPr>
+            <w:tcW w:type="dxa" w:w="936"/>
+          </w:tcPr>
+          <w:p>
+            <w:pPr>
+              <w:pStyle w:val="Compact"/>
+              <w:spacing w:before="40" w:after="40"/>
+              <w:jc w:val="left"/>
+            </w:pPr>
+            <w:r>
+              <w:rPr>
+                <w:rFonts w:ascii="Arial" w:hAnsi="Arial"/>
+                <w:sz w:val="20"/>
+              </w:rPr>
+              <w:t xml:space="preserve">Yes</w:t>
+            </w:r>
           </w:p>
         </w:tc>
         <w:tc>
@@ -2052,29 +2196,53 @@
             <w:pPr>
               <w:pStyle w:val="Compact"/>
               <w:spacing w:before="40" w:after="40"/>
-            </w:pPr>
-          </w:p>
-        </w:tc>
-        <w:tc>
-          <w:tcPr>
-            <w:tcW w:type="dxa" w:w="936"/>
-          </w:tcPr>
-          <w:p>
-            <w:pPr>
-              <w:pStyle w:val="Compact"/>
-              <w:spacing w:before="40" w:after="40"/>
-            </w:pPr>
-          </w:p>
-        </w:tc>
-        <w:tc>
-          <w:tcPr>
-            <w:tcW w:type="dxa" w:w="936"/>
-          </w:tcPr>
-          <w:p>
-            <w:pPr>
-              <w:pStyle w:val="Compact"/>
-              <w:spacing w:before="40" w:after="40"/>
-            </w:pPr>
+              <w:jc w:val="left"/>
+            </w:pPr>
+            <w:r>
+              <w:rPr>
+                <w:rFonts w:ascii="Arial" w:hAnsi="Arial"/>
+                <w:sz w:val="20"/>
+              </w:rPr>
+              <w:t xml:space="preserve">Training</w:t>
+            </w:r>
+          </w:p>
+        </w:tc>
+        <w:tc>
+          <w:tcPr>
+            <w:tcW w:type="dxa" w:w="936"/>
+          </w:tcPr>
+          <w:p>
+            <w:pPr>
+              <w:pStyle w:val="Compact"/>
+              <w:spacing w:before="40" w:after="40"/>
+              <w:jc w:val="left"/>
+            </w:pPr>
+            <w:r>
+              <w:rPr>
+                <w:rFonts w:ascii="Arial" w:hAnsi="Arial"/>
+                <w:sz w:val="20"/>
+              </w:rPr>
+              <w:t xml:space="preserve">MinIO, Inc.</w:t>
+            </w:r>
+          </w:p>
+        </w:tc>
+        <w:tc>
+          <w:tcPr>
+            <w:tcW w:type="dxa" w:w="936"/>
+          </w:tcPr>
+          <w:p>
+            <w:pPr>
+              <w:pStyle w:val="Compact"/>
+              <w:spacing w:before="40" w:after="40"/>
+              <w:jc w:val="left"/>
+            </w:pPr>
+            <w:r>
+              <w:rPr>
+                <w:rFonts w:ascii="Arial" w:hAnsi="Arial"/>
+                <w:sz w:val="20"/>
+              </w:rPr>
+              <w:t xml:space="preserve">Yes</w:t>
+            </w:r>
           </w:p>
         </w:tc>
         <w:tc>
@@ -2256,29 +2424,53 @@
             <w:pPr>
               <w:pStyle w:val="Compact"/>
               <w:spacing w:before="40" w:after="40"/>
-            </w:pPr>
-          </w:p>
-        </w:tc>
-        <w:tc>
-          <w:tcPr>
-            <w:tcW w:type="dxa" w:w="936"/>
-          </w:tcPr>
-          <w:p>
-            <w:pPr>
-              <w:pStyle w:val="Compact"/>
-              <w:spacing w:before="40" w:after="40"/>
-            </w:pPr>
-          </w:p>
-        </w:tc>
-        <w:tc>
-          <w:tcPr>
-            <w:tcW w:type="dxa" w:w="936"/>
-          </w:tcPr>
-          <w:p>
-            <w:pPr>
-              <w:pStyle w:val="Compact"/>
-              <w:spacing w:before="40" w:after="40"/>
-            </w:pPr>
+              <w:jc w:val="left"/>
+            </w:pPr>
+            <w:r>
+              <w:rPr>
+                <w:rFonts w:ascii="Arial" w:hAnsi="Arial"/>
+                <w:sz w:val="20"/>
+              </w:rPr>
+              <w:t xml:space="preserve">Training</w:t>
+            </w:r>
+          </w:p>
+        </w:tc>
+        <w:tc>
+          <w:tcPr>
+            <w:tcW w:type="dxa" w:w="936"/>
+          </w:tcPr>
+          <w:p>
+            <w:pPr>
+              <w:pStyle w:val="Compact"/>
+              <w:spacing w:before="40" w:after="40"/>
+              <w:jc w:val="left"/>
+            </w:pPr>
+            <w:r>
+              <w:rPr>
+                <w:rFonts w:ascii="Arial" w:hAnsi="Arial"/>
+                <w:sz w:val="20"/>
+              </w:rPr>
+              <w:t xml:space="preserve">MinIO, Inc.</w:t>
+            </w:r>
+          </w:p>
+        </w:tc>
+        <w:tc>
+          <w:tcPr>
+            <w:tcW w:type="dxa" w:w="936"/>
+          </w:tcPr>
+          <w:p>
+            <w:pPr>
+              <w:pStyle w:val="Compact"/>
+              <w:spacing w:before="40" w:after="40"/>
+              <w:jc w:val="left"/>
+            </w:pPr>
+            <w:r>
+              <w:rPr>
+                <w:rFonts w:ascii="Arial" w:hAnsi="Arial"/>
+                <w:sz w:val="20"/>
+              </w:rPr>
+              <w:t xml:space="preserve">Yes</w:t>
+            </w:r>
           </w:p>
         </w:tc>
         <w:tc>
@@ -2460,29 +2652,53 @@
             <w:pPr>
               <w:pStyle w:val="Compact"/>
               <w:spacing w:before="40" w:after="40"/>
-            </w:pPr>
-          </w:p>
-        </w:tc>
-        <w:tc>
-          <w:tcPr>
-            <w:tcW w:type="dxa" w:w="936"/>
-          </w:tcPr>
-          <w:p>
-            <w:pPr>
-              <w:pStyle w:val="Compact"/>
-              <w:spacing w:before="40" w:after="40"/>
-            </w:pPr>
-          </w:p>
-        </w:tc>
-        <w:tc>
-          <w:tcPr>
-            <w:tcW w:type="dxa" w:w="936"/>
-          </w:tcPr>
-          <w:p>
-            <w:pPr>
-              <w:pStyle w:val="Compact"/>
-              <w:spacing w:before="40" w:after="40"/>
-            </w:pPr>
+              <w:jc w:val="left"/>
+            </w:pPr>
+            <w:r>
+              <w:rPr>
+                <w:rFonts w:ascii="Arial" w:hAnsi="Arial"/>
+                <w:sz w:val="20"/>
+              </w:rPr>
+              <w:t xml:space="preserve">License</w:t>
+            </w:r>
+          </w:p>
+        </w:tc>
+        <w:tc>
+          <w:tcPr>
+            <w:tcW w:type="dxa" w:w="936"/>
+          </w:tcPr>
+          <w:p>
+            <w:pPr>
+              <w:pStyle w:val="Compact"/>
+              <w:spacing w:before="40" w:after="40"/>
+              <w:jc w:val="left"/>
+            </w:pPr>
+            <w:r>
+              <w:rPr>
+                <w:rFonts w:ascii="Arial" w:hAnsi="Arial"/>
+                <w:sz w:val="20"/>
+              </w:rPr>
+              <w:t xml:space="preserve">MinIO, Inc.</w:t>
+            </w:r>
+          </w:p>
+        </w:tc>
+        <w:tc>
+          <w:tcPr>
+            <w:tcW w:type="dxa" w:w="936"/>
+          </w:tcPr>
+          <w:p>
+            <w:pPr>
+              <w:pStyle w:val="Compact"/>
+              <w:spacing w:before="40" w:after="40"/>
+              <w:jc w:val="left"/>
+            </w:pPr>
+            <w:r>
+              <w:rPr>
+                <w:rFonts w:ascii="Arial" w:hAnsi="Arial"/>
+                <w:sz w:val="20"/>
+              </w:rPr>
+              <w:t xml:space="preserve">Yes</w:t>
+            </w:r>
           </w:p>
         </w:tc>
         <w:tc>
@@ -2664,29 +2880,53 @@
             <w:pPr>
               <w:pStyle w:val="Compact"/>
               <w:spacing w:before="40" w:after="40"/>
-            </w:pPr>
-          </w:p>
-        </w:tc>
-        <w:tc>
-          <w:tcPr>
-            <w:tcW w:type="dxa" w:w="936"/>
-          </w:tcPr>
-          <w:p>
-            <w:pPr>
-              <w:pStyle w:val="Compact"/>
-              <w:spacing w:before="40" w:after="40"/>
-            </w:pPr>
-          </w:p>
-        </w:tc>
-        <w:tc>
-          <w:tcPr>
-            <w:tcW w:type="dxa" w:w="936"/>
-          </w:tcPr>
-          <w:p>
-            <w:pPr>
-              <w:pStyle w:val="Compact"/>
-              <w:spacing w:before="40" w:after="40"/>
-            </w:pPr>
+              <w:jc w:val="left"/>
+            </w:pPr>
+            <w:r>
+              <w:rPr>
+                <w:rFonts w:ascii="Arial" w:hAnsi="Arial"/>
+                <w:sz w:val="20"/>
+              </w:rPr>
+              <w:t xml:space="preserve">License</w:t>
+            </w:r>
+          </w:p>
+        </w:tc>
+        <w:tc>
+          <w:tcPr>
+            <w:tcW w:type="dxa" w:w="936"/>
+          </w:tcPr>
+          <w:p>
+            <w:pPr>
+              <w:pStyle w:val="Compact"/>
+              <w:spacing w:before="40" w:after="40"/>
+              <w:jc w:val="left"/>
+            </w:pPr>
+            <w:r>
+              <w:rPr>
+                <w:rFonts w:ascii="Arial" w:hAnsi="Arial"/>
+                <w:sz w:val="20"/>
+              </w:rPr>
+              <w:t xml:space="preserve">MinIO, Inc.</w:t>
+            </w:r>
+          </w:p>
+        </w:tc>
+        <w:tc>
+          <w:tcPr>
+            <w:tcW w:type="dxa" w:w="936"/>
+          </w:tcPr>
+          <w:p>
+            <w:pPr>
+              <w:pStyle w:val="Compact"/>
+              <w:spacing w:before="40" w:after="40"/>
+              <w:jc w:val="left"/>
+            </w:pPr>
+            <w:r>
+              <w:rPr>
+                <w:rFonts w:ascii="Arial" w:hAnsi="Arial"/>
+                <w:sz w:val="20"/>
+              </w:rPr>
+              <w:t xml:space="preserve">Yes</w:t>
+            </w:r>
           </w:p>
         </w:tc>
         <w:tc>
@@ -2868,29 +3108,53 @@
             <w:pPr>
               <w:pStyle w:val="Compact"/>
               <w:spacing w:before="40" w:after="40"/>
-            </w:pPr>
-          </w:p>
-        </w:tc>
-        <w:tc>
-          <w:tcPr>
-            <w:tcW w:type="dxa" w:w="936"/>
-          </w:tcPr>
-          <w:p>
-            <w:pPr>
-              <w:pStyle w:val="Compact"/>
-              <w:spacing w:before="40" w:after="40"/>
-            </w:pPr>
-          </w:p>
-        </w:tc>
-        <w:tc>
-          <w:tcPr>
-            <w:tcW w:type="dxa" w:w="936"/>
-          </w:tcPr>
-          <w:p>
-            <w:pPr>
-              <w:pStyle w:val="Compact"/>
-              <w:spacing w:before="40" w:after="40"/>
-            </w:pPr>
+              <w:jc w:val="left"/>
+            </w:pPr>
+            <w:r>
+              <w:rPr>
+                <w:rFonts w:ascii="Arial" w:hAnsi="Arial"/>
+                <w:sz w:val="20"/>
+              </w:rPr>
+              <w:t xml:space="preserve">License</w:t>
+            </w:r>
+          </w:p>
+        </w:tc>
+        <w:tc>
+          <w:tcPr>
+            <w:tcW w:type="dxa" w:w="936"/>
+          </w:tcPr>
+          <w:p>
+            <w:pPr>
+              <w:pStyle w:val="Compact"/>
+              <w:spacing w:before="40" w:after="40"/>
+              <w:jc w:val="left"/>
+            </w:pPr>
+            <w:r>
+              <w:rPr>
+                <w:rFonts w:ascii="Arial" w:hAnsi="Arial"/>
+                <w:sz w:val="20"/>
+              </w:rPr>
+              <w:t xml:space="preserve">MinIO, Inc.</w:t>
+            </w:r>
+          </w:p>
+        </w:tc>
+        <w:tc>
+          <w:tcPr>
+            <w:tcW w:type="dxa" w:w="936"/>
+          </w:tcPr>
+          <w:p>
+            <w:pPr>
+              <w:pStyle w:val="Compact"/>
+              <w:spacing w:before="40" w:after="40"/>
+              <w:jc w:val="left"/>
+            </w:pPr>
+            <w:r>
+              <w:rPr>
+                <w:rFonts w:ascii="Arial" w:hAnsi="Arial"/>
+                <w:sz w:val="20"/>
+              </w:rPr>
+              <w:t xml:space="preserve">Yes</w:t>
+            </w:r>
           </w:p>
         </w:tc>
         <w:tc>
@@ -3248,7 +3512,7 @@
                 <w:rFonts w:ascii="Arial" w:hAnsi="Arial"/>
                 <w:sz w:val="20"/>
               </w:rPr>
-              <w:t xml:space="preserve">[TBC]</w:t>
+              <w:t xml:space="preserve">Support</w:t>
             </w:r>
           </w:p>
         </w:tc>
@@ -3267,7 +3531,7 @@
                 <w:rFonts w:ascii="Arial" w:hAnsi="Arial"/>
                 <w:sz w:val="20"/>
               </w:rPr>
-              <w:t xml:space="preserve">[TBC]</w:t>
+              <w:t xml:space="preserve">Training</w:t>
             </w:r>
           </w:p>
         </w:tc>
@@ -3286,7 +3550,7 @@
                 <w:rFonts w:ascii="Arial" w:hAnsi="Arial"/>
                 <w:sz w:val="20"/>
               </w:rPr>
-              <w:t xml:space="preserve">[TBC]</w:t>
+              <w:t xml:space="preserve">License</w:t>
             </w:r>
           </w:p>
         </w:tc>
@@ -3688,7 +3952,7 @@
                 <w:rFonts w:ascii="Arial" w:hAnsi="Arial"/>
                 <w:sz w:val="20"/>
               </w:rPr>
-              <w:t xml:space="preserve">[TBC: which MinIO entity sells these items]</w:t>
+              <w:t xml:space="preserve">MinIO, Inc. [TBC: confirm it is the parent of MinIO Pvt. Ltd. and MinIO Singapore Pte. Ltd.]</w:t>
             </w:r>
           </w:p>
         </w:tc>
@@ -3731,7 +3995,7 @@
                 <w:rFonts w:ascii="Arial" w:hAnsi="Arial"/>
                 <w:sz w:val="20"/>
               </w:rPr>
-              <w:t xml:space="preserve">[TBC: Yes if child subsidiaries also sell them]</w:t>
+              <w:t xml:space="preserve">Yes, so all three subsidiaries can sell the items</w:t>
             </w:r>
           </w:p>
         </w:tc>
@@ -4026,6 +4290,50 @@
       </w:r>
       <w:r>
         <w:t xml:space="preserve">Do these items have list prices?</w:t>
+      </w:r>
+    </w:p>
+    <w:p>
+      <w:pPr>
+        <w:numPr>
+          <w:ilvl w:val="0"/>
+          <w:numId w:val="1001"/>
+        </w:numPr>
+        <w:pStyle w:val="Compact"/>
+      </w:pPr>
+      <w:r>
+        <w:rPr>
+          <w:bCs/>
+          <w:b/>
+        </w:rPr>
+        <w:t xml:space="preserve">Classes in production.</w:t>
+      </w:r>
+      <w:r>
+        <w:t xml:space="preserve"> </w:t>
+      </w:r>
+      <w:r>
+        <w:t xml:space="preserve">License, Support, Training and Professional Services must exist in production before this load.</w:t>
+      </w:r>
+    </w:p>
+    <w:p>
+      <w:pPr>
+        <w:numPr>
+          <w:ilvl w:val="0"/>
+          <w:numId w:val="1001"/>
+        </w:numPr>
+        <w:pStyle w:val="Compact"/>
+      </w:pPr>
+      <w:r>
+        <w:rPr>
+          <w:bCs/>
+          <w:b/>
+        </w:rPr>
+        <w:t xml:space="preserve">Professional Services.</w:t>
+      </w:r>
+      <w:r>
+        <w:t xml:space="preserve"> </w:t>
+      </w:r>
+      <w:r>
+        <w:t xml:space="preserve">It is a class, but no item uses it. Are professional services items missing from this load?</w:t>
       </w:r>
     </w:p>
     <w:p>

</xml_diff>

<commit_message>
Non-inventory items: income accounts from COA Draft v1, parent subsidiary confirmed, no PS items yet
Co-Authored-By: Claude Opus 5.5 <noreply@anthropic.com>
Claude-Session: https://claude.ai/code/session_01RcSpRnw5TDsnk5GdoeWT9P
</commit_message>
<xml_diff>
--- a/netsuite/dataload/noninventory-items/output/noninventory-items.docx
+++ b/netsuite/dataload/noninventory-items/output/noninventory-items.docx
@@ -196,7 +196,7 @@
                 <w:b/>
                 <w:sz w:val="20"/>
               </w:rPr>
-              <w:t xml:space="preserve">Filled</w:t>
+              <w:t xml:space="preserve">Source</w:t>
             </w:r>
           </w:p>
         </w:tc>
@@ -215,7 +215,29 @@
                 <w:rFonts w:ascii="Arial" w:hAnsi="Arial"/>
                 <w:sz w:val="20"/>
               </w:rPr>
-              <w:t xml:space="preserve">External ID, Item Name, Display Name/Code, Class, Subsidiary, Include Children</w:t>
+              <w:t xml:space="preserve">Workbook</w:t>
+            </w:r>
+            <w:r>
+              <w:rPr>
+                <w:rFonts w:ascii="Arial" w:hAnsi="Arial"/>
+                <w:sz w:val="20"/>
+              </w:rPr>
+              <w:t xml:space="preserve"> </w:t>
+            </w:r>
+            <w:r>
+              <w:rPr>
+                <w:rStyle w:val="VerbatimChar"/>
+                <w:rFonts w:ascii="Arial" w:hAnsi="Arial"/>
+                <w:sz w:val="20"/>
+              </w:rPr>
+              <w:t xml:space="preserve">MINIO-Dimensions-from-sage-20260825</w:t>
+            </w:r>
+            <w:r>
+              <w:rPr>
+                <w:rFonts w:ascii="Arial" w:hAnsi="Arial"/>
+                <w:sz w:val="20"/>
+              </w:rPr>
+              <w:t xml:space="preserve">, tabs COA Draft v1, Departments Draft v1 and Items</w:t>
             </w:r>
           </w:p>
         </w:tc>
@@ -239,6 +261,49 @@
                 <w:b/>
                 <w:sz w:val="20"/>
               </w:rPr>
+              <w:t xml:space="preserve">Filled</w:t>
+            </w:r>
+          </w:p>
+        </w:tc>
+        <w:tc>
+          <w:tcPr>
+            <w:tcW w:type="dxa" w:w="6739"/>
+          </w:tcPr>
+          <w:p>
+            <w:pPr>
+              <w:pStyle w:val="Compact"/>
+              <w:spacing w:before="40" w:after="40"/>
+              <w:jc w:val="left"/>
+            </w:pPr>
+            <w:r>
+              <w:rPr>
+                <w:rFonts w:ascii="Arial" w:hAnsi="Arial"/>
+                <w:sz w:val="20"/>
+              </w:rPr>
+              <w:t xml:space="preserve">External ID, Item Name, Display Name/Code, Class, Subsidiary, Include Children, Income account</w:t>
+            </w:r>
+          </w:p>
+        </w:tc>
+      </w:tr>
+      <w:tr>
+        <w:tc>
+          <w:tcPr>
+            <w:tcW w:type="dxa" w:w="2620"/>
+            <w:shd w:val="clear" w:color="auto" w:fill="F2F4F7"/>
+          </w:tcPr>
+          <w:p>
+            <w:pPr>
+              <w:pStyle w:val="Compact"/>
+              <w:spacing w:before="40" w:after="40"/>
+              <w:jc w:val="left"/>
+            </w:pPr>
+            <w:r>
+              <w:rPr>
+                <w:bCs/>
+                <w:rFonts w:ascii="Arial" w:hAnsi="Arial"/>
+                <w:b/>
+                <w:sz w:val="20"/>
+              </w:rPr>
               <w:t xml:space="preserve">Open</w:t>
             </w:r>
           </w:p>
@@ -258,7 +323,7 @@
                 <w:rFonts w:ascii="Arial" w:hAnsi="Arial"/>
                 <w:sz w:val="20"/>
               </w:rPr>
-              <w:t xml:space="preserve">10 columns. Most are set per item group, under Values by group</w:t>
+              <w:t xml:space="preserve">9 columns. Most are set per item group, under Values by group</w:t>
             </w:r>
           </w:p>
         </w:tc>
@@ -907,7 +972,15 @@
             <w:pPr>
               <w:pStyle w:val="Compact"/>
               <w:spacing w:before="40" w:after="40"/>
-            </w:pPr>
+              <w:jc w:val="left"/>
+            </w:pPr>
+            <w:r>
+              <w:rPr>
+                <w:rFonts w:ascii="Arial" w:hAnsi="Arial"/>
+                <w:sz w:val="20"/>
+              </w:rPr>
+              <w:t xml:space="preserve">41200 Support Revenue</w:t>
+            </w:r>
           </w:p>
         </w:tc>
         <w:tc>
@@ -1135,7 +1208,15 @@
             <w:pPr>
               <w:pStyle w:val="Compact"/>
               <w:spacing w:before="40" w:after="40"/>
-            </w:pPr>
+              <w:jc w:val="left"/>
+            </w:pPr>
+            <w:r>
+              <w:rPr>
+                <w:rFonts w:ascii="Arial" w:hAnsi="Arial"/>
+                <w:sz w:val="20"/>
+              </w:rPr>
+              <w:t xml:space="preserve">41200 Support Revenue</w:t>
+            </w:r>
           </w:p>
         </w:tc>
         <w:tc>
@@ -1363,7 +1444,15 @@
             <w:pPr>
               <w:pStyle w:val="Compact"/>
               <w:spacing w:before="40" w:after="40"/>
-            </w:pPr>
+              <w:jc w:val="left"/>
+            </w:pPr>
+            <w:r>
+              <w:rPr>
+                <w:rFonts w:ascii="Arial" w:hAnsi="Arial"/>
+                <w:sz w:val="20"/>
+              </w:rPr>
+              <w:t xml:space="preserve">41200 Support Revenue</w:t>
+            </w:r>
           </w:p>
         </w:tc>
         <w:tc>
@@ -1591,7 +1680,15 @@
             <w:pPr>
               <w:pStyle w:val="Compact"/>
               <w:spacing w:before="40" w:after="40"/>
-            </w:pPr>
+              <w:jc w:val="left"/>
+            </w:pPr>
+            <w:r>
+              <w:rPr>
+                <w:rFonts w:ascii="Arial" w:hAnsi="Arial"/>
+                <w:sz w:val="20"/>
+              </w:rPr>
+              <w:t xml:space="preserve">41200 Support Revenue</w:t>
+            </w:r>
           </w:p>
         </w:tc>
         <w:tc>
@@ -1819,7 +1916,15 @@
             <w:pPr>
               <w:pStyle w:val="Compact"/>
               <w:spacing w:before="40" w:after="40"/>
-            </w:pPr>
+              <w:jc w:val="left"/>
+            </w:pPr>
+            <w:r>
+              <w:rPr>
+                <w:rFonts w:ascii="Arial" w:hAnsi="Arial"/>
+                <w:sz w:val="20"/>
+              </w:rPr>
+              <w:t xml:space="preserve">41200 Support Revenue</w:t>
+            </w:r>
           </w:p>
         </w:tc>
         <w:tc>
@@ -2047,7 +2152,15 @@
             <w:pPr>
               <w:pStyle w:val="Compact"/>
               <w:spacing w:before="40" w:after="40"/>
-            </w:pPr>
+              <w:jc w:val="left"/>
+            </w:pPr>
+            <w:r>
+              <w:rPr>
+                <w:rFonts w:ascii="Arial" w:hAnsi="Arial"/>
+                <w:sz w:val="20"/>
+              </w:rPr>
+              <w:t xml:space="preserve">42200 Training Revenue</w:t>
+            </w:r>
           </w:p>
         </w:tc>
         <w:tc>
@@ -2275,7 +2388,15 @@
             <w:pPr>
               <w:pStyle w:val="Compact"/>
               <w:spacing w:before="40" w:after="40"/>
-            </w:pPr>
+              <w:jc w:val="left"/>
+            </w:pPr>
+            <w:r>
+              <w:rPr>
+                <w:rFonts w:ascii="Arial" w:hAnsi="Arial"/>
+                <w:sz w:val="20"/>
+              </w:rPr>
+              <w:t xml:space="preserve">42200 Training Revenue</w:t>
+            </w:r>
           </w:p>
         </w:tc>
         <w:tc>
@@ -2503,7 +2624,15 @@
             <w:pPr>
               <w:pStyle w:val="Compact"/>
               <w:spacing w:before="40" w:after="40"/>
-            </w:pPr>
+              <w:jc w:val="left"/>
+            </w:pPr>
+            <w:r>
+              <w:rPr>
+                <w:rFonts w:ascii="Arial" w:hAnsi="Arial"/>
+                <w:sz w:val="20"/>
+              </w:rPr>
+              <w:t xml:space="preserve">42200 Training Revenue</w:t>
+            </w:r>
           </w:p>
         </w:tc>
         <w:tc>
@@ -2731,7 +2860,15 @@
             <w:pPr>
               <w:pStyle w:val="Compact"/>
               <w:spacing w:before="40" w:after="40"/>
-            </w:pPr>
+              <w:jc w:val="left"/>
+            </w:pPr>
+            <w:r>
+              <w:rPr>
+                <w:rFonts w:ascii="Arial" w:hAnsi="Arial"/>
+                <w:sz w:val="20"/>
+              </w:rPr>
+              <w:t xml:space="preserve">41100 License Revenue</w:t>
+            </w:r>
           </w:p>
         </w:tc>
         <w:tc>
@@ -2959,7 +3096,15 @@
             <w:pPr>
               <w:pStyle w:val="Compact"/>
               <w:spacing w:before="40" w:after="40"/>
-            </w:pPr>
+              <w:jc w:val="left"/>
+            </w:pPr>
+            <w:r>
+              <w:rPr>
+                <w:rFonts w:ascii="Arial" w:hAnsi="Arial"/>
+                <w:sz w:val="20"/>
+              </w:rPr>
+              <w:t xml:space="preserve">41100 License Revenue</w:t>
+            </w:r>
           </w:p>
         </w:tc>
         <w:tc>
@@ -3187,7 +3332,15 @@
             <w:pPr>
               <w:pStyle w:val="Compact"/>
               <w:spacing w:before="40" w:after="40"/>
-            </w:pPr>
+              <w:jc w:val="left"/>
+            </w:pPr>
+            <w:r>
+              <w:rPr>
+                <w:rFonts w:ascii="Arial" w:hAnsi="Arial"/>
+                <w:sz w:val="20"/>
+              </w:rPr>
+              <w:t xml:space="preserve">41100 License Revenue</w:t>
+            </w:r>
           </w:p>
         </w:tc>
         <w:tc>
@@ -3293,10 +3446,10 @@
         <w:tblLayout w:type="fixed"/>
       </w:tblPr>
       <w:tblGrid>
-        <w:gridCol w:w="2925"/>
-        <w:gridCol w:w="2047"/>
-        <w:gridCol w:w="2340"/>
-        <w:gridCol w:w="2047"/>
+        <w:gridCol w:w="2552"/>
+        <w:gridCol w:w="2978"/>
+        <w:gridCol w:w="2042"/>
+        <w:gridCol w:w="1786"/>
       </w:tblGrid>
       <w:tr>
         <w:trPr>
@@ -3304,7 +3457,7 @@
         </w:trPr>
         <w:tc>
           <w:tcPr>
-            <w:tcW w:type="dxa" w:w="2925"/>
+            <w:tcW w:type="dxa" w:w="2552"/>
             <w:shd w:val="clear" w:color="auto" w:fill="1F3B5C"/>
           </w:tcPr>
           <w:p>
@@ -3327,7 +3480,7 @@
         </w:tc>
         <w:tc>
           <w:tcPr>
-            <w:tcW w:type="dxa" w:w="2047"/>
+            <w:tcW w:type="dxa" w:w="2978"/>
             <w:shd w:val="clear" w:color="auto" w:fill="1F3B5C"/>
           </w:tcPr>
           <w:p>
@@ -3350,7 +3503,7 @@
         </w:tc>
         <w:tc>
           <w:tcPr>
-            <w:tcW w:type="dxa" w:w="2340"/>
+            <w:tcW w:type="dxa" w:w="2042"/>
             <w:shd w:val="clear" w:color="auto" w:fill="1F3B5C"/>
           </w:tcPr>
           <w:p>
@@ -3373,7 +3526,7 @@
         </w:tc>
         <w:tc>
           <w:tcPr>
-            <w:tcW w:type="dxa" w:w="2047"/>
+            <w:tcW w:type="dxa" w:w="1786"/>
             <w:shd w:val="clear" w:color="auto" w:fill="1F3B5C"/>
           </w:tcPr>
           <w:p>
@@ -3398,7 +3551,7 @@
       <w:tr>
         <w:tc>
           <w:tcPr>
-            <w:tcW w:type="dxa" w:w="2925"/>
+            <w:tcW w:type="dxa" w:w="2552"/>
           </w:tcPr>
           <w:p>
             <w:pPr>
@@ -3419,7 +3572,26 @@
         </w:tc>
         <w:tc>
           <w:tcPr>
-            <w:tcW w:type="dxa" w:w="2047"/>
+            <w:tcW w:type="dxa" w:w="2978"/>
+          </w:tcPr>
+          <w:p>
+            <w:pPr>
+              <w:pStyle w:val="Compact"/>
+              <w:spacing w:before="40" w:after="40"/>
+              <w:jc w:val="left"/>
+            </w:pPr>
+            <w:r>
+              <w:rPr>
+                <w:rFonts w:ascii="Arial" w:hAnsi="Arial"/>
+                <w:sz w:val="20"/>
+              </w:rPr>
+              <w:t xml:space="preserve">[TBC: see open questions]</w:t>
+            </w:r>
+          </w:p>
+        </w:tc>
+        <w:tc>
+          <w:tcPr>
+            <w:tcW w:type="dxa" w:w="2042"/>
           </w:tcPr>
           <w:p>
             <w:pPr>
@@ -3438,26 +3610,7 @@
         </w:tc>
         <w:tc>
           <w:tcPr>
-            <w:tcW w:type="dxa" w:w="2340"/>
-          </w:tcPr>
-          <w:p>
-            <w:pPr>
-              <w:pStyle w:val="Compact"/>
-              <w:spacing w:before="40" w:after="40"/>
-              <w:jc w:val="left"/>
-            </w:pPr>
-            <w:r>
-              <w:rPr>
-                <w:rFonts w:ascii="Arial" w:hAnsi="Arial"/>
-                <w:sz w:val="20"/>
-              </w:rPr>
-              <w:t xml:space="preserve">[TBC]</w:t>
-            </w:r>
-          </w:p>
-        </w:tc>
-        <w:tc>
-          <w:tcPr>
-            <w:tcW w:type="dxa" w:w="2047"/>
+            <w:tcW w:type="dxa" w:w="1786"/>
           </w:tcPr>
           <w:p>
             <w:pPr>
@@ -3478,7 +3631,7 @@
       <w:tr>
         <w:tc>
           <w:tcPr>
-            <w:tcW w:type="dxa" w:w="2925"/>
+            <w:tcW w:type="dxa" w:w="2552"/>
           </w:tcPr>
           <w:p>
             <w:pPr>
@@ -3499,7 +3652,7 @@
         </w:tc>
         <w:tc>
           <w:tcPr>
-            <w:tcW w:type="dxa" w:w="2047"/>
+            <w:tcW w:type="dxa" w:w="2978"/>
           </w:tcPr>
           <w:p>
             <w:pPr>
@@ -3518,7 +3671,7 @@
         </w:tc>
         <w:tc>
           <w:tcPr>
-            <w:tcW w:type="dxa" w:w="2340"/>
+            <w:tcW w:type="dxa" w:w="2042"/>
           </w:tcPr>
           <w:p>
             <w:pPr>
@@ -3537,7 +3690,7 @@
         </w:tc>
         <w:tc>
           <w:tcPr>
-            <w:tcW w:type="dxa" w:w="2047"/>
+            <w:tcW w:type="dxa" w:w="1786"/>
           </w:tcPr>
           <w:p>
             <w:pPr>
@@ -3558,7 +3711,7 @@
       <w:tr>
         <w:tc>
           <w:tcPr>
-            <w:tcW w:type="dxa" w:w="2925"/>
+            <w:tcW w:type="dxa" w:w="2552"/>
           </w:tcPr>
           <w:p>
             <w:pPr>
@@ -3579,58 +3732,58 @@
         </w:tc>
         <w:tc>
           <w:tcPr>
-            <w:tcW w:type="dxa" w:w="2047"/>
-          </w:tcPr>
-          <w:p>
-            <w:pPr>
-              <w:pStyle w:val="Compact"/>
-              <w:spacing w:before="40" w:after="40"/>
-              <w:jc w:val="left"/>
-            </w:pPr>
-            <w:r>
-              <w:rPr>
-                <w:rFonts w:ascii="Arial" w:hAnsi="Arial"/>
-                <w:sz w:val="20"/>
-              </w:rPr>
-              <w:t xml:space="preserve">[TBC]</w:t>
-            </w:r>
-          </w:p>
-        </w:tc>
-        <w:tc>
-          <w:tcPr>
-            <w:tcW w:type="dxa" w:w="2340"/>
-          </w:tcPr>
-          <w:p>
-            <w:pPr>
-              <w:pStyle w:val="Compact"/>
-              <w:spacing w:before="40" w:after="40"/>
-              <w:jc w:val="left"/>
-            </w:pPr>
-            <w:r>
-              <w:rPr>
-                <w:rFonts w:ascii="Arial" w:hAnsi="Arial"/>
-                <w:sz w:val="20"/>
-              </w:rPr>
-              <w:t xml:space="preserve">[TBC]</w:t>
-            </w:r>
-          </w:p>
-        </w:tc>
-        <w:tc>
-          <w:tcPr>
-            <w:tcW w:type="dxa" w:w="2047"/>
-          </w:tcPr>
-          <w:p>
-            <w:pPr>
-              <w:pStyle w:val="Compact"/>
-              <w:spacing w:before="40" w:after="40"/>
-              <w:jc w:val="left"/>
-            </w:pPr>
-            <w:r>
-              <w:rPr>
-                <w:rFonts w:ascii="Arial" w:hAnsi="Arial"/>
-                <w:sz w:val="20"/>
-              </w:rPr>
-              <w:t xml:space="preserve">[TBC]</w:t>
+            <w:tcW w:type="dxa" w:w="2978"/>
+          </w:tcPr>
+          <w:p>
+            <w:pPr>
+              <w:pStyle w:val="Compact"/>
+              <w:spacing w:before="40" w:after="40"/>
+              <w:jc w:val="left"/>
+            </w:pPr>
+            <w:r>
+              <w:rPr>
+                <w:rFonts w:ascii="Arial" w:hAnsi="Arial"/>
+                <w:sz w:val="20"/>
+              </w:rPr>
+              <w:t xml:space="preserve">41200 Support Revenue</w:t>
+            </w:r>
+          </w:p>
+        </w:tc>
+        <w:tc>
+          <w:tcPr>
+            <w:tcW w:type="dxa" w:w="2042"/>
+          </w:tcPr>
+          <w:p>
+            <w:pPr>
+              <w:pStyle w:val="Compact"/>
+              <w:spacing w:before="40" w:after="40"/>
+              <w:jc w:val="left"/>
+            </w:pPr>
+            <w:r>
+              <w:rPr>
+                <w:rFonts w:ascii="Arial" w:hAnsi="Arial"/>
+                <w:sz w:val="20"/>
+              </w:rPr>
+              <w:t xml:space="preserve">42200 Training Revenue</w:t>
+            </w:r>
+          </w:p>
+        </w:tc>
+        <w:tc>
+          <w:tcPr>
+            <w:tcW w:type="dxa" w:w="1786"/>
+          </w:tcPr>
+          <w:p>
+            <w:pPr>
+              <w:pStyle w:val="Compact"/>
+              <w:spacing w:before="40" w:after="40"/>
+              <w:jc w:val="left"/>
+            </w:pPr>
+            <w:r>
+              <w:rPr>
+                <w:rFonts w:ascii="Arial" w:hAnsi="Arial"/>
+                <w:sz w:val="20"/>
+              </w:rPr>
+              <w:t xml:space="preserve">41100 License Revenue</w:t>
             </w:r>
           </w:p>
         </w:tc>
@@ -3638,7 +3791,7 @@
       <w:tr>
         <w:tc>
           <w:tcPr>
-            <w:tcW w:type="dxa" w:w="2925"/>
+            <w:tcW w:type="dxa" w:w="2552"/>
           </w:tcPr>
           <w:p>
             <w:pPr>
@@ -3659,7 +3812,26 @@
         </w:tc>
         <w:tc>
           <w:tcPr>
-            <w:tcW w:type="dxa" w:w="2047"/>
+            <w:tcW w:type="dxa" w:w="2978"/>
+          </w:tcPr>
+          <w:p>
+            <w:pPr>
+              <w:pStyle w:val="Compact"/>
+              <w:spacing w:before="40" w:after="40"/>
+              <w:jc w:val="left"/>
+            </w:pPr>
+            <w:r>
+              <w:rPr>
+                <w:rFonts w:ascii="Arial" w:hAnsi="Arial"/>
+                <w:sz w:val="20"/>
+              </w:rPr>
+              <w:t xml:space="preserve">[TBC: 23100 Deferred Revenue - ST?]</w:t>
+            </w:r>
+          </w:p>
+        </w:tc>
+        <w:tc>
+          <w:tcPr>
+            <w:tcW w:type="dxa" w:w="2042"/>
           </w:tcPr>
           <w:p>
             <w:pPr>
@@ -3678,26 +3850,7 @@
         </w:tc>
         <w:tc>
           <w:tcPr>
-            <w:tcW w:type="dxa" w:w="2340"/>
-          </w:tcPr>
-          <w:p>
-            <w:pPr>
-              <w:pStyle w:val="Compact"/>
-              <w:spacing w:before="40" w:after="40"/>
-              <w:jc w:val="left"/>
-            </w:pPr>
-            <w:r>
-              <w:rPr>
-                <w:rFonts w:ascii="Arial" w:hAnsi="Arial"/>
-                <w:sz w:val="20"/>
-              </w:rPr>
-              <w:t xml:space="preserve">[TBC]</w:t>
-            </w:r>
-          </w:p>
-        </w:tc>
-        <w:tc>
-          <w:tcPr>
-            <w:tcW w:type="dxa" w:w="2047"/>
+            <w:tcW w:type="dxa" w:w="1786"/>
           </w:tcPr>
           <w:p>
             <w:pPr>
@@ -3718,7 +3871,7 @@
       <w:tr>
         <w:tc>
           <w:tcPr>
-            <w:tcW w:type="dxa" w:w="2925"/>
+            <w:tcW w:type="dxa" w:w="2552"/>
           </w:tcPr>
           <w:p>
             <w:pPr>
@@ -3739,7 +3892,7 @@
         </w:tc>
         <w:tc>
           <w:tcPr>
-            <w:tcW w:type="dxa" w:w="2047"/>
+            <w:tcW w:type="dxa" w:w="2978"/>
           </w:tcPr>
           <w:p>
             <w:pPr>
@@ -3758,7 +3911,7 @@
         </w:tc>
         <w:tc>
           <w:tcPr>
-            <w:tcW w:type="dxa" w:w="2340"/>
+            <w:tcW w:type="dxa" w:w="2042"/>
           </w:tcPr>
           <w:p>
             <w:pPr>
@@ -3777,7 +3930,7 @@
         </w:tc>
         <w:tc>
           <w:tcPr>
-            <w:tcW w:type="dxa" w:w="2047"/>
+            <w:tcW w:type="dxa" w:w="1786"/>
           </w:tcPr>
           <w:p>
             <w:pPr>
@@ -3798,7 +3951,7 @@
       <w:tr>
         <w:tc>
           <w:tcPr>
-            <w:tcW w:type="dxa" w:w="2925"/>
+            <w:tcW w:type="dxa" w:w="2552"/>
           </w:tcPr>
           <w:p>
             <w:pPr>
@@ -3819,7 +3972,7 @@
         </w:tc>
         <w:tc>
           <w:tcPr>
-            <w:tcW w:type="dxa" w:w="2047"/>
+            <w:tcW w:type="dxa" w:w="2978"/>
           </w:tcPr>
           <w:p>
             <w:pPr>
@@ -3838,7 +3991,7 @@
         </w:tc>
         <w:tc>
           <w:tcPr>
-            <w:tcW w:type="dxa" w:w="2340"/>
+            <w:tcW w:type="dxa" w:w="2042"/>
           </w:tcPr>
           <w:p>
             <w:pPr>
@@ -3857,7 +4010,7 @@
         </w:tc>
         <w:tc>
           <w:tcPr>
-            <w:tcW w:type="dxa" w:w="2047"/>
+            <w:tcW w:type="dxa" w:w="1786"/>
           </w:tcPr>
           <w:p>
             <w:pPr>
@@ -3952,7 +4105,7 @@
                 <w:rFonts w:ascii="Arial" w:hAnsi="Arial"/>
                 <w:sz w:val="20"/>
               </w:rPr>
-              <w:t xml:space="preserve">MinIO, Inc. [TBC: confirm it is the parent of MinIO Pvt. Ltd. and MinIO Singapore Pte. Ltd.]</w:t>
+              <w:t xml:space="preserve">MinIO, Inc., the parent of MinIO Pvt. Ltd. and MinIO Singapore Pte. Ltd.</w:t>
             </w:r>
           </w:p>
         </w:tc>
@@ -4224,6 +4377,84 @@
       </w:pPr>
       <w:r>
         <w:t xml:space="preserve">Open questions</w:t>
+      </w:r>
+    </w:p>
+    <w:p>
+      <w:pPr>
+        <w:numPr>
+          <w:ilvl w:val="0"/>
+          <w:numId w:val="1001"/>
+        </w:numPr>
+        <w:pStyle w:val="Compact"/>
+      </w:pPr>
+      <w:r>
+        <w:rPr>
+          <w:bCs/>
+          <w:b/>
+        </w:rPr>
+        <w:t xml:space="preserve">Department.</w:t>
+      </w:r>
+      <w:r>
+        <w:t xml:space="preserve"> </w:t>
+      </w:r>
+      <w:r>
+        <w:t xml:space="preserve">4000 Cost of Revenue (COR) is a cost department and a parent with no people. Coding revenue to it puts revenue and cost of revenue in one department on department reports. Options: leave Department blank on the items (Class already carries the revenue type), use 4000, or use 2000 Sales.</w:t>
+      </w:r>
+    </w:p>
+    <w:p>
+      <w:pPr>
+        <w:numPr>
+          <w:ilvl w:val="0"/>
+          <w:numId w:val="1001"/>
+        </w:numPr>
+        <w:pStyle w:val="Compact"/>
+      </w:pPr>
+      <w:r>
+        <w:rPr>
+          <w:bCs/>
+          <w:b/>
+        </w:rPr>
+        <w:t xml:space="preserve">Deferred Revenue account.</w:t>
+      </w:r>
+      <w:r>
+        <w:t xml:space="preserve"> </w:t>
+      </w:r>
+      <w:r>
+        <w:t xml:space="preserve">COA Draft v1 has 23100 Deferred Revenue - ST, 23200 Deferred Revenue - LT, and under 23200: 23210 Deferred Revenue Unbilled, 23220 Deferred Revenue Billed, 23230 Deferred Revenue Paid. Which one do the items post to?</w:t>
+      </w:r>
+    </w:p>
+    <w:p>
+      <w:pPr>
+        <w:numPr>
+          <w:ilvl w:val="0"/>
+          <w:numId w:val="1001"/>
+        </w:numPr>
+        <w:pStyle w:val="Compact"/>
+      </w:pPr>
+      <w:r>
+        <w:rPr>
+          <w:bCs/>
+          <w:b/>
+        </w:rPr>
+        <w:t xml:space="preserve">Account format.</w:t>
+      </w:r>
+      <w:r>
+        <w:t xml:space="preserve"> </w:t>
+      </w:r>
+      <w:r>
+        <w:t xml:space="preserve">The CSV uses number and name, such as</w:t>
+      </w:r>
+      <w:r>
+        <w:t xml:space="preserve"> </w:t>
+      </w:r>
+      <w:r>
+        <w:rPr>
+          <w:rStyle w:val="VerbatimChar"/>
+        </w:rPr>
+        <w:t xml:space="preserve">41100 License Revenue</w:t>
+      </w:r>
+      <w:r>
+        <w:t xml:space="preserve">. Confirm on a test import that NetSuite matches it; child accounts may need the full path.</w:t>
       </w:r>
     </w:p>
     <w:p>
@@ -4327,13 +4558,13 @@
           <w:bCs/>
           <w:b/>
         </w:rPr>
-        <w:t xml:space="preserve">Professional Services.</w:t>
+        <w:t xml:space="preserve">Not in this load.</w:t>
       </w:r>
       <w:r>
         <w:t xml:space="preserve"> </w:t>
       </w:r>
       <w:r>
-        <w:t xml:space="preserve">It is a class, but no item uses it. Are professional services items missing from this load?</w:t>
+        <w:t xml:space="preserve">The Items tab lists Surcharge Fee for Marketplace and Reseller Margin (presented as a discount) as TBD. No Professional Services SKUs yet; 42100 Professional Services Revenue is ready when there are.</w:t>
       </w:r>
     </w:p>
     <w:p>

</xml_diff>

<commit_message>
Non-inventory items: no department for now
Co-Authored-By: Claude Opus 5.5 <noreply@anthropic.com>
Claude-Session: https://claude.ai/code/session_01RcSpRnw5TDsnk5GdoeWT9P
</commit_message>
<xml_diff>
--- a/netsuite/dataload/noninventory-items/output/noninventory-items.docx
+++ b/netsuite/dataload/noninventory-items/output/noninventory-items.docx
@@ -323,7 +323,7 @@
                 <w:rFonts w:ascii="Arial" w:hAnsi="Arial"/>
                 <w:sz w:val="20"/>
               </w:rPr>
-              <w:t xml:space="preserve">9 columns. Most are set per item group, under Values by group</w:t>
+              <w:t xml:space="preserve">8 columns. Department stays blank for now. Most are set per item group, under Values by group</w:t>
             </w:r>
           </w:p>
         </w:tc>
@@ -3585,7 +3585,7 @@
                 <w:rFonts w:ascii="Arial" w:hAnsi="Arial"/>
                 <w:sz w:val="20"/>
               </w:rPr>
-              <w:t xml:space="preserve">[TBC: see open questions]</w:t>
+              <w:t xml:space="preserve">None for now</w:t>
             </w:r>
           </w:p>
         </w:tc>
@@ -3604,7 +3604,7 @@
                 <w:rFonts w:ascii="Arial" w:hAnsi="Arial"/>
                 <w:sz w:val="20"/>
               </w:rPr>
-              <w:t xml:space="preserve">[TBC]</w:t>
+              <w:t xml:space="preserve">None for now</w:t>
             </w:r>
           </w:p>
         </w:tc>
@@ -3623,7 +3623,7 @@
                 <w:rFonts w:ascii="Arial" w:hAnsi="Arial"/>
                 <w:sz w:val="20"/>
               </w:rPr>
-              <w:t xml:space="preserve">[TBC]</w:t>
+              <w:t xml:space="preserve">None for now</w:t>
             </w:r>
           </w:p>
         </w:tc>
@@ -4377,28 +4377,6 @@
       </w:pPr>
       <w:r>
         <w:t xml:space="preserve">Open questions</w:t>
-      </w:r>
-    </w:p>
-    <w:p>
-      <w:pPr>
-        <w:numPr>
-          <w:ilvl w:val="0"/>
-          <w:numId w:val="1001"/>
-        </w:numPr>
-        <w:pStyle w:val="Compact"/>
-      </w:pPr>
-      <w:r>
-        <w:rPr>
-          <w:bCs/>
-          <w:b/>
-        </w:rPr>
-        <w:t xml:space="preserve">Department.</w:t>
-      </w:r>
-      <w:r>
-        <w:t xml:space="preserve"> </w:t>
-      </w:r>
-      <w:r>
-        <w:t xml:space="preserve">4000 Cost of Revenue (COR) is a cost department and a parent with no people. Coding revenue to it puts revenue and cost of revenue in one department on department reports. Options: leave Department blank on the items (Class already carries the revenue type), use 4000, or use 2000 Sales.</w:t>
       </w:r>
     </w:p>
     <w:p>

</xml_diff>

<commit_message>
Non-inventory items: deferred revenue ST/LT proposal
Co-Authored-By: Claude Opus 5.5 <noreply@anthropic.com>
Claude-Session: https://claude.ai/code/session_01RcSpRnw5TDsnk5GdoeWT9P
</commit_message>
<xml_diff>
--- a/netsuite/dataload/noninventory-items/output/noninventory-items.docx
+++ b/netsuite/dataload/noninventory-items/output/noninventory-items.docx
@@ -3446,10 +3446,10 @@
         <w:tblLayout w:type="fixed"/>
       </w:tblPr>
       <w:tblGrid>
-        <w:gridCol w:w="2552"/>
-        <w:gridCol w:w="2978"/>
-        <w:gridCol w:w="2042"/>
-        <w:gridCol w:w="1786"/>
+        <w:gridCol w:w="2379"/>
+        <w:gridCol w:w="3410"/>
+        <w:gridCol w:w="1903"/>
+        <w:gridCol w:w="1665"/>
       </w:tblGrid>
       <w:tr>
         <w:trPr>
@@ -3457,7 +3457,7 @@
         </w:trPr>
         <w:tc>
           <w:tcPr>
-            <w:tcW w:type="dxa" w:w="2552"/>
+            <w:tcW w:type="dxa" w:w="2379"/>
             <w:shd w:val="clear" w:color="auto" w:fill="1F3B5C"/>
           </w:tcPr>
           <w:p>
@@ -3480,7 +3480,7 @@
         </w:tc>
         <w:tc>
           <w:tcPr>
-            <w:tcW w:type="dxa" w:w="2978"/>
+            <w:tcW w:type="dxa" w:w="3410"/>
             <w:shd w:val="clear" w:color="auto" w:fill="1F3B5C"/>
           </w:tcPr>
           <w:p>
@@ -3503,7 +3503,7 @@
         </w:tc>
         <w:tc>
           <w:tcPr>
-            <w:tcW w:type="dxa" w:w="2042"/>
+            <w:tcW w:type="dxa" w:w="1903"/>
             <w:shd w:val="clear" w:color="auto" w:fill="1F3B5C"/>
           </w:tcPr>
           <w:p>
@@ -3526,7 +3526,7 @@
         </w:tc>
         <w:tc>
           <w:tcPr>
-            <w:tcW w:type="dxa" w:w="1786"/>
+            <w:tcW w:type="dxa" w:w="1665"/>
             <w:shd w:val="clear" w:color="auto" w:fill="1F3B5C"/>
           </w:tcPr>
           <w:p>
@@ -3551,7 +3551,7 @@
       <w:tr>
         <w:tc>
           <w:tcPr>
-            <w:tcW w:type="dxa" w:w="2552"/>
+            <w:tcW w:type="dxa" w:w="2379"/>
           </w:tcPr>
           <w:p>
             <w:pPr>
@@ -3572,7 +3572,7 @@
         </w:tc>
         <w:tc>
           <w:tcPr>
-            <w:tcW w:type="dxa" w:w="2978"/>
+            <w:tcW w:type="dxa" w:w="3410"/>
           </w:tcPr>
           <w:p>
             <w:pPr>
@@ -3591,7 +3591,7 @@
         </w:tc>
         <w:tc>
           <w:tcPr>
-            <w:tcW w:type="dxa" w:w="2042"/>
+            <w:tcW w:type="dxa" w:w="1903"/>
           </w:tcPr>
           <w:p>
             <w:pPr>
@@ -3610,7 +3610,7 @@
         </w:tc>
         <w:tc>
           <w:tcPr>
-            <w:tcW w:type="dxa" w:w="1786"/>
+            <w:tcW w:type="dxa" w:w="1665"/>
           </w:tcPr>
           <w:p>
             <w:pPr>
@@ -3631,7 +3631,7 @@
       <w:tr>
         <w:tc>
           <w:tcPr>
-            <w:tcW w:type="dxa" w:w="2552"/>
+            <w:tcW w:type="dxa" w:w="2379"/>
           </w:tcPr>
           <w:p>
             <w:pPr>
@@ -3652,7 +3652,7 @@
         </w:tc>
         <w:tc>
           <w:tcPr>
-            <w:tcW w:type="dxa" w:w="2978"/>
+            <w:tcW w:type="dxa" w:w="3410"/>
           </w:tcPr>
           <w:p>
             <w:pPr>
@@ -3671,7 +3671,7 @@
         </w:tc>
         <w:tc>
           <w:tcPr>
-            <w:tcW w:type="dxa" w:w="2042"/>
+            <w:tcW w:type="dxa" w:w="1903"/>
           </w:tcPr>
           <w:p>
             <w:pPr>
@@ -3690,7 +3690,7 @@
         </w:tc>
         <w:tc>
           <w:tcPr>
-            <w:tcW w:type="dxa" w:w="1786"/>
+            <w:tcW w:type="dxa" w:w="1665"/>
           </w:tcPr>
           <w:p>
             <w:pPr>
@@ -3711,7 +3711,7 @@
       <w:tr>
         <w:tc>
           <w:tcPr>
-            <w:tcW w:type="dxa" w:w="2552"/>
+            <w:tcW w:type="dxa" w:w="2379"/>
           </w:tcPr>
           <w:p>
             <w:pPr>
@@ -3732,7 +3732,7 @@
         </w:tc>
         <w:tc>
           <w:tcPr>
-            <w:tcW w:type="dxa" w:w="2978"/>
+            <w:tcW w:type="dxa" w:w="3410"/>
           </w:tcPr>
           <w:p>
             <w:pPr>
@@ -3751,7 +3751,7 @@
         </w:tc>
         <w:tc>
           <w:tcPr>
-            <w:tcW w:type="dxa" w:w="2042"/>
+            <w:tcW w:type="dxa" w:w="1903"/>
           </w:tcPr>
           <w:p>
             <w:pPr>
@@ -3770,7 +3770,7 @@
         </w:tc>
         <w:tc>
           <w:tcPr>
-            <w:tcW w:type="dxa" w:w="1786"/>
+            <w:tcW w:type="dxa" w:w="1665"/>
           </w:tcPr>
           <w:p>
             <w:pPr>
@@ -3791,7 +3791,7 @@
       <w:tr>
         <w:tc>
           <w:tcPr>
-            <w:tcW w:type="dxa" w:w="2552"/>
+            <w:tcW w:type="dxa" w:w="2379"/>
           </w:tcPr>
           <w:p>
             <w:pPr>
@@ -3812,26 +3812,26 @@
         </w:tc>
         <w:tc>
           <w:tcPr>
-            <w:tcW w:type="dxa" w:w="2978"/>
-          </w:tcPr>
-          <w:p>
-            <w:pPr>
-              <w:pStyle w:val="Compact"/>
-              <w:spacing w:before="40" w:after="40"/>
-              <w:jc w:val="left"/>
-            </w:pPr>
-            <w:r>
-              <w:rPr>
-                <w:rFonts w:ascii="Arial" w:hAnsi="Arial"/>
-                <w:sz w:val="20"/>
-              </w:rPr>
-              <w:t xml:space="preserve">[TBC: 23100 Deferred Revenue - ST?]</w:t>
-            </w:r>
-          </w:p>
-        </w:tc>
-        <w:tc>
-          <w:tcPr>
-            <w:tcW w:type="dxa" w:w="2042"/>
+            <w:tcW w:type="dxa" w:w="3410"/>
+          </w:tcPr>
+          <w:p>
+            <w:pPr>
+              <w:pStyle w:val="Compact"/>
+              <w:spacing w:before="40" w:after="40"/>
+              <w:jc w:val="left"/>
+            </w:pPr>
+            <w:r>
+              <w:rPr>
+                <w:rFonts w:ascii="Arial" w:hAnsi="Arial"/>
+                <w:sz w:val="20"/>
+              </w:rPr>
+              <w:t xml:space="preserve">[TBC: 23100 Deferred Revenue - ST proposed]</w:t>
+            </w:r>
+          </w:p>
+        </w:tc>
+        <w:tc>
+          <w:tcPr>
+            <w:tcW w:type="dxa" w:w="1903"/>
           </w:tcPr>
           <w:p>
             <w:pPr>
@@ -3850,7 +3850,7 @@
         </w:tc>
         <w:tc>
           <w:tcPr>
-            <w:tcW w:type="dxa" w:w="1786"/>
+            <w:tcW w:type="dxa" w:w="1665"/>
           </w:tcPr>
           <w:p>
             <w:pPr>
@@ -3871,7 +3871,7 @@
       <w:tr>
         <w:tc>
           <w:tcPr>
-            <w:tcW w:type="dxa" w:w="2552"/>
+            <w:tcW w:type="dxa" w:w="2379"/>
           </w:tcPr>
           <w:p>
             <w:pPr>
@@ -3892,7 +3892,7 @@
         </w:tc>
         <w:tc>
           <w:tcPr>
-            <w:tcW w:type="dxa" w:w="2978"/>
+            <w:tcW w:type="dxa" w:w="3410"/>
           </w:tcPr>
           <w:p>
             <w:pPr>
@@ -3911,7 +3911,7 @@
         </w:tc>
         <w:tc>
           <w:tcPr>
-            <w:tcW w:type="dxa" w:w="2042"/>
+            <w:tcW w:type="dxa" w:w="1903"/>
           </w:tcPr>
           <w:p>
             <w:pPr>
@@ -3930,7 +3930,7 @@
         </w:tc>
         <w:tc>
           <w:tcPr>
-            <w:tcW w:type="dxa" w:w="1786"/>
+            <w:tcW w:type="dxa" w:w="1665"/>
           </w:tcPr>
           <w:p>
             <w:pPr>
@@ -3951,7 +3951,7 @@
       <w:tr>
         <w:tc>
           <w:tcPr>
-            <w:tcW w:type="dxa" w:w="2552"/>
+            <w:tcW w:type="dxa" w:w="2379"/>
           </w:tcPr>
           <w:p>
             <w:pPr>
@@ -3972,7 +3972,7 @@
         </w:tc>
         <w:tc>
           <w:tcPr>
-            <w:tcW w:type="dxa" w:w="2978"/>
+            <w:tcW w:type="dxa" w:w="3410"/>
           </w:tcPr>
           <w:p>
             <w:pPr>
@@ -3991,7 +3991,7 @@
         </w:tc>
         <w:tc>
           <w:tcPr>
-            <w:tcW w:type="dxa" w:w="2042"/>
+            <w:tcW w:type="dxa" w:w="1903"/>
           </w:tcPr>
           <w:p>
             <w:pPr>
@@ -4010,7 +4010,7 @@
         </w:tc>
         <w:tc>
           <w:tcPr>
-            <w:tcW w:type="dxa" w:w="1786"/>
+            <w:tcW w:type="dxa" w:w="1665"/>
           </w:tcPr>
           <w:p>
             <w:pPr>
@@ -4398,7 +4398,7 @@
         <w:t xml:space="preserve"> </w:t>
       </w:r>
       <w:r>
-        <w:t xml:space="preserve">COA Draft v1 has 23100 Deferred Revenue - ST, 23200 Deferred Revenue - LT, and under 23200: 23210 Deferred Revenue Unbilled, 23220 Deferred Revenue Billed, 23230 Deferred Revenue Paid. Which one do the items post to?</w:t>
+        <w:t xml:space="preserve">COA Draft v1 has 23100 Deferred Revenue - ST, 23200 Deferred Revenue - LT, and under 23200: 23210 Deferred Revenue Unbilled, 23220 Deferred Revenue Billed, 23230 Deferred Revenue Paid. Which one do the items post to? An item takes one account, so NetSuite does not split short and long term on the transaction. Proposed: post to 23100 and reclass the part beyond 12 months to 23200 with a period-end journal entry. Unbilled, Billed and Paid look carried over from Sage’s contract revenue setup; confirm whether they are still needed.</w:t>
       </w:r>
     </w:p>
     <w:p>

</xml_diff>

<commit_message>
Non-inventory items: deferred revenue 23100; name field guidance
Co-Authored-By: Claude Opus 5.5 <noreply@anthropic.com>
Claude-Session: https://claude.ai/code/session_01RcSpRnw5TDsnk5GdoeWT9P
</commit_message>
<xml_diff>
--- a/netsuite/dataload/noninventory-items/output/noninventory-items.docx
+++ b/netsuite/dataload/noninventory-items/output/noninventory-items.docx
@@ -280,7 +280,7 @@
                 <w:rFonts w:ascii="Arial" w:hAnsi="Arial"/>
                 <w:sz w:val="20"/>
               </w:rPr>
-              <w:t xml:space="preserve">External ID, Item Name, Display Name/Code, Class, Subsidiary, Include Children, Income account</w:t>
+              <w:t xml:space="preserve">External ID, Item Name, Display Name/Code, Class, Subsidiary, Include Children, Income account, Deferred Revenue account</w:t>
             </w:r>
           </w:p>
         </w:tc>
@@ -323,7 +323,7 @@
                 <w:rFonts w:ascii="Arial" w:hAnsi="Arial"/>
                 <w:sz w:val="20"/>
               </w:rPr>
-              <w:t xml:space="preserve">8 columns. Department stays blank for now. Most are set per item group, under Values by group</w:t>
+              <w:t xml:space="preserve">7 columns. Department stays blank for now. Most are set per item group, under Values by group</w:t>
             </w:r>
           </w:p>
         </w:tc>
@@ -404,7 +404,7 @@
         <w:pStyle w:val="BodyText"/>
       </w:pPr>
       <w:r>
-        <w:t xml:space="preserve">External ID and Item Name both use the item ID. Item Name is the code; Display Name/Code is the name sales and customers read.</w:t>
+        <w:t xml:space="preserve">External ID and Item Name both use the item ID. Item Name/Number is the code and the import key. Display Name/Code is the readable name; NetSuite prints it on forms instead of the code when it is set. Sales Description is the longer line text on quotes and invoices.</w:t>
       </w:r>
     </w:p>
     <w:tbl>
@@ -991,7 +991,15 @@
             <w:pPr>
               <w:pStyle w:val="Compact"/>
               <w:spacing w:before="40" w:after="40"/>
-            </w:pPr>
+              <w:jc w:val="left"/>
+            </w:pPr>
+            <w:r>
+              <w:rPr>
+                <w:rFonts w:ascii="Arial" w:hAnsi="Arial"/>
+                <w:sz w:val="20"/>
+              </w:rPr>
+              <w:t xml:space="preserve">23100 Deferred Revenue - ST</w:t>
+            </w:r>
           </w:p>
         </w:tc>
         <w:tc>
@@ -1227,7 +1235,15 @@
             <w:pPr>
               <w:pStyle w:val="Compact"/>
               <w:spacing w:before="40" w:after="40"/>
-            </w:pPr>
+              <w:jc w:val="left"/>
+            </w:pPr>
+            <w:r>
+              <w:rPr>
+                <w:rFonts w:ascii="Arial" w:hAnsi="Arial"/>
+                <w:sz w:val="20"/>
+              </w:rPr>
+              <w:t xml:space="preserve">23100 Deferred Revenue - ST</w:t>
+            </w:r>
           </w:p>
         </w:tc>
         <w:tc>
@@ -1463,7 +1479,15 @@
             <w:pPr>
               <w:pStyle w:val="Compact"/>
               <w:spacing w:before="40" w:after="40"/>
-            </w:pPr>
+              <w:jc w:val="left"/>
+            </w:pPr>
+            <w:r>
+              <w:rPr>
+                <w:rFonts w:ascii="Arial" w:hAnsi="Arial"/>
+                <w:sz w:val="20"/>
+              </w:rPr>
+              <w:t xml:space="preserve">23100 Deferred Revenue - ST</w:t>
+            </w:r>
           </w:p>
         </w:tc>
         <w:tc>
@@ -1699,7 +1723,15 @@
             <w:pPr>
               <w:pStyle w:val="Compact"/>
               <w:spacing w:before="40" w:after="40"/>
-            </w:pPr>
+              <w:jc w:val="left"/>
+            </w:pPr>
+            <w:r>
+              <w:rPr>
+                <w:rFonts w:ascii="Arial" w:hAnsi="Arial"/>
+                <w:sz w:val="20"/>
+              </w:rPr>
+              <w:t xml:space="preserve">23100 Deferred Revenue - ST</w:t>
+            </w:r>
           </w:p>
         </w:tc>
         <w:tc>
@@ -1935,7 +1967,15 @@
             <w:pPr>
               <w:pStyle w:val="Compact"/>
               <w:spacing w:before="40" w:after="40"/>
-            </w:pPr>
+              <w:jc w:val="left"/>
+            </w:pPr>
+            <w:r>
+              <w:rPr>
+                <w:rFonts w:ascii="Arial" w:hAnsi="Arial"/>
+                <w:sz w:val="20"/>
+              </w:rPr>
+              <w:t xml:space="preserve">23100 Deferred Revenue - ST</w:t>
+            </w:r>
           </w:p>
         </w:tc>
         <w:tc>
@@ -2171,7 +2211,15 @@
             <w:pPr>
               <w:pStyle w:val="Compact"/>
               <w:spacing w:before="40" w:after="40"/>
-            </w:pPr>
+              <w:jc w:val="left"/>
+            </w:pPr>
+            <w:r>
+              <w:rPr>
+                <w:rFonts w:ascii="Arial" w:hAnsi="Arial"/>
+                <w:sz w:val="20"/>
+              </w:rPr>
+              <w:t xml:space="preserve">23100 Deferred Revenue - ST</w:t>
+            </w:r>
           </w:p>
         </w:tc>
         <w:tc>
@@ -2407,7 +2455,15 @@
             <w:pPr>
               <w:pStyle w:val="Compact"/>
               <w:spacing w:before="40" w:after="40"/>
-            </w:pPr>
+              <w:jc w:val="left"/>
+            </w:pPr>
+            <w:r>
+              <w:rPr>
+                <w:rFonts w:ascii="Arial" w:hAnsi="Arial"/>
+                <w:sz w:val="20"/>
+              </w:rPr>
+              <w:t xml:space="preserve">23100 Deferred Revenue - ST</w:t>
+            </w:r>
           </w:p>
         </w:tc>
         <w:tc>
@@ -2643,7 +2699,15 @@
             <w:pPr>
               <w:pStyle w:val="Compact"/>
               <w:spacing w:before="40" w:after="40"/>
-            </w:pPr>
+              <w:jc w:val="left"/>
+            </w:pPr>
+            <w:r>
+              <w:rPr>
+                <w:rFonts w:ascii="Arial" w:hAnsi="Arial"/>
+                <w:sz w:val="20"/>
+              </w:rPr>
+              <w:t xml:space="preserve">23100 Deferred Revenue - ST</w:t>
+            </w:r>
           </w:p>
         </w:tc>
         <w:tc>
@@ -2879,7 +2943,15 @@
             <w:pPr>
               <w:pStyle w:val="Compact"/>
               <w:spacing w:before="40" w:after="40"/>
-            </w:pPr>
+              <w:jc w:val="left"/>
+            </w:pPr>
+            <w:r>
+              <w:rPr>
+                <w:rFonts w:ascii="Arial" w:hAnsi="Arial"/>
+                <w:sz w:val="20"/>
+              </w:rPr>
+              <w:t xml:space="preserve">23100 Deferred Revenue - ST</w:t>
+            </w:r>
           </w:p>
         </w:tc>
         <w:tc>
@@ -3115,7 +3187,15 @@
             <w:pPr>
               <w:pStyle w:val="Compact"/>
               <w:spacing w:before="40" w:after="40"/>
-            </w:pPr>
+              <w:jc w:val="left"/>
+            </w:pPr>
+            <w:r>
+              <w:rPr>
+                <w:rFonts w:ascii="Arial" w:hAnsi="Arial"/>
+                <w:sz w:val="20"/>
+              </w:rPr>
+              <w:t xml:space="preserve">23100 Deferred Revenue - ST</w:t>
+            </w:r>
           </w:p>
         </w:tc>
         <w:tc>
@@ -3351,7 +3431,15 @@
             <w:pPr>
               <w:pStyle w:val="Compact"/>
               <w:spacing w:before="40" w:after="40"/>
-            </w:pPr>
+              <w:jc w:val="left"/>
+            </w:pPr>
+            <w:r>
+              <w:rPr>
+                <w:rFonts w:ascii="Arial" w:hAnsi="Arial"/>
+                <w:sz w:val="20"/>
+              </w:rPr>
+              <w:t xml:space="preserve">23100 Deferred Revenue - ST</w:t>
+            </w:r>
           </w:p>
         </w:tc>
         <w:tc>
@@ -3446,10 +3534,10 @@
         <w:tblLayout w:type="fixed"/>
       </w:tblPr>
       <w:tblGrid>
-        <w:gridCol w:w="2379"/>
-        <w:gridCol w:w="3410"/>
-        <w:gridCol w:w="1903"/>
-        <w:gridCol w:w="1665"/>
+        <w:gridCol w:w="2529"/>
+        <w:gridCol w:w="2276"/>
+        <w:gridCol w:w="2276"/>
+        <w:gridCol w:w="2276"/>
       </w:tblGrid>
       <w:tr>
         <w:trPr>
@@ -3457,7 +3545,7 @@
         </w:trPr>
         <w:tc>
           <w:tcPr>
-            <w:tcW w:type="dxa" w:w="2379"/>
+            <w:tcW w:type="dxa" w:w="2529"/>
             <w:shd w:val="clear" w:color="auto" w:fill="1F3B5C"/>
           </w:tcPr>
           <w:p>
@@ -3480,7 +3568,7 @@
         </w:tc>
         <w:tc>
           <w:tcPr>
-            <w:tcW w:type="dxa" w:w="3410"/>
+            <w:tcW w:type="dxa" w:w="2276"/>
             <w:shd w:val="clear" w:color="auto" w:fill="1F3B5C"/>
           </w:tcPr>
           <w:p>
@@ -3503,7 +3591,7 @@
         </w:tc>
         <w:tc>
           <w:tcPr>
-            <w:tcW w:type="dxa" w:w="1903"/>
+            <w:tcW w:type="dxa" w:w="2276"/>
             <w:shd w:val="clear" w:color="auto" w:fill="1F3B5C"/>
           </w:tcPr>
           <w:p>
@@ -3526,7 +3614,7 @@
         </w:tc>
         <w:tc>
           <w:tcPr>
-            <w:tcW w:type="dxa" w:w="1665"/>
+            <w:tcW w:type="dxa" w:w="2276"/>
             <w:shd w:val="clear" w:color="auto" w:fill="1F3B5C"/>
           </w:tcPr>
           <w:p>
@@ -3551,7 +3639,7 @@
       <w:tr>
         <w:tc>
           <w:tcPr>
-            <w:tcW w:type="dxa" w:w="2379"/>
+            <w:tcW w:type="dxa" w:w="2529"/>
           </w:tcPr>
           <w:p>
             <w:pPr>
@@ -3572,7 +3660,7 @@
         </w:tc>
         <w:tc>
           <w:tcPr>
-            <w:tcW w:type="dxa" w:w="3410"/>
+            <w:tcW w:type="dxa" w:w="2276"/>
           </w:tcPr>
           <w:p>
             <w:pPr>
@@ -3591,7 +3679,7 @@
         </w:tc>
         <w:tc>
           <w:tcPr>
-            <w:tcW w:type="dxa" w:w="1903"/>
+            <w:tcW w:type="dxa" w:w="2276"/>
           </w:tcPr>
           <w:p>
             <w:pPr>
@@ -3610,7 +3698,7 @@
         </w:tc>
         <w:tc>
           <w:tcPr>
-            <w:tcW w:type="dxa" w:w="1665"/>
+            <w:tcW w:type="dxa" w:w="2276"/>
           </w:tcPr>
           <w:p>
             <w:pPr>
@@ -3631,7 +3719,7 @@
       <w:tr>
         <w:tc>
           <w:tcPr>
-            <w:tcW w:type="dxa" w:w="2379"/>
+            <w:tcW w:type="dxa" w:w="2529"/>
           </w:tcPr>
           <w:p>
             <w:pPr>
@@ -3652,7 +3740,7 @@
         </w:tc>
         <w:tc>
           <w:tcPr>
-            <w:tcW w:type="dxa" w:w="3410"/>
+            <w:tcW w:type="dxa" w:w="2276"/>
           </w:tcPr>
           <w:p>
             <w:pPr>
@@ -3671,7 +3759,7 @@
         </w:tc>
         <w:tc>
           <w:tcPr>
-            <w:tcW w:type="dxa" w:w="1903"/>
+            <w:tcW w:type="dxa" w:w="2276"/>
           </w:tcPr>
           <w:p>
             <w:pPr>
@@ -3690,7 +3778,7 @@
         </w:tc>
         <w:tc>
           <w:tcPr>
-            <w:tcW w:type="dxa" w:w="1665"/>
+            <w:tcW w:type="dxa" w:w="2276"/>
           </w:tcPr>
           <w:p>
             <w:pPr>
@@ -3711,7 +3799,7 @@
       <w:tr>
         <w:tc>
           <w:tcPr>
-            <w:tcW w:type="dxa" w:w="2379"/>
+            <w:tcW w:type="dxa" w:w="2529"/>
           </w:tcPr>
           <w:p>
             <w:pPr>
@@ -3732,7 +3820,7 @@
         </w:tc>
         <w:tc>
           <w:tcPr>
-            <w:tcW w:type="dxa" w:w="3410"/>
+            <w:tcW w:type="dxa" w:w="2276"/>
           </w:tcPr>
           <w:p>
             <w:pPr>
@@ -3751,7 +3839,7 @@
         </w:tc>
         <w:tc>
           <w:tcPr>
-            <w:tcW w:type="dxa" w:w="1903"/>
+            <w:tcW w:type="dxa" w:w="2276"/>
           </w:tcPr>
           <w:p>
             <w:pPr>
@@ -3770,7 +3858,7 @@
         </w:tc>
         <w:tc>
           <w:tcPr>
-            <w:tcW w:type="dxa" w:w="1665"/>
+            <w:tcW w:type="dxa" w:w="2276"/>
           </w:tcPr>
           <w:p>
             <w:pPr>
@@ -3791,7 +3879,7 @@
       <w:tr>
         <w:tc>
           <w:tcPr>
-            <w:tcW w:type="dxa" w:w="2379"/>
+            <w:tcW w:type="dxa" w:w="2529"/>
           </w:tcPr>
           <w:p>
             <w:pPr>
@@ -3812,58 +3900,58 @@
         </w:tc>
         <w:tc>
           <w:tcPr>
-            <w:tcW w:type="dxa" w:w="3410"/>
-          </w:tcPr>
-          <w:p>
-            <w:pPr>
-              <w:pStyle w:val="Compact"/>
-              <w:spacing w:before="40" w:after="40"/>
-              <w:jc w:val="left"/>
-            </w:pPr>
-            <w:r>
-              <w:rPr>
-                <w:rFonts w:ascii="Arial" w:hAnsi="Arial"/>
-                <w:sz w:val="20"/>
-              </w:rPr>
-              <w:t xml:space="preserve">[TBC: 23100 Deferred Revenue - ST proposed]</w:t>
-            </w:r>
-          </w:p>
-        </w:tc>
-        <w:tc>
-          <w:tcPr>
-            <w:tcW w:type="dxa" w:w="1903"/>
-          </w:tcPr>
-          <w:p>
-            <w:pPr>
-              <w:pStyle w:val="Compact"/>
-              <w:spacing w:before="40" w:after="40"/>
-              <w:jc w:val="left"/>
-            </w:pPr>
-            <w:r>
-              <w:rPr>
-                <w:rFonts w:ascii="Arial" w:hAnsi="Arial"/>
-                <w:sz w:val="20"/>
-              </w:rPr>
-              <w:t xml:space="preserve">[TBC]</w:t>
-            </w:r>
-          </w:p>
-        </w:tc>
-        <w:tc>
-          <w:tcPr>
-            <w:tcW w:type="dxa" w:w="1665"/>
-          </w:tcPr>
-          <w:p>
-            <w:pPr>
-              <w:pStyle w:val="Compact"/>
-              <w:spacing w:before="40" w:after="40"/>
-              <w:jc w:val="left"/>
-            </w:pPr>
-            <w:r>
-              <w:rPr>
-                <w:rFonts w:ascii="Arial" w:hAnsi="Arial"/>
-                <w:sz w:val="20"/>
-              </w:rPr>
-              <w:t xml:space="preserve">[TBC]</w:t>
+            <w:tcW w:type="dxa" w:w="2276"/>
+          </w:tcPr>
+          <w:p>
+            <w:pPr>
+              <w:pStyle w:val="Compact"/>
+              <w:spacing w:before="40" w:after="40"/>
+              <w:jc w:val="left"/>
+            </w:pPr>
+            <w:r>
+              <w:rPr>
+                <w:rFonts w:ascii="Arial" w:hAnsi="Arial"/>
+                <w:sz w:val="20"/>
+              </w:rPr>
+              <w:t xml:space="preserve">23100 Deferred Revenue - ST</w:t>
+            </w:r>
+          </w:p>
+        </w:tc>
+        <w:tc>
+          <w:tcPr>
+            <w:tcW w:type="dxa" w:w="2276"/>
+          </w:tcPr>
+          <w:p>
+            <w:pPr>
+              <w:pStyle w:val="Compact"/>
+              <w:spacing w:before="40" w:after="40"/>
+              <w:jc w:val="left"/>
+            </w:pPr>
+            <w:r>
+              <w:rPr>
+                <w:rFonts w:ascii="Arial" w:hAnsi="Arial"/>
+                <w:sz w:val="20"/>
+              </w:rPr>
+              <w:t xml:space="preserve">23100 Deferred Revenue - ST</w:t>
+            </w:r>
+          </w:p>
+        </w:tc>
+        <w:tc>
+          <w:tcPr>
+            <w:tcW w:type="dxa" w:w="2276"/>
+          </w:tcPr>
+          <w:p>
+            <w:pPr>
+              <w:pStyle w:val="Compact"/>
+              <w:spacing w:before="40" w:after="40"/>
+              <w:jc w:val="left"/>
+            </w:pPr>
+            <w:r>
+              <w:rPr>
+                <w:rFonts w:ascii="Arial" w:hAnsi="Arial"/>
+                <w:sz w:val="20"/>
+              </w:rPr>
+              <w:t xml:space="preserve">23100 Deferred Revenue - ST</w:t>
             </w:r>
           </w:p>
         </w:tc>
@@ -3871,7 +3959,7 @@
       <w:tr>
         <w:tc>
           <w:tcPr>
-            <w:tcW w:type="dxa" w:w="2379"/>
+            <w:tcW w:type="dxa" w:w="2529"/>
           </w:tcPr>
           <w:p>
             <w:pPr>
@@ -3892,7 +3980,7 @@
         </w:tc>
         <w:tc>
           <w:tcPr>
-            <w:tcW w:type="dxa" w:w="3410"/>
+            <w:tcW w:type="dxa" w:w="2276"/>
           </w:tcPr>
           <w:p>
             <w:pPr>
@@ -3911,7 +3999,7 @@
         </w:tc>
         <w:tc>
           <w:tcPr>
-            <w:tcW w:type="dxa" w:w="1903"/>
+            <w:tcW w:type="dxa" w:w="2276"/>
           </w:tcPr>
           <w:p>
             <w:pPr>
@@ -3930,7 +4018,7 @@
         </w:tc>
         <w:tc>
           <w:tcPr>
-            <w:tcW w:type="dxa" w:w="1665"/>
+            <w:tcW w:type="dxa" w:w="2276"/>
           </w:tcPr>
           <w:p>
             <w:pPr>
@@ -3951,7 +4039,7 @@
       <w:tr>
         <w:tc>
           <w:tcPr>
-            <w:tcW w:type="dxa" w:w="2379"/>
+            <w:tcW w:type="dxa" w:w="2529"/>
           </w:tcPr>
           <w:p>
             <w:pPr>
@@ -3972,7 +4060,7 @@
         </w:tc>
         <w:tc>
           <w:tcPr>
-            <w:tcW w:type="dxa" w:w="3410"/>
+            <w:tcW w:type="dxa" w:w="2276"/>
           </w:tcPr>
           <w:p>
             <w:pPr>
@@ -3991,7 +4079,7 @@
         </w:tc>
         <w:tc>
           <w:tcPr>
-            <w:tcW w:type="dxa" w:w="1903"/>
+            <w:tcW w:type="dxa" w:w="2276"/>
           </w:tcPr>
           <w:p>
             <w:pPr>
@@ -4010,7 +4098,7 @@
         </w:tc>
         <w:tc>
           <w:tcPr>
-            <w:tcW w:type="dxa" w:w="1665"/>
+            <w:tcW w:type="dxa" w:w="2276"/>
           </w:tcPr>
           <w:p>
             <w:pPr>
@@ -4377,28 +4465,6 @@
       </w:pPr>
       <w:r>
         <w:t xml:space="preserve">Open questions</w:t>
-      </w:r>
-    </w:p>
-    <w:p>
-      <w:pPr>
-        <w:numPr>
-          <w:ilvl w:val="0"/>
-          <w:numId w:val="1001"/>
-        </w:numPr>
-        <w:pStyle w:val="Compact"/>
-      </w:pPr>
-      <w:r>
-        <w:rPr>
-          <w:bCs/>
-          <w:b/>
-        </w:rPr>
-        <w:t xml:space="preserve">Deferred Revenue account.</w:t>
-      </w:r>
-      <w:r>
-        <w:t xml:space="preserve"> </w:t>
-      </w:r>
-      <w:r>
-        <w:t xml:space="preserve">COA Draft v1 has 23100 Deferred Revenue - ST, 23200 Deferred Revenue - LT, and under 23200: 23210 Deferred Revenue Unbilled, 23220 Deferred Revenue Billed, 23230 Deferred Revenue Paid. Which one do the items post to? An item takes one account, so NetSuite does not split short and long term on the transaction. Proposed: post to 23100 and reclass the part beyond 12 months to 23200 with a period-end journal entry. Unbilled, Billed and Paid look carried over from Sage’s contract revenue setup; confirm whether they are still needed.</w:t>
       </w:r>
     </w:p>
     <w:p>
@@ -4577,6 +4643,50 @@
       </w:r>
       <w:r>
         <w:t xml:space="preserve">. Kept as is; it only needs to match when mapping the import.</w:t>
+      </w:r>
+    </w:p>
+    <w:p>
+      <w:pPr>
+        <w:numPr>
+          <w:ilvl w:val="0"/>
+          <w:numId w:val="1001"/>
+        </w:numPr>
+        <w:pStyle w:val="Compact"/>
+      </w:pPr>
+      <w:r>
+        <w:rPr>
+          <w:bCs/>
+          <w:b/>
+        </w:rPr>
+        <w:t xml:space="preserve">Long-term deferred revenue.</w:t>
+      </w:r>
+      <w:r>
+        <w:t xml:space="preserve"> </w:t>
+      </w:r>
+      <w:r>
+        <w:t xml:space="preserve">Items post to 23100 Deferred Revenue - ST. The part earned more than 12 months out is reclassed to 23200 Deferred Revenue - LT by a period-end journal entry. Confirm the Unbilled, Billed and Paid accounts under 23200 are still needed.</w:t>
+      </w:r>
+    </w:p>
+    <w:p>
+      <w:pPr>
+        <w:numPr>
+          <w:ilvl w:val="0"/>
+          <w:numId w:val="1001"/>
+        </w:numPr>
+        <w:pStyle w:val="Compact"/>
+      </w:pPr>
+      <w:r>
+        <w:rPr>
+          <w:bCs/>
+          <w:b/>
+        </w:rPr>
+        <w:t xml:space="preserve">Show Display Name with Item Codes.</w:t>
+      </w:r>
+      <w:r>
+        <w:t xml:space="preserve"> </w:t>
+      </w:r>
+      <w:r>
+        <w:t xml:space="preserve">Setup &gt; Company &gt; General Preferences. Shows code and name together in item fields. If turned on, later CSV imports that reference items need the display name too, or fail with Invalid Parent Reference Key. Decide before the sales order and invoice loads.</w:t>
       </w:r>
     </w:p>
     <w:bookmarkEnd w:id="24"/>

</xml_diff>

<commit_message>
Non-inventory items: sales descriptions
Co-Authored-By: Claude Opus 5.5 <noreply@anthropic.com>
Claude-Session: https://claude.ai/code/session_01RcSpRnw5TDsnk5GdoeWT9P
</commit_message>
<xml_diff>
--- a/netsuite/dataload/noninventory-items/output/noninventory-items.docx
+++ b/netsuite/dataload/noninventory-items/output/noninventory-items.docx
@@ -280,7 +280,7 @@
                 <w:rFonts w:ascii="Arial" w:hAnsi="Arial"/>
                 <w:sz w:val="20"/>
               </w:rPr>
-              <w:t xml:space="preserve">External ID, Item Name, Display Name/Code, Class, Subsidiary, Include Children, Income account, Deferred Revenue account</w:t>
+              <w:t xml:space="preserve">External ID, Item Name, Display Name/Code, Class, Subsidiary, Include Children, Sales Description, Income account, Deferred Revenue account</w:t>
             </w:r>
           </w:p>
         </w:tc>
@@ -323,7 +323,7 @@
                 <w:rFonts w:ascii="Arial" w:hAnsi="Arial"/>
                 <w:sz w:val="20"/>
               </w:rPr>
-              <w:t xml:space="preserve">7 columns. Department stays blank for now. Most are set per item group, under Values by group</w:t>
+              <w:t xml:space="preserve">6 columns. Department stays blank for now. Most are set per item group, under Values by group</w:t>
             </w:r>
           </w:p>
         </w:tc>
@@ -424,8 +424,14 @@
         <w:tblLayout w:type="fixed"/>
       </w:tblPr>
       <w:tblGrid>
-        <w:gridCol w:w="-952"/>
-        <w:gridCol w:w="-952"/>
+        <w:gridCol w:w="936"/>
+        <w:gridCol w:w="936"/>
+        <w:gridCol w:w="936"/>
+        <w:gridCol w:w="936"/>
+        <w:gridCol w:w="936"/>
+        <w:gridCol w:w="936"/>
+        <w:gridCol w:w="936"/>
+        <w:gridCol w:w="-4680"/>
         <w:gridCol w:w="936"/>
         <w:gridCol w:w="936"/>
         <w:gridCol w:w="936"/>
@@ -434,12 +440,6 @@
         <w:gridCol w:w="936"/>
         <w:gridCol w:w="936"/>
         <w:gridCol w:w="936"/>
-        <w:gridCol w:w="936"/>
-        <w:gridCol w:w="936"/>
-        <w:gridCol w:w="936"/>
-        <w:gridCol w:w="936"/>
-        <w:gridCol w:w="936"/>
-        <w:gridCol w:w="-902"/>
       </w:tblGrid>
       <w:tr>
         <w:trPr>
@@ -447,7 +447,7 @@
         </w:trPr>
         <w:tc>
           <w:tcPr>
-            <w:tcW w:type="dxa" w:w="-952"/>
+            <w:tcW w:type="dxa" w:w="936"/>
             <w:shd w:val="clear" w:color="auto" w:fill="1F3B5C"/>
           </w:tcPr>
           <w:p>
@@ -470,7 +470,7 @@
         </w:tc>
         <w:tc>
           <w:tcPr>
-            <w:tcW w:type="dxa" w:w="-952"/>
+            <w:tcW w:type="dxa" w:w="936"/>
             <w:shd w:val="clear" w:color="auto" w:fill="1F3B5C"/>
           </w:tcPr>
           <w:p>
@@ -608,7 +608,7 @@
         </w:tc>
         <w:tc>
           <w:tcPr>
-            <w:tcW w:type="dxa" w:w="936"/>
+            <w:tcW w:type="dxa" w:w="-4680"/>
             <w:shd w:val="clear" w:color="auto" w:fill="1F3B5C"/>
           </w:tcPr>
           <w:p>
@@ -792,7 +792,7 @@
         </w:tc>
         <w:tc>
           <w:tcPr>
-            <w:tcW w:type="dxa" w:w="-902"/>
+            <w:tcW w:type="dxa" w:w="936"/>
             <w:shd w:val="clear" w:color="auto" w:fill="1F3B5C"/>
           </w:tcPr>
           <w:p>
@@ -817,7 +817,7 @@
       <w:tr>
         <w:tc>
           <w:tcPr>
-            <w:tcW w:type="dxa" w:w="-952"/>
+            <w:tcW w:type="dxa" w:w="936"/>
           </w:tcPr>
           <w:p>
             <w:pPr>
@@ -838,7 +838,7 @@
         </w:tc>
         <w:tc>
           <w:tcPr>
-            <w:tcW w:type="dxa" w:w="-952"/>
+            <w:tcW w:type="dxa" w:w="936"/>
           </w:tcPr>
           <w:p>
             <w:pPr>
@@ -944,13 +944,21 @@
         </w:tc>
         <w:tc>
           <w:tcPr>
-            <w:tcW w:type="dxa" w:w="936"/>
-          </w:tcPr>
-          <w:p>
-            <w:pPr>
-              <w:pStyle w:val="Compact"/>
-              <w:spacing w:before="40" w:after="40"/>
-            </w:pPr>
+            <w:tcW w:type="dxa" w:w="-4680"/>
+          </w:tcPr>
+          <w:p>
+            <w:pPr>
+              <w:pStyle w:val="Compact"/>
+              <w:spacing w:before="40" w:after="40"/>
+              <w:jc w:val="left"/>
+            </w:pPr>
+            <w:r>
+              <w:rPr>
+                <w:rFonts w:ascii="Arial" w:hAnsi="Arial"/>
+                <w:sz w:val="20"/>
+              </w:rPr>
+              <w:t xml:space="preserve">MinIO support: direct-to-engineer support through SUBNET with a 1-hour response SLA and unlimited Panic Buttons.</w:t>
+            </w:r>
           </w:p>
         </w:tc>
         <w:tc>
@@ -1048,7 +1056,7 @@
         </w:tc>
         <w:tc>
           <w:tcPr>
-            <w:tcW w:type="dxa" w:w="-902"/>
+            <w:tcW w:type="dxa" w:w="936"/>
           </w:tcPr>
           <w:p>
             <w:pPr>
@@ -1061,7 +1069,7 @@
       <w:tr>
         <w:tc>
           <w:tcPr>
-            <w:tcW w:type="dxa" w:w="-952"/>
+            <w:tcW w:type="dxa" w:w="936"/>
           </w:tcPr>
           <w:p>
             <w:pPr>
@@ -1082,7 +1090,7 @@
         </w:tc>
         <w:tc>
           <w:tcPr>
-            <w:tcW w:type="dxa" w:w="-952"/>
+            <w:tcW w:type="dxa" w:w="936"/>
           </w:tcPr>
           <w:p>
             <w:pPr>
@@ -1188,13 +1196,21 @@
         </w:tc>
         <w:tc>
           <w:tcPr>
-            <w:tcW w:type="dxa" w:w="936"/>
-          </w:tcPr>
-          <w:p>
-            <w:pPr>
-              <w:pStyle w:val="Compact"/>
-              <w:spacing w:before="40" w:after="40"/>
-            </w:pPr>
+            <w:tcW w:type="dxa" w:w="-4680"/>
+          </w:tcPr>
+          <w:p>
+            <w:pPr>
+              <w:pStyle w:val="Compact"/>
+              <w:spacing w:before="40" w:after="40"/>
+              <w:jc w:val="left"/>
+            </w:pPr>
+            <w:r>
+              <w:rPr>
+                <w:rFonts w:ascii="Arial" w:hAnsi="Arial"/>
+                <w:sz w:val="20"/>
+              </w:rPr>
+              <w:t xml:space="preserve">MinIO support: direct-to-engineer support through SUBNET with a 4-hour response SLA and unlimited Panic Buttons.</w:t>
+            </w:r>
           </w:p>
         </w:tc>
         <w:tc>
@@ -1292,7 +1308,7 @@
         </w:tc>
         <w:tc>
           <w:tcPr>
-            <w:tcW w:type="dxa" w:w="-902"/>
+            <w:tcW w:type="dxa" w:w="936"/>
           </w:tcPr>
           <w:p>
             <w:pPr>
@@ -1305,7 +1321,7 @@
       <w:tr>
         <w:tc>
           <w:tcPr>
-            <w:tcW w:type="dxa" w:w="-952"/>
+            <w:tcW w:type="dxa" w:w="936"/>
           </w:tcPr>
           <w:p>
             <w:pPr>
@@ -1326,7 +1342,7 @@
         </w:tc>
         <w:tc>
           <w:tcPr>
-            <w:tcW w:type="dxa" w:w="-952"/>
+            <w:tcW w:type="dxa" w:w="936"/>
           </w:tcPr>
           <w:p>
             <w:pPr>
@@ -1432,13 +1448,21 @@
         </w:tc>
         <w:tc>
           <w:tcPr>
-            <w:tcW w:type="dxa" w:w="936"/>
-          </w:tcPr>
-          <w:p>
-            <w:pPr>
-              <w:pStyle w:val="Compact"/>
-              <w:spacing w:before="40" w:after="40"/>
-            </w:pPr>
+            <w:tcW w:type="dxa" w:w="-4680"/>
+          </w:tcPr>
+          <w:p>
+            <w:pPr>
+              <w:pStyle w:val="Compact"/>
+              <w:spacing w:before="40" w:after="40"/>
+              <w:jc w:val="left"/>
+            </w:pPr>
+            <w:r>
+              <w:rPr>
+                <w:rFonts w:ascii="Arial" w:hAnsi="Arial"/>
+                <w:sz w:val="20"/>
+              </w:rPr>
+              <w:t xml:space="preserve">MinIO support: direct-to-engineer support through SUBNET with a 24-hour response SLA and 1 Panic Button per year.</w:t>
+            </w:r>
           </w:p>
         </w:tc>
         <w:tc>
@@ -1536,7 +1560,7 @@
         </w:tc>
         <w:tc>
           <w:tcPr>
-            <w:tcW w:type="dxa" w:w="-902"/>
+            <w:tcW w:type="dxa" w:w="936"/>
           </w:tcPr>
           <w:p>
             <w:pPr>
@@ -1549,7 +1573,7 @@
       <w:tr>
         <w:tc>
           <w:tcPr>
-            <w:tcW w:type="dxa" w:w="-952"/>
+            <w:tcW w:type="dxa" w:w="936"/>
           </w:tcPr>
           <w:p>
             <w:pPr>
@@ -1570,7 +1594,7 @@
         </w:tc>
         <w:tc>
           <w:tcPr>
-            <w:tcW w:type="dxa" w:w="-952"/>
+            <w:tcW w:type="dxa" w:w="936"/>
           </w:tcPr>
           <w:p>
             <w:pPr>
@@ -1676,13 +1700,21 @@
         </w:tc>
         <w:tc>
           <w:tcPr>
-            <w:tcW w:type="dxa" w:w="936"/>
-          </w:tcPr>
-          <w:p>
-            <w:pPr>
-              <w:pStyle w:val="Compact"/>
-              <w:spacing w:before="40" w:after="40"/>
-            </w:pPr>
+            <w:tcW w:type="dxa" w:w="-4680"/>
+          </w:tcPr>
+          <w:p>
+            <w:pPr>
+              <w:pStyle w:val="Compact"/>
+              <w:spacing w:before="40" w:after="40"/>
+              <w:jc w:val="left"/>
+            </w:pPr>
+            <w:r>
+              <w:rPr>
+                <w:rFonts w:ascii="Arial" w:hAnsi="Arial"/>
+                <w:sz w:val="20"/>
+              </w:rPr>
+              <w:t xml:space="preserve">MinIO support: direct-to-engineer support through SUBNET with a 48-hour response SLA and 1 Panic Button per year.</w:t>
+            </w:r>
           </w:p>
         </w:tc>
         <w:tc>
@@ -1780,7 +1812,7 @@
         </w:tc>
         <w:tc>
           <w:tcPr>
-            <w:tcW w:type="dxa" w:w="-902"/>
+            <w:tcW w:type="dxa" w:w="936"/>
           </w:tcPr>
           <w:p>
             <w:pPr>
@@ -1793,7 +1825,7 @@
       <w:tr>
         <w:tc>
           <w:tcPr>
-            <w:tcW w:type="dxa" w:w="-952"/>
+            <w:tcW w:type="dxa" w:w="936"/>
           </w:tcPr>
           <w:p>
             <w:pPr>
@@ -1814,7 +1846,7 @@
         </w:tc>
         <w:tc>
           <w:tcPr>
-            <w:tcW w:type="dxa" w:w="-952"/>
+            <w:tcW w:type="dxa" w:w="936"/>
           </w:tcPr>
           <w:p>
             <w:pPr>
@@ -1920,13 +1952,21 @@
         </w:tc>
         <w:tc>
           <w:tcPr>
-            <w:tcW w:type="dxa" w:w="936"/>
-          </w:tcPr>
-          <w:p>
-            <w:pPr>
-              <w:pStyle w:val="Compact"/>
-              <w:spacing w:before="40" w:after="40"/>
-            </w:pPr>
+            <w:tcW w:type="dxa" w:w="-4680"/>
+          </w:tcPr>
+          <w:p>
+            <w:pPr>
+              <w:pStyle w:val="Compact"/>
+              <w:spacing w:before="40" w:after="40"/>
+              <w:jc w:val="left"/>
+            </w:pPr>
+            <w:r>
+              <w:rPr>
+                <w:rFonts w:ascii="Arial" w:hAnsi="Arial"/>
+                <w:sz w:val="20"/>
+              </w:rPr>
+              <w:t xml:space="preserve">MinIO support: direct-to-engineer support through SUBNET with a 5-business-day response SLA. No Panic Buttons.</w:t>
+            </w:r>
           </w:p>
         </w:tc>
         <w:tc>
@@ -2024,7 +2064,7 @@
         </w:tc>
         <w:tc>
           <w:tcPr>
-            <w:tcW w:type="dxa" w:w="-902"/>
+            <w:tcW w:type="dxa" w:w="936"/>
           </w:tcPr>
           <w:p>
             <w:pPr>
@@ -2037,7 +2077,7 @@
       <w:tr>
         <w:tc>
           <w:tcPr>
-            <w:tcW w:type="dxa" w:w="-952"/>
+            <w:tcW w:type="dxa" w:w="936"/>
           </w:tcPr>
           <w:p>
             <w:pPr>
@@ -2058,7 +2098,7 @@
         </w:tc>
         <w:tc>
           <w:tcPr>
-            <w:tcW w:type="dxa" w:w="-952"/>
+            <w:tcW w:type="dxa" w:w="936"/>
           </w:tcPr>
           <w:p>
             <w:pPr>
@@ -2164,13 +2204,21 @@
         </w:tc>
         <w:tc>
           <w:tcPr>
-            <w:tcW w:type="dxa" w:w="936"/>
-          </w:tcPr>
-          <w:p>
-            <w:pPr>
-              <w:pStyle w:val="Compact"/>
-              <w:spacing w:before="40" w:after="40"/>
-            </w:pPr>
+            <w:tcW w:type="dxa" w:w="-4680"/>
+          </w:tcPr>
+          <w:p>
+            <w:pPr>
+              <w:pStyle w:val="Compact"/>
+              <w:spacing w:before="40" w:after="40"/>
+              <w:jc w:val="left"/>
+            </w:pPr>
+            <w:r>
+              <w:rPr>
+                <w:rFonts w:ascii="Arial" w:hAnsi="Arial"/>
+                <w:sz w:val="20"/>
+              </w:rPr>
+              <w:t xml:space="preserve">MinIO training: 3-day live virtual class.</w:t>
+            </w:r>
           </w:p>
         </w:tc>
         <w:tc>
@@ -2268,7 +2316,7 @@
         </w:tc>
         <w:tc>
           <w:tcPr>
-            <w:tcW w:type="dxa" w:w="-902"/>
+            <w:tcW w:type="dxa" w:w="936"/>
           </w:tcPr>
           <w:p>
             <w:pPr>
@@ -2281,7 +2329,7 @@
       <w:tr>
         <w:tc>
           <w:tcPr>
-            <w:tcW w:type="dxa" w:w="-952"/>
+            <w:tcW w:type="dxa" w:w="936"/>
           </w:tcPr>
           <w:p>
             <w:pPr>
@@ -2302,7 +2350,7 @@
         </w:tc>
         <w:tc>
           <w:tcPr>
-            <w:tcW w:type="dxa" w:w="-952"/>
+            <w:tcW w:type="dxa" w:w="936"/>
           </w:tcPr>
           <w:p>
             <w:pPr>
@@ -2408,13 +2456,21 @@
         </w:tc>
         <w:tc>
           <w:tcPr>
-            <w:tcW w:type="dxa" w:w="936"/>
-          </w:tcPr>
-          <w:p>
-            <w:pPr>
-              <w:pStyle w:val="Compact"/>
-              <w:spacing w:before="40" w:after="40"/>
-            </w:pPr>
+            <w:tcW w:type="dxa" w:w="-4680"/>
+          </w:tcPr>
+          <w:p>
+            <w:pPr>
+              <w:pStyle w:val="Compact"/>
+              <w:spacing w:before="40" w:after="40"/>
+              <w:jc w:val="left"/>
+            </w:pPr>
+            <w:r>
+              <w:rPr>
+                <w:rFonts w:ascii="Arial" w:hAnsi="Arial"/>
+                <w:sz w:val="20"/>
+              </w:rPr>
+              <w:t xml:space="preserve">MinIO training: 4-day live virtual class.</w:t>
+            </w:r>
           </w:p>
         </w:tc>
         <w:tc>
@@ -2512,7 +2568,7 @@
         </w:tc>
         <w:tc>
           <w:tcPr>
-            <w:tcW w:type="dxa" w:w="-902"/>
+            <w:tcW w:type="dxa" w:w="936"/>
           </w:tcPr>
           <w:p>
             <w:pPr>
@@ -2525,7 +2581,7 @@
       <w:tr>
         <w:tc>
           <w:tcPr>
-            <w:tcW w:type="dxa" w:w="-952"/>
+            <w:tcW w:type="dxa" w:w="936"/>
           </w:tcPr>
           <w:p>
             <w:pPr>
@@ -2546,7 +2602,7 @@
         </w:tc>
         <w:tc>
           <w:tcPr>
-            <w:tcW w:type="dxa" w:w="-952"/>
+            <w:tcW w:type="dxa" w:w="936"/>
           </w:tcPr>
           <w:p>
             <w:pPr>
@@ -2652,13 +2708,21 @@
         </w:tc>
         <w:tc>
           <w:tcPr>
-            <w:tcW w:type="dxa" w:w="936"/>
-          </w:tcPr>
-          <w:p>
-            <w:pPr>
-              <w:pStyle w:val="Compact"/>
-              <w:spacing w:before="40" w:after="40"/>
-            </w:pPr>
+            <w:tcW w:type="dxa" w:w="-4680"/>
+          </w:tcPr>
+          <w:p>
+            <w:pPr>
+              <w:pStyle w:val="Compact"/>
+              <w:spacing w:before="40" w:after="40"/>
+              <w:jc w:val="left"/>
+            </w:pPr>
+            <w:r>
+              <w:rPr>
+                <w:rFonts w:ascii="Arial" w:hAnsi="Arial"/>
+                <w:sz w:val="20"/>
+              </w:rPr>
+              <w:t xml:space="preserve">MinIO Learning Subscription for one learner: on-demand courses and hands-on labs on the MinIO Academy platform.</w:t>
+            </w:r>
           </w:p>
         </w:tc>
         <w:tc>
@@ -2756,7 +2820,7 @@
         </w:tc>
         <w:tc>
           <w:tcPr>
-            <w:tcW w:type="dxa" w:w="-902"/>
+            <w:tcW w:type="dxa" w:w="936"/>
           </w:tcPr>
           <w:p>
             <w:pPr>
@@ -2769,7 +2833,7 @@
       <w:tr>
         <w:tc>
           <w:tcPr>
-            <w:tcW w:type="dxa" w:w="-952"/>
+            <w:tcW w:type="dxa" w:w="936"/>
           </w:tcPr>
           <w:p>
             <w:pPr>
@@ -2790,7 +2854,7 @@
         </w:tc>
         <w:tc>
           <w:tcPr>
-            <w:tcW w:type="dxa" w:w="-952"/>
+            <w:tcW w:type="dxa" w:w="936"/>
           </w:tcPr>
           <w:p>
             <w:pPr>
@@ -2896,13 +2960,21 @@
         </w:tc>
         <w:tc>
           <w:tcPr>
-            <w:tcW w:type="dxa" w:w="936"/>
-          </w:tcPr>
-          <w:p>
-            <w:pPr>
-              <w:pStyle w:val="Compact"/>
-              <w:spacing w:before="40" w:after="40"/>
-            </w:pPr>
+            <w:tcW w:type="dxa" w:w="-4680"/>
+          </w:tcPr>
+          <w:p>
+            <w:pPr>
+              <w:pStyle w:val="Compact"/>
+              <w:spacing w:before="40" w:after="40"/>
+              <w:jc w:val="left"/>
+            </w:pPr>
+            <w:r>
+              <w:rPr>
+                <w:rFonts w:ascii="Arial" w:hAnsi="Arial"/>
+                <w:sz w:val="20"/>
+              </w:rPr>
+              <w:t xml:space="preserve">MinIO AIStor software license.</w:t>
+            </w:r>
           </w:p>
         </w:tc>
         <w:tc>
@@ -3000,7 +3072,7 @@
         </w:tc>
         <w:tc>
           <w:tcPr>
-            <w:tcW w:type="dxa" w:w="-902"/>
+            <w:tcW w:type="dxa" w:w="936"/>
           </w:tcPr>
           <w:p>
             <w:pPr>
@@ -3013,7 +3085,7 @@
       <w:tr>
         <w:tc>
           <w:tcPr>
-            <w:tcW w:type="dxa" w:w="-952"/>
+            <w:tcW w:type="dxa" w:w="936"/>
           </w:tcPr>
           <w:p>
             <w:pPr>
@@ -3034,7 +3106,7 @@
         </w:tc>
         <w:tc>
           <w:tcPr>
-            <w:tcW w:type="dxa" w:w="-952"/>
+            <w:tcW w:type="dxa" w:w="936"/>
           </w:tcPr>
           <w:p>
             <w:pPr>
@@ -3140,13 +3212,21 @@
         </w:tc>
         <w:tc>
           <w:tcPr>
-            <w:tcW w:type="dxa" w:w="936"/>
-          </w:tcPr>
-          <w:p>
-            <w:pPr>
-              <w:pStyle w:val="Compact"/>
-              <w:spacing w:before="40" w:after="40"/>
-            </w:pPr>
+            <w:tcW w:type="dxa" w:w="-4680"/>
+          </w:tcPr>
+          <w:p>
+            <w:pPr>
+              <w:pStyle w:val="Compact"/>
+              <w:spacing w:before="40" w:after="40"/>
+              <w:jc w:val="left"/>
+            </w:pPr>
+            <w:r>
+              <w:rPr>
+                <w:rFonts w:ascii="Arial" w:hAnsi="Arial"/>
+                <w:sz w:val="20"/>
+              </w:rPr>
+              <w:t xml:space="preserve">MinIO AIStor software license for OEM partners, for resale to their customers.</w:t>
+            </w:r>
           </w:p>
         </w:tc>
         <w:tc>
@@ -3244,7 +3324,7 @@
         </w:tc>
         <w:tc>
           <w:tcPr>
-            <w:tcW w:type="dxa" w:w="-902"/>
+            <w:tcW w:type="dxa" w:w="936"/>
           </w:tcPr>
           <w:p>
             <w:pPr>
@@ -3257,7 +3337,7 @@
       <w:tr>
         <w:tc>
           <w:tcPr>
-            <w:tcW w:type="dxa" w:w="-952"/>
+            <w:tcW w:type="dxa" w:w="936"/>
           </w:tcPr>
           <w:p>
             <w:pPr>
@@ -3278,7 +3358,7 @@
         </w:tc>
         <w:tc>
           <w:tcPr>
-            <w:tcW w:type="dxa" w:w="-952"/>
+            <w:tcW w:type="dxa" w:w="936"/>
           </w:tcPr>
           <w:p>
             <w:pPr>
@@ -3384,13 +3464,21 @@
         </w:tc>
         <w:tc>
           <w:tcPr>
-            <w:tcW w:type="dxa" w:w="936"/>
-          </w:tcPr>
-          <w:p>
-            <w:pPr>
-              <w:pStyle w:val="Compact"/>
-              <w:spacing w:before="40" w:after="40"/>
-            </w:pPr>
+            <w:tcW w:type="dxa" w:w="-4680"/>
+          </w:tcPr>
+          <w:p>
+            <w:pPr>
+              <w:pStyle w:val="Compact"/>
+              <w:spacing w:before="40" w:after="40"/>
+              <w:jc w:val="left"/>
+            </w:pPr>
+            <w:r>
+              <w:rPr>
+                <w:rFonts w:ascii="Arial" w:hAnsi="Arial"/>
+                <w:sz w:val="20"/>
+              </w:rPr>
+              <w:t xml:space="preserve">MinIO MemKV software license: distributed context memory store for AI inference.</w:t>
+            </w:r>
           </w:p>
         </w:tc>
         <w:tc>
@@ -3488,7 +3576,7 @@
         </w:tc>
         <w:tc>
           <w:tcPr>
-            <w:tcW w:type="dxa" w:w="-902"/>
+            <w:tcW w:type="dxa" w:w="936"/>
           </w:tcPr>
           <w:p>
             <w:pPr>
@@ -4279,7 +4367,7 @@
                 <w:rFonts w:ascii="Arial" w:hAnsi="Arial"/>
                 <w:sz w:val="20"/>
               </w:rPr>
-              <w:t xml:space="preserve">[TBC: repeat the Display Name/Code, or other text]</w:t>
+              <w:t xml:space="preserve">Set per item, in the load file. No terms, dates or prices</w:t>
             </w:r>
           </w:p>
         </w:tc>
@@ -4564,7 +4652,7 @@
         <w:t xml:space="preserve"> </w:t>
       </w:r>
       <w:r>
-        <w:t xml:space="preserve">Do these items have list prices?</w:t>
+        <w:t xml:space="preserve">Do these items have list prices? How AIStor and MemKV licenses are measured (for example per TiB) is not known or may not be standard; the license descriptions leave the unit out for now.</w:t>
       </w:r>
     </w:p>
     <w:p>

</xml_diff>

<commit_message>
Non-inventory items: license delivery trigger question
Co-Authored-By: Claude Opus 5.5 <noreply@anthropic.com>
Claude-Session: https://claude.ai/code/session_01RcSpRnw5TDsnk5GdoeWT9P
</commit_message>
<xml_diff>
--- a/netsuite/dataload/noninventory-items/output/noninventory-items.docx
+++ b/netsuite/dataload/noninventory-items/output/noninventory-items.docx
@@ -4775,6 +4775,28 @@
       </w:r>
       <w:r>
         <w:t xml:space="preserve">Setup &gt; Company &gt; General Preferences. Shows code and name together in item fields. If turned on, later CSV imports that reference items need the display name too, or fail with Invalid Parent Reference Key. Decide before the sales order and invoice loads.</w:t>
+      </w:r>
+    </w:p>
+    <w:p>
+      <w:pPr>
+        <w:numPr>
+          <w:ilvl w:val="0"/>
+          <w:numId w:val="1001"/>
+        </w:numPr>
+        <w:pStyle w:val="Compact"/>
+      </w:pPr>
+      <w:r>
+        <w:rPr>
+          <w:bCs/>
+          <w:b/>
+        </w:rPr>
+        <w:t xml:space="preserve">License delivery trigger.</w:t>
+      </w:r>
+      <w:r>
+        <w:t xml:space="preserve"> </w:t>
+      </w:r>
+      <w:r>
+        <w:t xml:space="preserve">License keys are issued manually; the issue date (available in BigQuery operating data) should drive invoicing and the revenue start. Options: (a) Can be fulfilled/received = Yes on license items and a fulfillment posted when the key is issued, with revenue plans created on fulfillment; (b) a custom revenue recognition event, created by script or integration; (c) no fulfillment, with the revenue start date set on the order line from the key issue date. Decide before the load: whether Can be fulfilled/received can change after items are used on transactions is unclear.</w:t>
       </w:r>
     </w:p>
     <w:bookmarkEnd w:id="24"/>

</xml_diff>

<commit_message>
Non-inventory items: rules and base price blank on purpose; portal sales question
Co-Authored-By: Claude Opus 5.5 <noreply@anthropic.com>
Claude-Session: https://claude.ai/code/session_01RcSpRnw5TDsnk5GdoeWT9P
</commit_message>
<xml_diff>
--- a/netsuite/dataload/noninventory-items/output/noninventory-items.docx
+++ b/netsuite/dataload/noninventory-items/output/noninventory-items.docx
@@ -304,7 +304,7 @@
                 <w:b/>
                 <w:sz w:val="20"/>
               </w:rPr>
-              <w:t xml:space="preserve">Open</w:t>
+              <w:t xml:space="preserve">Blank on purpose</w:t>
             </w:r>
           </w:p>
         </w:tc>
@@ -323,7 +323,7 @@
                 <w:rFonts w:ascii="Arial" w:hAnsi="Arial"/>
                 <w:sz w:val="20"/>
               </w:rPr>
-              <w:t xml:space="preserve">6 columns. Department stays blank for now. Most are set per item group, under Values by group</w:t>
+              <w:t xml:space="preserve">Department, Base Price, Revenue Recogition Rule, Rev Rec Forecast Rule. No revenue recognition rules are set up yet</w:t>
             </w:r>
           </w:p>
         </w:tc>
@@ -347,6 +347,49 @@
                 <w:b/>
                 <w:sz w:val="20"/>
               </w:rPr>
+              <w:t xml:space="preserve">Open</w:t>
+            </w:r>
+          </w:p>
+        </w:tc>
+        <w:tc>
+          <w:tcPr>
+            <w:tcW w:type="dxa" w:w="6739"/>
+          </w:tcPr>
+          <w:p>
+            <w:pPr>
+              <w:pStyle w:val="Compact"/>
+              <w:spacing w:before="40" w:after="40"/>
+              <w:jc w:val="left"/>
+            </w:pPr>
+            <w:r>
+              <w:rPr>
+                <w:rFonts w:ascii="Arial" w:hAnsi="Arial"/>
+                <w:sz w:val="20"/>
+              </w:rPr>
+              <w:t xml:space="preserve">Create Revenue Plans On, Direct Revenue Posting, Can be fulfilled/received</w:t>
+            </w:r>
+          </w:p>
+        </w:tc>
+      </w:tr>
+      <w:tr>
+        <w:tc>
+          <w:tcPr>
+            <w:tcW w:type="dxa" w:w="2620"/>
+            <w:shd w:val="clear" w:color="auto" w:fill="F2F4F7"/>
+          </w:tcPr>
+          <w:p>
+            <w:pPr>
+              <w:pStyle w:val="Compact"/>
+              <w:spacing w:before="40" w:after="40"/>
+              <w:jc w:val="left"/>
+            </w:pPr>
+            <w:r>
+              <w:rPr>
+                <w:bCs/>
+                <w:rFonts w:ascii="Arial" w:hAnsi="Arial"/>
+                <w:b/>
+                <w:sz w:val="20"/>
+              </w:rPr>
               <w:t xml:space="preserve">Status</w:t>
             </w:r>
           </w:p>
@@ -366,7 +409,7 @@
                 <w:rFonts w:ascii="Arial" w:hAnsi="Arial"/>
                 <w:sz w:val="20"/>
               </w:rPr>
-              <w:t xml:space="preserve">Waiting on accounting for accounts and revenue recognition</w:t>
+              <w:t xml:space="preserve">Waiting on the license delivery trigger and the portal question</w:t>
             </w:r>
           </w:p>
         </w:tc>
@@ -4081,7 +4124,7 @@
                 <w:rFonts w:ascii="Arial" w:hAnsi="Arial"/>
                 <w:sz w:val="20"/>
               </w:rPr>
-              <w:t xml:space="preserve">[TBC]</w:t>
+              <w:t xml:space="preserve">Blank: no rules set up yet</w:t>
             </w:r>
           </w:p>
         </w:tc>
@@ -4100,7 +4143,7 @@
                 <w:rFonts w:ascii="Arial" w:hAnsi="Arial"/>
                 <w:sz w:val="20"/>
               </w:rPr>
-              <w:t xml:space="preserve">[TBC]</w:t>
+              <w:t xml:space="preserve">Blank</w:t>
             </w:r>
           </w:p>
         </w:tc>
@@ -4119,7 +4162,7 @@
                 <w:rFonts w:ascii="Arial" w:hAnsi="Arial"/>
                 <w:sz w:val="20"/>
               </w:rPr>
-              <w:t xml:space="preserve">[TBC]</w:t>
+              <w:t xml:space="preserve">Blank</w:t>
             </w:r>
           </w:p>
         </w:tc>
@@ -4161,7 +4204,7 @@
                 <w:rFonts w:ascii="Arial" w:hAnsi="Arial"/>
                 <w:sz w:val="20"/>
               </w:rPr>
-              <w:t xml:space="preserve">[TBC]</w:t>
+              <w:t xml:space="preserve">Blank: no rules set up yet</w:t>
             </w:r>
           </w:p>
         </w:tc>
@@ -4180,7 +4223,7 @@
                 <w:rFonts w:ascii="Arial" w:hAnsi="Arial"/>
                 <w:sz w:val="20"/>
               </w:rPr>
-              <w:t xml:space="preserve">[TBC]</w:t>
+              <w:t xml:space="preserve">Blank</w:t>
             </w:r>
           </w:p>
         </w:tc>
@@ -4199,7 +4242,7 @@
                 <w:rFonts w:ascii="Arial" w:hAnsi="Arial"/>
                 <w:sz w:val="20"/>
               </w:rPr>
-              <w:t xml:space="preserve">[TBC]</w:t>
+              <w:t xml:space="preserve">Blank</w:t>
             </w:r>
           </w:p>
         </w:tc>
@@ -4410,7 +4453,7 @@
                 <w:rFonts w:ascii="Arial" w:hAnsi="Arial"/>
                 <w:sz w:val="20"/>
               </w:rPr>
-              <w:t xml:space="preserve">[TBC: list price per item, or blank and priced on each order]</w:t>
+              <w:t xml:space="preserve">Blank: not known</w:t>
             </w:r>
           </w:p>
         </w:tc>
@@ -4453,7 +4496,7 @@
                 <w:rFonts w:ascii="Arial" w:hAnsi="Arial"/>
                 <w:sz w:val="20"/>
               </w:rPr>
-              <w:t xml:space="preserve">[TBC]</w:t>
+              <w:t xml:space="preserve">[TBC: depends on the license delivery trigger]</w:t>
             </w:r>
           </w:p>
         </w:tc>
@@ -4496,7 +4539,7 @@
                 <w:rFonts w:ascii="Arial" w:hAnsi="Arial"/>
                 <w:sz w:val="20"/>
               </w:rPr>
-              <w:t xml:space="preserve">[TBC: usually No when revenue recognition runs in NetSuite]</w:t>
+              <w:t xml:space="preserve">[TBC: No proposed for all 11 items]</w:t>
             </w:r>
           </w:p>
         </w:tc>
@@ -4539,7 +4582,7 @@
                 <w:rFonts w:ascii="Arial" w:hAnsi="Arial"/>
                 <w:sz w:val="20"/>
               </w:rPr>
-              <w:t xml:space="preserve">[TBC: usually No for services and licenses]</w:t>
+              <w:t xml:space="preserve">[TBC: No proposed for support and training; license items depend on the delivery trigger]</w:t>
             </w:r>
           </w:p>
         </w:tc>
@@ -4631,28 +4674,6 @@
       </w:r>
       <w:r>
         <w:t xml:space="preserve">Is it recognized like the live trainings or like a subscription?</w:t>
-      </w:r>
-    </w:p>
-    <w:p>
-      <w:pPr>
-        <w:numPr>
-          <w:ilvl w:val="0"/>
-          <w:numId w:val="1001"/>
-        </w:numPr>
-        <w:pStyle w:val="Compact"/>
-      </w:pPr>
-      <w:r>
-        <w:rPr>
-          <w:bCs/>
-          <w:b/>
-        </w:rPr>
-        <w:t xml:space="preserve">Base Price.</w:t>
-      </w:r>
-      <w:r>
-        <w:t xml:space="preserve"> </w:t>
-      </w:r>
-      <w:r>
-        <w:t xml:space="preserve">Do these items have list prices? How AIStor and MemKV licenses are measured (for example per TiB) is not known or may not be standard; the license descriptions leave the unit out for now.</w:t>
       </w:r>
     </w:p>
     <w:p>
@@ -4797,6 +4818,50 @@
       </w:r>
       <w:r>
         <w:t xml:space="preserve">License keys are issued manually; the issue date (available in BigQuery operating data) should drive invoicing and the revenue start. Options: (a) Can be fulfilled/received = Yes on license items and a fulfillment posted when the key is issued, with revenue plans created on fulfillment; (b) a custom revenue recognition event, created by script or integration; (c) no fulfillment, with the revenue start date set on the order line from the key issue date. Decide before the load: whether Can be fulfilled/received can change after items are used on transactions is unclear.</w:t>
+      </w:r>
+    </w:p>
+    <w:p>
+      <w:pPr>
+        <w:numPr>
+          <w:ilvl w:val="0"/>
+          <w:numId w:val="1001"/>
+        </w:numPr>
+        <w:pStyle w:val="Compact"/>
+      </w:pPr>
+      <w:r>
+        <w:rPr>
+          <w:bCs/>
+          <w:b/>
+        </w:rPr>
+        <w:t xml:space="preserve">Portal sales.</w:t>
+      </w:r>
+      <w:r>
+        <w:t xml:space="preserve"> </w:t>
+      </w:r>
+      <w:r>
+        <w:t xml:space="preserve">Smaller businesses and individuals buy AIStor through a portal, about monthly, and revenue is recognized immediately. These items defer revenue, so portal sales need either a separate portal item with Direct Revenue Posting = Yes and no deferred revenue account, or no item at all if portal sales reach NetSuite as a summary journal entry from the payment processor.</w:t>
+      </w:r>
+    </w:p>
+    <w:p>
+      <w:pPr>
+        <w:numPr>
+          <w:ilvl w:val="0"/>
+          <w:numId w:val="1001"/>
+        </w:numPr>
+        <w:pStyle w:val="Compact"/>
+      </w:pPr>
+      <w:r>
+        <w:rPr>
+          <w:bCs/>
+          <w:b/>
+        </w:rPr>
+        <w:t xml:space="preserve">Revenue recognition rules.</w:t>
+      </w:r>
+      <w:r>
+        <w:t xml:space="preserve"> </w:t>
+      </w:r>
+      <w:r>
+        <w:t xml:space="preserve">None are set up yet, so both rule columns stay blank. NetSuite may require a rule on items that have a deferred revenue account; the sandbox import will show whether the load fails without one. Either way the items need rules before they are used on transactions, added later with an update import keyed on External ID.</w:t>
       </w:r>
     </w:p>
     <w:bookmarkEnd w:id="24"/>

</xml_diff>